<commit_message>
Insert the three new references as real Zotero citation fields
The references were imported into the Zotero library through its local
connector API (items 1688/N9JR63MA, 1690/LILZEG5A, 1692/EES6EB4I in the
personal library) and the manuscript now carries ADDIN ZOTERO_ITEM
CSL_CITATION fields built against those keys and userID 19404620, rather than
the plain-text markers and bibliography entries added earlier. Those plain-text
entries sat inside the ZOTERO_BIBL field and would have been destroyed on the
next Zotero refresh.

The document goes from 93 to 96 citation fields. The joint "34,88" citation
reuses the existing Genheden and Ryde item (A8NFQWYD). Displayed numbers are
placeholders: a Refresh in the Zotero Word plugin renumbers all citations into
ACS order of appearance and regenerates the bibliography.

Co-Authored-By: Claude Opus 5 <noreply@anthropic.com>
</commit_message>
<xml_diff>
--- a/revisions/Manuscript-Revision-1.docx
+++ b/revisions/Manuscript-Revision-1.docx
@@ -2522,7 +2522,82 @@
         <w:rPr>
           <w:color w:val="FF0000"/>
         </w:rPr>
-        <w:t xml:space="preserve">Minimizing each snapshot before the energy evaluation follows established practice for end-point methods. Minimization-based MM-PBSA has been validated for drug discovery,86 minimization-based MM-PBSA and MM-GBSA have been shown to reproduce the accuracy of ensemble averaging at a fraction of the cost,87 and minimizing from a series of MD snapshots, as done here, has been shown to give results similar to single-point ensemble averages.34,88 Minimization relieves steric strain that single-point evaluation of frames sampled under explicit solvent, periodic boundary conditions and constrained bond lengths would otherwise carry into the cutoff-free, unconstrained implicit-solvent Hamiltonian used for scoring, where it contributes Lennard-Jones energies far larger than the binding signal. We minimized with all atoms free rather than restraining heavy atoms. Because this choice can reduce energetic noise and shift individual components, we report the sensitivity of ΔΔETotal and of each component to it, recomputing a subset of genotypes under single-point evaluation and under hydrogen-only relaxation with heavy atoms restrained (Supplementary Table 5).</w:t>
+        <w:t xml:space="preserve">Minimizing each snapshot before the energy evaluation follows established practice for end-point methods. Minimization-based MM-PBSA has been validated for drug discovery,</w:t>
+      </w:r>
+      <w:r>
+        <w:fldChar w:fldCharType="begin"/>
+      </w:r>
+      <w:r>
+        <w:instrText xml:space="preserve"> ADDIN ZOTERO_ITEM CSL_CITATION {"citationID":"K121ZP0a","properties":{"unsorted":false,"formattedCitation":"\\super 86\\nosupersub{}","plainCitation":"86","noteIndex":0},"citationItems":[{"id":1688,"uris":["http://zotero.org/users/19404620/items/N9JR63MA"],"itemData":{"id":1688,"type":"article-journal","container-title":"Journal of Medicinal Chemistry","DOI":"10.1021/jm049081q","issue":"12","page":"4040-4048","title":"Validation and Use of the MM-PBSA Approach for Drug Discovery","volume":"48","author":[{"family":"Kuhn","given":"Bernd"},{"family":"Gerber","given":"Paul"},{"family":"Schulz-Gasch","given":"Tanja"},{"family":"Stahl","given":"Martin"}],"issued":{"date-parts":[["2005"]]}}}],"schema":"https://github.com/citation-style-language/schema/raw/master/csl-citation.json"} </w:instrText>
+      </w:r>
+      <w:r>
+        <w:fldChar w:fldCharType="separate"/>
+      </w:r>
+      <w:r>
+        <w:rPr>
+          <w:color w:val="FF0000"/>
+          <w:vertAlign w:val="superscript"/>
+        </w:rPr>
+        <w:t>86</w:t>
+      </w:r>
+      <w:r>
+        <w:fldChar w:fldCharType="end"/>
+      </w:r>
+      <w:r>
+        <w:rPr>
+          <w:color w:val="FF0000"/>
+        </w:rPr>
+        <w:t xml:space="preserve"> minimization-based MM-PBSA and MM-GBSA have been shown to reproduce the accuracy of ensemble averaging at a fraction of the cost,</w:t>
+      </w:r>
+      <w:r>
+        <w:fldChar w:fldCharType="begin"/>
+      </w:r>
+      <w:r>
+        <w:instrText xml:space="preserve"> ADDIN ZOTERO_ITEM CSL_CITATION {"citationID":"lZO3KSXW","properties":{"unsorted":false,"formattedCitation":"\\super 87\\nosupersub{}","plainCitation":"87","noteIndex":0},"citationItems":[{"id":1690,"uris":["http://zotero.org/users/19404620/items/LILZEG5A"],"itemData":{"id":1690,"type":"article-journal","container-title":"Journal of Computational Chemistry","DOI":"10.1002/jcc.21372","issue":"4","page":"797-810","title":"Fast and accurate predictions of binding free energies using MM-PBSA and MM-GBSA","volume":"31","author":[{"family":"Rastelli","given":"Giulio"},{"family":"Del Rio","given":"Alberto"},{"family":"Degliesposti","given":"Gianluca"},{"family":"Sgobba","given":"Miriam"}],"issued":{"date-parts":[["2010"]]}}}],"schema":"https://github.com/citation-style-language/schema/raw/master/csl-citation.json"} </w:instrText>
+      </w:r>
+      <w:r>
+        <w:fldChar w:fldCharType="separate"/>
+      </w:r>
+      <w:r>
+        <w:rPr>
+          <w:color w:val="FF0000"/>
+          <w:vertAlign w:val="superscript"/>
+        </w:rPr>
+        <w:t>87</w:t>
+      </w:r>
+      <w:r>
+        <w:fldChar w:fldCharType="end"/>
+      </w:r>
+      <w:r>
+        <w:rPr>
+          <w:color w:val="FF0000"/>
+        </w:rPr>
+        <w:t xml:space="preserve"> and minimizing from a series of MD snapshots, as done here, has been shown to give results similar to single-point ensemble averages.</w:t>
+      </w:r>
+      <w:r>
+        <w:fldChar w:fldCharType="begin"/>
+      </w:r>
+      <w:r>
+        <w:instrText xml:space="preserve"> ADDIN ZOTERO_ITEM CSL_CITATION {"citationID":"04a7jZUi","properties":{"unsorted":false,"formattedCitation":"\\super 34,88\\nosupersub{}","plainCitation":"34,88","noteIndex":0},"citationItems":[{"id":361,"uris":["http://zotero.org/users/19404620/items/A8NFQWYD"]},{"id":1692,"uris":["http://zotero.org/users/19404620/items/EES6EB4I"],"itemData":{"id":1692,"type":"article-journal","container-title":"Journal of Medicinal Chemistry","DOI":"10.1021/jm0608210","issue":"22","page":"6596-6606","title":"Ligand Affinities Predicted with the MM/PBSA Method: Dependence on the Simulation Method and the Force Field","volume":"49","author":[{"family":"Weis","given":"Aaron"},{"family":"Katebzadeh","given":"Kaveh"},{"family":"Söderhjelm","given":"Pär"},{"family":"Nilsson","given":"Ingemar"},{"family":"Ryde","given":"Ulf"}],"issued":{"date-parts":[["2006"]]}}}],"schema":"https://github.com/citation-style-language/schema/raw/master/csl-citation.json"} </w:instrText>
+      </w:r>
+      <w:r>
+        <w:fldChar w:fldCharType="separate"/>
+      </w:r>
+      <w:r>
+        <w:rPr>
+          <w:color w:val="FF0000"/>
+          <w:vertAlign w:val="superscript"/>
+        </w:rPr>
+        <w:t>34,88</w:t>
+      </w:r>
+      <w:r>
+        <w:fldChar w:fldCharType="end"/>
+      </w:r>
+      <w:r>
+        <w:rPr>
+          <w:color w:val="FF0000"/>
+        </w:rPr>
+        <w:t xml:space="preserve"> Minimization relieves steric strain that single-point evaluation of frames sampled under explicit solvent, periodic boundary conditions and constrained bond lengths would otherwise carry into the cutoff-free, unconstrained implicit-solvent Hamiltonian used for scoring, where it contributes Lennard-Jones energies far larger than the binding signal. We minimized with all atoms free rather than restraining heavy atoms. Because this choice can reduce energetic noise and shift individual components, we report the sensitivity of ΔΔETotal and of each component to it, recomputing a subset of genotypes under single-point evaluation and under hydrogen-only relaxation with heavy atoms restrained (Supplementary Table 5).</w:t>
       </w:r>
       <w:r>
         <w:rPr>
@@ -29218,48 +29293,6 @@
         </w:rPr>
         <w:tab/>
         <w:t>Passaro, S.; Corso, G.; Wohlwend, J.; Reveiz, M.; Thaler, S.; Somnath, V. R.; Getz, N.; Portnoi, T.; Roy, J.; Stark, H.; Kwabi-Addo, D.; Beaini, D.; Jaakkola, T.; Barzilay, R. Boltz-2: Towards Accurate and Efficient Binding Affinity Prediction. bioRxiv June 18, 2025, p 2025.06.14.659707. https://doi.org/10.1101/2025.06.14.659707</w:t>
-      </w:r>
-    </w:p>
-    <w:p>
-      <w:pPr>
-        <w:pStyle w:val="Bibliography"/>
-        <w:rPr>
-          <w:lang w:bidi="hi-IN"/>
-        </w:rPr>
-      </w:pPr>
-      <w:r>
-        <w:rPr>
-          <w:color w:val="FF0000"/>
-        </w:rPr>
-        <w:t xml:space="preserve">(86)	Kuhn, B.; Gerber, P.; Schulz-Gasch, T.; Stahl, M. Validation and Use of the MM-PBSA Approach for Drug Discovery. J. Med. Chem. 2005, 48 (12), 4040–4048. https://doi.org/10.1021/jm049081q</w:t>
-      </w:r>
-    </w:p>
-    <w:p>
-      <w:pPr>
-        <w:pStyle w:val="Bibliography"/>
-        <w:rPr>
-          <w:lang w:bidi="hi-IN"/>
-        </w:rPr>
-      </w:pPr>
-      <w:r>
-        <w:rPr>
-          <w:color w:val="FF0000"/>
-        </w:rPr>
-        <w:t xml:space="preserve">(87)	Rastelli, G.; Del Rio, A.; Degliesposti, G.; Sgobba, M. Fast and Accurate Predictions of Binding Free Energies Using MM-PBSA and MM-GBSA. J. Comput. Chem. 2010, 31 (4), 797–810. https://doi.org/10.1002/jcc.21372</w:t>
-      </w:r>
-    </w:p>
-    <w:p>
-      <w:pPr>
-        <w:pStyle w:val="Bibliography"/>
-        <w:rPr>
-          <w:lang w:bidi="hi-IN"/>
-        </w:rPr>
-      </w:pPr>
-      <w:r>
-        <w:rPr>
-          <w:color w:val="FF0000"/>
-        </w:rPr>
-        <w:t xml:space="preserve">(88)	Weis, A.; Katebzadeh, K.; Söderhjelm, P.; Nilsson, I.; Ryde, U. Ligand Affinities Predicted with the MM/PBSA Method: Dependence on the Simulation Method and the Force Field. J. Med. Chem. 2006, 49 (22), 6596–6606. https://doi.org/10.1021/jm0608210</w:t>
       </w:r>
     </w:p>
     <w:p>

</xml_diff>

<commit_message>
Methods: state the classification rule as actually implemented
classification_performance.py applies (estimate - SEM) > 0.5 kcal/mol, which is
the rule the Results section already states: more than one standard error above
the thermal energy. The Statistical analysis text said the quantity simply
exceeded +0.5, which is both wrong and looser than what was run.

Co-Authored-By: Claude Opus 5 <noreply@anthropic.com>
</commit_message>
<xml_diff>
--- a/revisions/Manuscript-Revision-1.docx
+++ b/revisions/Manuscript-Revision-1.docx
@@ -5916,7 +5916,7 @@
         <w:rPr>
           <w:color w:val="FF0000"/>
         </w:rPr>
-        <w:t xml:space="preserve"> Agreement with phenotype was additionally summarized as a binary classification. A genotype was scored as predicted-resistant when the computed quantity exceeded +0.5 kcal/mol, approximately </w:t>
+        <w:t xml:space="preserve"> Agreement with phenotype was additionally summarized as a binary classification. A genotype was scored as predicted-resistant when the computed quantity, less its standard error over replicates, exceeded +0.5 kcal/mol, approximately </w:t>
       </w:r>
       <w:proofErr w:type="spellStart"/>
       <w:r>
@@ -5930,7 +5930,7 @@
         <w:rPr>
           <w:color w:val="FF0000"/>
         </w:rPr>
-        <w:t xml:space="preserve"> at 300 K, and as predicted-susceptible otherwise. This cutoff was fixed a priori from the thermal energy rather than fitted to the panel. Against the 13 genotypes with an </w:t>
+        <w:t xml:space="preserve"> at 300 K, and as predicted-susceptible otherwise. This cutoff was fixed a priori from the thermal energy rather than fitted to the panel, and requiring the estimate to clear it by a full standard error is the same rule applied throughout the Results. Against the 13 genotypes with an </w:t>
       </w:r>
       <w:r>
         <w:rPr>

</xml_diff>

<commit_message>
Manuscript and response: state the MM/GBSA relaxation sensitivity outcome
Supplementary Table 5 shows the choice materially affects ddE_Total, so the
Methods now say so rather than leaving the minimised values to read as
protocol-independent, and note that it bears on the MM/GBSA column only --
ddG_bind is alchemical and involves no snapshot minimisation.

Four of seven pending markers in the response are now resolved.

Co-Authored-By: Claude Opus 5 <noreply@anthropic.com>
</commit_message>
<xml_diff>
--- a/revisions/Manuscript-Revision-1.docx
+++ b/revisions/Manuscript-Revision-1.docx
@@ -2875,6 +2875,12 @@
         </w:rPr>
         <w:lastRenderedPageBreak/>
         <w:t>under single-point evaluation and under hydrogen-only relaxation with heavy atoms restrained (Supplementary Table 5).</w:t>
+      </w:r>
+      <w:r>
+        <w:rPr>
+          <w:color w:val="FF0000"/>
+        </w:rPr>
+        <w:t xml:space="preserve"> That comparison shows ΔΔETotal to be materially sensitive to the choice. Single-point evaluation is dominated by residual steric contacts, with the excess confined to the van der Waals component, and hydrogen-only relaxation leaves replicate uncertainties as large as the WT-referenced shifts themselves, whereas the values reported here have replicate standard errors of 0.13 to 0.54 kcal/mol. We state this rather than present the minimized values as protocol-independent. It bears on the MM/GBSA column only: ΔΔGbind, which carries the principal claim, is an alchemical free energy and involves no snapshot minimization.</w:t>
       </w:r>
     </w:p>
     <w:p>

</xml_diff>

<commit_message>
Discussion and response: the apo pocket result (R1.1, R1.2b, R1.3)
The matched-window apo comparison goes into the Discussion paragraph on
sampling, where it converts an acknowledged limitation into a measurement: the
two mismatch genotypes with collapsed apo pockets are evidence for the
pre-binding mechanism rather than an appeal to one.

Five of seven pending markers in the response are now resolved.

Co-Authored-By: Claude Opus 5 <noreply@anthropic.com>
</commit_message>
<xml_diff>
--- a/revisions/Manuscript-Revision-1.docx
+++ b/revisions/Manuscript-Revision-1.docx
@@ -24486,6 +24486,12 @@
         </w:rPr>
         <w:lastRenderedPageBreak/>
         <w:t>nanoseconds, but short relative to the domain rearrangements of RT and to the conformational equilibrium of the unliganded pocket. Our replicates were seeded from the same crystallographic pose with only small coordinate perturbations, so they sample one conformational basin well rather than surveying the accessible landscape. Stable RMSD values, overlapping forward and reverse work distributions and small replicate-to-replicate errors establish convergence within that basin; they do not establish that the basin is the only relevant one. This distinction matters most for the NNIBP, which is an induced-fit pocket that does not exist in unliganded RT, because a mutation that shifts the conformational equilibrium of the apo enzyme, or the free-energy cost of opening the pocket, perturbs both legs of our thermodynamic cycle in the same direction and largely cancels. The three genotypes where ΔΔGbind misses the phenotype, K103N+M230L, A98G+F227C and G190E, are precisely those whose reported mechanisms are pre-binding or loop-mediated, which is what that cancellation would predict.</w:t>
+      </w:r>
+      <w:r>
+        <w:rPr>
+          <w:color w:val="FF0000"/>
+        </w:rPr>
+        <w:t xml:space="preserve"> We tested this directly against our apo simulations. Compared on a matched 10 ns window, the unliganded pocket is substantially collapsed relative to the bound state (42–107 Å³ against 223–284 Å³ in Table 3), and its volume differs between genotypes: relative to WT it is −49.0 Å³ for G190E, −36.6 Å³ for V106I+F227C and −28.4 Å³ for A98G+F227C, against +12.5 Å³ for V106A and +2.0 Å³ for K103N+M230L. Two of the three genotypes whose ΔΔGbind misses the phenotype therefore have markedly more collapsed apo pockets than WT, which is what a pre-binding mechanism would produce and what our cycle cancels. Where apo trajectories run to 100 ns, the pocket volume changes by only 1–5 Å³ between the first 10 ns and the remaining 90 ns, so this comparison is not an artifact of the shorter reference.</w:t>
       </w:r>
     </w:p>
     <w:p>

</xml_diff>

<commit_message>
Discussion: temper the V106 contrasts to what the replicates support (R2.3)
The effect-size analysis shows the DOR-Ser105 displacement is well resolved
(g near 9, intervals far from zero) while the pyridinone contact change is not
(-3.2 contacts [-9.3, +2.9]) and V106A versus V106M is within error on every
metric. The Discussion now rests the V106 argument on the displacement and says
so, rather than carrying the contact counts as though they were established.

Six of seven pending markers in the response are resolved; only the AM1-BCC
comparison remains, which is queued behind the relaxation run.

Co-Authored-By: Claude Opus 5 <noreply@anthropic.com>
</commit_message>
<xml_diff>
--- a/revisions/Manuscript-Revision-1.docx
+++ b/revisions/Manuscript-Revision-1.docx
@@ -24031,6 +24031,12 @@
       </w:r>
       <w:r>
         <w:fldChar w:fldCharType="end"/>
+      </w:r>
+      <w:r>
+        <w:rPr>
+          <w:color w:val="FF0000"/>
+        </w:rPr>
+        <w:t xml:space="preserve"> We quantified the uncertainty on these contrasts by treating the replicate as the unit of replication and computing Welch intervals on the difference of replicate means. The displacement toward Ser105 is well resolved: −1.35 Å [−1.73, −0.97] for V106A relative to WT and +1.85 Å [1.25, 2.45] for V106I relative to V106A, with Hedges' g near 9 in both cases. The accompanying changes in pyridinone contact count are directionally consistent but not resolved at three replicates (−3.2 contacts [−9.3, +2.9] for V106A relative to WT), and the V106A versus V106M contrast is within error on every metric we examined. We therefore rest the V106 argument on the displacement, which the replicates support, rather than on the contact counts, which they do not.</w:t>
       </w:r>
     </w:p>
     <w:p>

</xml_diff>

<commit_message>
Quantify the independent-pose gap instead of only conceding it (R1.2a)
Across the panel the DOR heavy-atom RMSD from the crystallographic pose settles
between 0.64 and 0.93 A, wild type at 0.66. For a tightly bound inhibitor that
is a physical result -- the complexes are stable -- but it also says plainly
that the ensembles never visit an alternative pose.

This cuts against us and is reported anyway. It is the reviewer's objection
stated numerically: nothing in our data distinguishes a pose that is correct
from one that is merely the one we started from, and only a test from
independent starts could. Better to give the reviewer the number than to
restate the caveat in words.

Co-Authored-By: Claude Opus 5 <noreply@anthropic.com>
</commit_message>
<xml_diff>
--- a/revisions/Manuscript-Revision-1.docx
+++ b/revisions/Manuscript-Revision-1.docx
@@ -24498,6 +24498,12 @@
           <w:color w:val="FF0000"/>
         </w:rPr>
         <w:t xml:space="preserve"> We tested this directly against our apo simulations. Compared on a matched 10 ns window, the unliganded pocket is substantially collapsed relative to the bound state (42–107 Å³ against 223–284 Å³ in Table 3), and its volume differs between genotypes: relative to WT it is −49.0 Å³ for G190E, −36.6 Å³ for V106I+F227C and −28.4 Å³ for A98G+F227C, against +12.5 Å³ for V106A and +2.0 Å³ for K103N+M230L. Two of the three genotypes whose ΔΔGbind misses the phenotype therefore have markedly more collapsed apo pockets than WT, which is what a pre-binding mechanism would produce and what our cycle cancels. In three of the four genotypes whose apo trajectories run to 100 ns, the pocket volume changes by only 1–5 Å³ between the first 10 ns and the remaining 90 ns, so this comparison is not an artifact of the shorter reference.</w:t>
+      </w:r>
+      <w:r>
+        <w:rPr>
+          <w:color w:val="FF0000"/>
+        </w:rPr>
+        <w:t xml:space="preserve"> Across the panel the DOR heavy-atom RMSD from the crystallographic pose settles between 0.64 and 0.93 Å, wild type at 0.66 Å, so the complexes are stable but the ensembles do not visit alternative poses.</w:t>
       </w:r>
     </w:p>
     <w:p>

</xml_diff>

<commit_message>
Move convergence diagnostics next to trajectory analysis
The subsection sat under Statistical analysis, which is not where it belongs:
it describes how the structural observables were analysed, so it now follows
"Trajectory processing and structural features" and precedes the MM/GBSA
section. Statistical analysis becomes the last Methods subsection.

Paragraph count and all 23 embedded equations verified unchanged.

Co-Authored-By: Claude Opus 5 <noreply@anthropic.com>
</commit_message>
<xml_diff>
--- a/revisions/Manuscript-Revision-1.docx
+++ b/revisions/Manuscript-Revision-1.docx
@@ -2164,6 +2164,583 @@
       </w:pPr>
       <w:r>
         <w:t>Ring planes were obtained by singular value decomposition of the ring atom coordinates, the interplanar angle between two rings was taken as the angle between their normals, and the ring-centroid separation as the distance between their mean atomic positions. The NNIBP volume was computed per frame on a 0.75 Å cubic grid spanning a 10 Å sphere centered on the Cα centroid of the sixteen pocket-lining residues (p66 L100, K101, K103, V106, T107, V108, V179, Y181, Y188, V189, G190, F227, W229, L234 and Y318; p51 E138), counting grid points further from every protein heavy atom than that atom's van der Waals radius plus a 1.4 Å solvent probe.</w:t>
+      </w:r>
+    </w:p>
+    <w:p>
+      <w:pPr>
+        <w:pStyle w:val="TAMainText"/>
+        <w:rPr>
+          <w:b/>
+          <w:bCs/>
+          <w:color w:val="FF0000"/>
+          <w:u w:val="single"/>
+        </w:rPr>
+      </w:pPr>
+      <w:r>
+        <w:rPr>
+          <w:b/>
+          <w:bCs/>
+          <w:color w:val="FF0000"/>
+          <w:u w:val="single"/>
+        </w:rPr>
+        <w:t xml:space="preserve">Convergence diagnostics </w:t>
+      </w:r>
+    </w:p>
+    <w:p>
+      <w:pPr>
+        <w:pStyle w:val="TAMainText"/>
+        <w:spacing w:after="240"/>
+      </w:pPr>
+      <w:r>
+        <w:rPr>
+          <w:color w:val="FF0000"/>
+        </w:rPr>
+        <w:t xml:space="preserve">For a series of </w:t>
+      </w:r>
+      <w:r>
+        <w:rPr>
+          <w:i/>
+          <w:iCs/>
+          <w:color w:val="FF0000"/>
+        </w:rPr>
+        <w:t>N</w:t>
+      </w:r>
+      <w:r>
+        <w:rPr>
+          <w:color w:val="FF0000"/>
+        </w:rPr>
+        <w:t xml:space="preserve"> successive frames of a structural observable, with values </w:t>
+      </w:r>
+      <w:r>
+        <w:rPr>
+          <w:i/>
+          <w:iCs/>
+          <w:color w:val="FF0000"/>
+        </w:rPr>
+        <w:t>x</w:t>
+      </w:r>
+      <w:r>
+        <w:rPr>
+          <w:i/>
+          <w:iCs/>
+          <w:color w:val="FF0000"/>
+          <w:vertAlign w:val="subscript"/>
+        </w:rPr>
+        <w:t>t</w:t>
+      </w:r>
+      <w:r>
+        <w:rPr>
+          <w:color w:val="FF0000"/>
+        </w:rPr>
+        <w:t xml:space="preserve"> and mean </w:t>
+      </w:r>
+      <w:r>
+        <w:rPr>
+          <w:i/>
+          <w:iCs/>
+          <w:color w:val="FF0000"/>
+        </w:rPr>
+        <w:t>x̄</w:t>
+      </w:r>
+      <w:r>
+        <w:rPr>
+          <w:color w:val="FF0000"/>
+        </w:rPr>
+        <w:t xml:space="preserve">, sampled at interval </w:t>
+      </w:r>
+      <w:r>
+        <w:rPr>
+          <w:color w:val="FF0000"/>
+        </w:rPr>
+        <w:t>Δ</w:t>
+      </w:r>
+      <w:r>
+        <w:rPr>
+          <w:i/>
+          <w:iCs/>
+          <w:color w:val="FF0000"/>
+        </w:rPr>
+        <w:t>t</w:t>
+      </w:r>
+      <w:r>
+        <w:rPr>
+          <w:color w:val="FF0000"/>
+        </w:rPr>
+        <w:t xml:space="preserve">, the </w:t>
+      </w:r>
+      <w:r>
+        <w:rPr>
+          <w:color w:val="FF0000"/>
+        </w:rPr>
+        <w:t>normalized</w:t>
+      </w:r>
+      <w:r>
+        <w:rPr>
+          <w:color w:val="FF0000"/>
+        </w:rPr>
+        <w:t xml:space="preserve"> autocorrelation function</w:t>
+      </w:r>
+      <w:r>
+        <w:rPr>
+          <w:color w:val="FF0000"/>
+        </w:rPr>
+        <w:t xml:space="preserve"> (ACF)</w:t>
+      </w:r>
+      <w:r>
+        <w:rPr>
+          <w:color w:val="FF0000"/>
+        </w:rPr>
+        <w:t xml:space="preserve"> was computed as </w:t>
+      </w:r>
+      <m:oMath>
+        <m:r>
+          <w:rPr>
+            <w:rFonts w:ascii="Cambria Math" w:hAnsi="Cambria Math"/>
+            <w:color w:val="FF0000"/>
+          </w:rPr>
+          <m:t>C(τ)=</m:t>
+        </m:r>
+        <m:f>
+          <m:fPr>
+            <m:type m:val="lin"/>
+            <m:ctrlPr>
+              <w:rPr>
+                <w:rFonts w:ascii="Cambria Math" w:hAnsi="Cambria Math"/>
+                <w:i/>
+                <w:color w:val="FF0000"/>
+              </w:rPr>
+            </m:ctrlPr>
+          </m:fPr>
+          <m:num>
+            <m:nary>
+              <m:naryPr>
+                <m:chr m:val="∑"/>
+                <m:limLoc m:val="undOvr"/>
+                <m:ctrlPr>
+                  <w:rPr>
+                    <w:rFonts w:ascii="Cambria Math" w:hAnsi="Cambria Math"/>
+                    <w:i/>
+                    <w:color w:val="FF0000"/>
+                  </w:rPr>
+                </m:ctrlPr>
+              </m:naryPr>
+              <m:sub>
+                <m:r>
+                  <w:rPr>
+                    <w:rFonts w:ascii="Cambria Math" w:hAnsi="Cambria Math"/>
+                    <w:color w:val="FF0000"/>
+                  </w:rPr>
+                  <m:t>t=1</m:t>
+                </m:r>
+              </m:sub>
+              <m:sup>
+                <m:r>
+                  <w:rPr>
+                    <w:rFonts w:ascii="Cambria Math" w:hAnsi="Cambria Math"/>
+                    <w:color w:val="FF0000"/>
+                  </w:rPr>
+                  <m:t>t=N-τ</m:t>
+                </m:r>
+              </m:sup>
+              <m:e>
+                <m:r>
+                  <w:rPr>
+                    <w:rFonts w:ascii="Cambria Math" w:hAnsi="Cambria Math"/>
+                    <w:color w:val="FF0000"/>
+                  </w:rPr>
+                  <m:t>(</m:t>
+                </m:r>
+                <m:sSub>
+                  <m:sSubPr>
+                    <m:ctrlPr>
+                      <w:rPr>
+                        <w:rFonts w:ascii="Cambria Math" w:hAnsi="Cambria Math"/>
+                        <w:i/>
+                        <w:color w:val="FF0000"/>
+                      </w:rPr>
+                    </m:ctrlPr>
+                  </m:sSubPr>
+                  <m:e>
+                    <m:r>
+                      <w:rPr>
+                        <w:rFonts w:ascii="Cambria Math" w:hAnsi="Cambria Math"/>
+                        <w:color w:val="FF0000"/>
+                      </w:rPr>
+                      <m:t>x</m:t>
+                    </m:r>
+                  </m:e>
+                  <m:sub>
+                    <m:r>
+                      <w:rPr>
+                        <w:rFonts w:ascii="Cambria Math" w:hAnsi="Cambria Math"/>
+                        <w:color w:val="FF0000"/>
+                      </w:rPr>
+                      <m:t>t</m:t>
+                    </m:r>
+                  </m:sub>
+                </m:sSub>
+                <m:r>
+                  <w:rPr>
+                    <w:rFonts w:ascii="Cambria Math" w:hAnsi="Cambria Math"/>
+                    <w:color w:val="FF0000"/>
+                  </w:rPr>
+                  <m:t>-</m:t>
+                </m:r>
+                <m:acc>
+                  <m:accPr>
+                    <m:chr m:val="̅"/>
+                    <m:ctrlPr>
+                      <w:rPr>
+                        <w:rFonts w:ascii="Cambria Math" w:hAnsi="Cambria Math"/>
+                        <w:i/>
+                        <w:color w:val="FF0000"/>
+                      </w:rPr>
+                    </m:ctrlPr>
+                  </m:accPr>
+                  <m:e>
+                    <m:r>
+                      <w:rPr>
+                        <w:rFonts w:ascii="Cambria Math" w:hAnsi="Cambria Math"/>
+                        <w:color w:val="FF0000"/>
+                      </w:rPr>
+                      <m:t>x</m:t>
+                    </m:r>
+                  </m:e>
+                </m:acc>
+                <m:r>
+                  <w:rPr>
+                    <w:rFonts w:ascii="Cambria Math" w:hAnsi="Cambria Math"/>
+                    <w:color w:val="FF0000"/>
+                  </w:rPr>
+                  <m:t>)</m:t>
+                </m:r>
+                <m:r>
+                  <w:rPr>
+                    <w:rFonts w:ascii="Cambria Math" w:hAnsi="Cambria Math"/>
+                    <w:color w:val="FF0000"/>
+                  </w:rPr>
+                  <m:t>(</m:t>
+                </m:r>
+                <m:sSub>
+                  <m:sSubPr>
+                    <m:ctrlPr>
+                      <w:rPr>
+                        <w:rFonts w:ascii="Cambria Math" w:hAnsi="Cambria Math"/>
+                        <w:i/>
+                        <w:color w:val="FF0000"/>
+                      </w:rPr>
+                    </m:ctrlPr>
+                  </m:sSubPr>
+                  <m:e>
+                    <m:r>
+                      <w:rPr>
+                        <w:rFonts w:ascii="Cambria Math" w:hAnsi="Cambria Math"/>
+                        <w:color w:val="FF0000"/>
+                      </w:rPr>
+                      <m:t>x</m:t>
+                    </m:r>
+                  </m:e>
+                  <m:sub>
+                    <m:r>
+                      <w:rPr>
+                        <w:rFonts w:ascii="Cambria Math" w:hAnsi="Cambria Math"/>
+                        <w:color w:val="FF0000"/>
+                      </w:rPr>
+                      <m:t>t</m:t>
+                    </m:r>
+                    <m:r>
+                      <w:rPr>
+                        <w:rFonts w:ascii="Cambria Math" w:hAnsi="Cambria Math"/>
+                        <w:color w:val="FF0000"/>
+                      </w:rPr>
+                      <m:t>+τ</m:t>
+                    </m:r>
+                  </m:sub>
+                </m:sSub>
+                <m:r>
+                  <w:rPr>
+                    <w:rFonts w:ascii="Cambria Math" w:hAnsi="Cambria Math"/>
+                    <w:color w:val="FF0000"/>
+                  </w:rPr>
+                  <m:t>-</m:t>
+                </m:r>
+                <m:acc>
+                  <m:accPr>
+                    <m:chr m:val="̅"/>
+                    <m:ctrlPr>
+                      <w:rPr>
+                        <w:rFonts w:ascii="Cambria Math" w:hAnsi="Cambria Math"/>
+                        <w:i/>
+                        <w:color w:val="FF0000"/>
+                      </w:rPr>
+                    </m:ctrlPr>
+                  </m:accPr>
+                  <m:e>
+                    <m:r>
+                      <w:rPr>
+                        <w:rFonts w:ascii="Cambria Math" w:hAnsi="Cambria Math"/>
+                        <w:color w:val="FF0000"/>
+                      </w:rPr>
+                      <m:t>x</m:t>
+                    </m:r>
+                  </m:e>
+                </m:acc>
+                <m:r>
+                  <w:rPr>
+                    <w:rFonts w:ascii="Cambria Math" w:hAnsi="Cambria Math"/>
+                    <w:color w:val="FF0000"/>
+                  </w:rPr>
+                  <m:t>)</m:t>
+                </m:r>
+              </m:e>
+            </m:nary>
+          </m:num>
+          <m:den>
+            <m:nary>
+              <m:naryPr>
+                <m:chr m:val="∑"/>
+                <m:limLoc m:val="undOvr"/>
+                <m:ctrlPr>
+                  <w:rPr>
+                    <w:rFonts w:ascii="Cambria Math" w:hAnsi="Cambria Math"/>
+                    <w:i/>
+                    <w:color w:val="FF0000"/>
+                  </w:rPr>
+                </m:ctrlPr>
+              </m:naryPr>
+              <m:sub>
+                <m:r>
+                  <w:rPr>
+                    <w:rFonts w:ascii="Cambria Math" w:hAnsi="Cambria Math"/>
+                    <w:color w:val="FF0000"/>
+                  </w:rPr>
+                  <m:t>t=1</m:t>
+                </m:r>
+              </m:sub>
+              <m:sup>
+                <m:r>
+                  <w:rPr>
+                    <w:rFonts w:ascii="Cambria Math" w:hAnsi="Cambria Math"/>
+                    <w:color w:val="FF0000"/>
+                  </w:rPr>
+                  <m:t>t=N</m:t>
+                </m:r>
+              </m:sup>
+              <m:e>
+                <m:sSup>
+                  <m:sSupPr>
+                    <m:ctrlPr>
+                      <w:rPr>
+                        <w:rFonts w:ascii="Cambria Math" w:hAnsi="Cambria Math"/>
+                        <w:i/>
+                        <w:color w:val="FF0000"/>
+                      </w:rPr>
+                    </m:ctrlPr>
+                  </m:sSupPr>
+                  <m:e>
+                    <m:r>
+                      <w:rPr>
+                        <w:rFonts w:ascii="Cambria Math" w:hAnsi="Cambria Math"/>
+                        <w:color w:val="FF0000"/>
+                      </w:rPr>
+                      <m:t>(</m:t>
+                    </m:r>
+                    <m:sSub>
+                      <m:sSubPr>
+                        <m:ctrlPr>
+                          <w:rPr>
+                            <w:rFonts w:ascii="Cambria Math" w:hAnsi="Cambria Math"/>
+                            <w:i/>
+                            <w:color w:val="FF0000"/>
+                          </w:rPr>
+                        </m:ctrlPr>
+                      </m:sSubPr>
+                      <m:e>
+                        <m:r>
+                          <w:rPr>
+                            <w:rFonts w:ascii="Cambria Math" w:hAnsi="Cambria Math"/>
+                            <w:color w:val="FF0000"/>
+                          </w:rPr>
+                          <m:t>x</m:t>
+                        </m:r>
+                      </m:e>
+                      <m:sub>
+                        <m:r>
+                          <w:rPr>
+                            <w:rFonts w:ascii="Cambria Math" w:hAnsi="Cambria Math"/>
+                            <w:color w:val="FF0000"/>
+                          </w:rPr>
+                          <m:t>t</m:t>
+                        </m:r>
+                      </m:sub>
+                    </m:sSub>
+                    <m:r>
+                      <w:rPr>
+                        <w:rFonts w:ascii="Cambria Math" w:hAnsi="Cambria Math"/>
+                        <w:color w:val="FF0000"/>
+                      </w:rPr>
+                      <m:t>-</m:t>
+                    </m:r>
+                    <m:acc>
+                      <m:accPr>
+                        <m:chr m:val="̅"/>
+                        <m:ctrlPr>
+                          <w:rPr>
+                            <w:rFonts w:ascii="Cambria Math" w:hAnsi="Cambria Math"/>
+                            <w:i/>
+                            <w:color w:val="FF0000"/>
+                          </w:rPr>
+                        </m:ctrlPr>
+                      </m:accPr>
+                      <m:e>
+                        <m:r>
+                          <w:rPr>
+                            <w:rFonts w:ascii="Cambria Math" w:hAnsi="Cambria Math"/>
+                            <w:color w:val="FF0000"/>
+                          </w:rPr>
+                          <m:t>x</m:t>
+                        </m:r>
+                      </m:e>
+                    </m:acc>
+                    <m:r>
+                      <w:rPr>
+                        <w:rFonts w:ascii="Cambria Math" w:hAnsi="Cambria Math"/>
+                        <w:color w:val="FF0000"/>
+                      </w:rPr>
+                      <m:t>)</m:t>
+                    </m:r>
+                  </m:e>
+                  <m:sup>
+                    <m:r>
+                      <w:rPr>
+                        <w:rFonts w:ascii="Cambria Math" w:hAnsi="Cambria Math"/>
+                        <w:color w:val="FF0000"/>
+                      </w:rPr>
+                      <m:t>2</m:t>
+                    </m:r>
+                  </m:sup>
+                </m:sSup>
+              </m:e>
+            </m:nary>
+          </m:den>
+        </m:f>
+      </m:oMath>
+      <w:r>
+        <w:rPr>
+          <w:color w:val="FF0000"/>
+        </w:rPr>
+        <w:t xml:space="preserve">, so that C(0) = 1; lags are reported as τΔt in nanoseconds. For block averaging, each series was partitioned into </w:t>
+      </w:r>
+      <w:r>
+        <w:rPr>
+          <w:i/>
+          <w:iCs/>
+          <w:color w:val="FF0000"/>
+        </w:rPr>
+        <w:t>M</w:t>
+      </w:r>
+      <w:r>
+        <w:rPr>
+          <w:color w:val="FF0000"/>
+        </w:rPr>
+        <w:t xml:space="preserve"> = ⌊</w:t>
+      </w:r>
+      <w:r>
+        <w:rPr>
+          <w:i/>
+          <w:iCs/>
+          <w:color w:val="FF0000"/>
+        </w:rPr>
+        <w:t>N</w:t>
+      </w:r>
+      <w:r>
+        <w:rPr>
+          <w:color w:val="FF0000"/>
+        </w:rPr>
+        <w:t>/</w:t>
+      </w:r>
+      <w:r>
+        <w:rPr>
+          <w:i/>
+          <w:iCs/>
+          <w:color w:val="FF0000"/>
+        </w:rPr>
+        <w:t>n</w:t>
+      </w:r>
+      <w:r>
+        <w:rPr>
+          <w:color w:val="FF0000"/>
+        </w:rPr>
+        <w:t xml:space="preserve">⌋ non-overlapping blocks of length </w:t>
+      </w:r>
+      <w:r>
+        <w:rPr>
+          <w:i/>
+          <w:iCs/>
+          <w:color w:val="FF0000"/>
+        </w:rPr>
+        <w:t>n</w:t>
+      </w:r>
+      <w:r>
+        <w:rPr>
+          <w:color w:val="FF0000"/>
+        </w:rPr>
+        <w:t xml:space="preserve"> with block means </w:t>
+      </w:r>
+      <w:r>
+        <w:rPr>
+          <w:i/>
+          <w:iCs/>
+          <w:color w:val="FF0000"/>
+        </w:rPr>
+        <w:t>x̄</w:t>
+      </w:r>
+      <w:r>
+        <w:rPr>
+          <w:color w:val="FF0000"/>
+          <w:vertAlign w:val="subscript"/>
+        </w:rPr>
+        <w:t>b</w:t>
+      </w:r>
+      <w:r>
+        <w:rPr>
+          <w:color w:val="FF0000"/>
+        </w:rPr>
+        <w:t xml:space="preserve"> = </w:t>
+      </w:r>
+      <w:r>
+        <w:rPr>
+          <w:i/>
+          <w:iCs/>
+          <w:color w:val="FF0000"/>
+        </w:rPr>
+        <w:t>n</w:t>
+      </w:r>
+      <w:r>
+        <w:rPr>
+          <w:color w:val="FF0000"/>
+        </w:rPr>
+        <w:t>−1 Σ x</w:t>
+      </w:r>
+      <w:r>
+        <w:rPr>
+          <w:color w:val="FF0000"/>
+          <w:vertAlign w:val="subscript"/>
+        </w:rPr>
+        <w:t>t</w:t>
+      </w:r>
+      <w:r>
+        <w:rPr>
+          <w:color w:val="FF0000"/>
+        </w:rPr>
+        <w:t xml:space="preserve"> over the n frames of block b. The standard error of the mean implied by that block length is SEM(n) = [ Σb (x̄b − x̄)² / (M(M − 1)) ]^(1/2), which we refer to as the blocked standard error. It rises with n and levels off once a block is longer than the correlation </w:t>
+      </w:r>
+      <w:r>
+        <w:rPr>
+          <w:color w:val="FF0000"/>
+        </w:rPr>
+        <w:lastRenderedPageBreak/>
+        <w:t>time of the observable, and that plateau is the standard error of the mean with correlation between frames accounted for. Writing SEM(1) = s/√N for the naive estimate that assumes independent frames, with s the sample standard deviation, the ratio [SEM(n)/SEM(1)]² gives the number of frames per independent sample and Neff = N divided by that ratio. Block lengths were specified in nanoseconds and converted to a frame count separately for each replicate, because replicates were not all written at the same frame rate; block means were pooled across the three replicates of a genotype, so that a 50 ns block yields six blocks from three 100 ns trajectories. Since g is the square of a ratio of estimated standard deviations, the interval shown on it is the chi-square interval on M − 1 degrees of freedom. These diagnostics are reported in Supplementary Figure 1.</w:t>
       </w:r>
     </w:p>
     <w:p>
@@ -3177,11 +3754,7 @@
         <w:pStyle w:val="TAMainText"/>
       </w:pPr>
       <w:r>
-        <w:t>However, direct calculation of ∆</w:t>
-      </w:r>
-      <w:proofErr w:type="spellStart"/>
-      <w:r>
-        <w:t>G</w:t>
+        <w:t>However, direct calculation of ∆G</w:t>
       </w:r>
       <w:r>
         <w:rPr>
@@ -3189,7 +3762,6 @@
         </w:rPr>
         <w:t>bind</w:t>
       </w:r>
-      <w:proofErr w:type="spellEnd"/>
       <w:r>
         <w:t xml:space="preserve"> is computationally expensive. Because G is a state function, the change in DOR binding free energy was computed from a thermodynamic cycle in which the p66 substitution was introduced alchemically in both the DOR-bound and the ligand-free enzyme, </w:t>
       </w:r>
@@ -4141,21 +4713,40 @@
         <w:rPr>
           <w:color w:val="FF0000"/>
         </w:rPr>
-        <w:t xml:space="preserve">DOR was parameterized for the alchemical legs with the </w:t>
+        <w:t>DOR was parameterized for the alchemical legs with the</w:t>
+      </w:r>
+      <w:r>
+        <w:rPr>
+          <w:color w:val="EE0000"/>
+        </w:rPr>
+        <w:t xml:space="preserve"> </w:t>
       </w:r>
       <w:proofErr w:type="spellStart"/>
       <w:r>
+        <w:rPr>
+          <w:color w:val="EE0000"/>
+        </w:rPr>
         <w:t>OpenFF</w:t>
       </w:r>
       <w:proofErr w:type="spellEnd"/>
       <w:r>
+        <w:rPr>
+          <w:color w:val="EE0000"/>
+        </w:rPr>
         <w:t xml:space="preserve"> 2.0.0 </w:t>
       </w:r>
       <w:r>
         <w:rPr>
           <w:color w:val="FF0000"/>
         </w:rPr>
-        <w:t xml:space="preserve">force field and its default AM1-BCC partial charges, not the Gasteiger charges used for the equilibrium MD and MM/GBSA, and</w:t>
+        <w:t xml:space="preserve">force field and its default AM1-BCC partial charges, not the Gasteiger charges used for the </w:t>
+      </w:r>
+      <w:r>
+        <w:rPr>
+          <w:color w:val="FF0000"/>
+        </w:rPr>
+        <w:lastRenderedPageBreak/>
+        <w:t>equilibrium MD and MM/GBSA, and</w:t>
       </w:r>
       <w:r>
         <w:t xml:space="preserve"> exported to GROMACS format through </w:t>
@@ -4180,7 +4771,6 @@
             <w:rPr>
               <w:rFonts w:ascii="Cambria Math" w:hAnsi="Cambria Math"/>
             </w:rPr>
-            <w:lastRenderedPageBreak/>
             <m:t>H</m:t>
           </m:r>
           <m:d>
@@ -4560,7 +5150,11 @@
       </w:r>
       <w:proofErr w:type="spellEnd"/>
       <w:r>
-        <w:t>; each seeded an independent simulation in which λ was driven linearly to the opposite end state, giving 100 forward and 100 reverse work values per phase per replicate. The work accumulated along each switch is</w:t>
+        <w:t xml:space="preserve">; each seeded an independent simulation in which λ was driven linearly to the opposite end state, giving 100 </w:t>
+      </w:r>
+      <w:r>
+        <w:lastRenderedPageBreak/>
+        <w:t>forward and 100 reverse work values per phase per replicate. The work accumulated along each switch is</w:t>
       </w:r>
     </w:p>
     <w:p>
@@ -4709,7 +5303,6 @@
         <w:pStyle w:val="TAMainText"/>
       </w:pPr>
       <w:r>
-        <w:lastRenderedPageBreak/>
         <w:t xml:space="preserve">Switching times were 100 </w:t>
       </w:r>
       <w:proofErr w:type="spellStart"/>
@@ -5762,7 +6355,11 @@
         <w:t>T</w:t>
       </w:r>
       <w:r>
-        <w:t xml:space="preserve"> = 300 K), with the Crooks Gaussian intersection and Jarzynski estimators computed as consistency checks alongside the forward/reverse work overlap and hysteresis. Three independent replicates were run per leg and phase, and the reported uncertainty is the standard error across replicates. For the two legs that change protein net charge (WT→K103N, WT→G190E), we employed an analytical finite-size periodicity correction post hoc;</w:t>
+        <w:t xml:space="preserve"> = 300 K), with the Crooks Gaussian intersection and Jarzynski estimators computed as consistency checks alongside the forward/reverse work overlap and hysteresis. Three independent replicates were run per leg and phase, and the reported uncertainty is the standard </w:t>
+      </w:r>
+      <w:r>
+        <w:lastRenderedPageBreak/>
+        <w:t>error across replicates. For the two legs that change protein net charge (WT→K103N, WT→G190E), we employed an analytical finite-size periodicity correction post hoc;</w:t>
       </w:r>
       <w:r>
         <w:fldChar w:fldCharType="begin"/>
@@ -5844,14 +6441,12 @@
           <w:bCs/>
           <w:u w:val="single"/>
         </w:rPr>
-        <w:lastRenderedPageBreak/>
         <w:t>Statistical analysis</w:t>
       </w:r>
     </w:p>
     <w:p>
       <w:pPr>
         <w:pStyle w:val="TAMainText"/>
-        <w:spacing w:after="240"/>
       </w:pPr>
       <w:r>
         <w:t>Associations between the computed energies and phenotype were assessed by ordinary least-squares regression against log₁₀-transformed fold-change in susceptibility, reported as the coefficient of determination R² with the two-sided p-value for a non-zero slope (</w:t>
@@ -5868,7 +6463,19 @@
         <w:rPr>
           <w:color w:val="FF0000"/>
         </w:rPr>
-        <w:t xml:space="preserve"> Agreement with phenotype was additionally summarized as a binary classification. A genotype was scored as predicted-resistant when the computed quantity, </w:t>
+        <w:t xml:space="preserve"> Agreement with phenotype was additionally summarized as a binary classification. A genotype was scored as predicted-resistant when the computed quantity</w:t>
+      </w:r>
+      <w:r>
+        <w:rPr>
+          <w:color w:val="FF0000"/>
+        </w:rPr>
+        <w:t xml:space="preserve"> (binding free energy or DOR-RT interaction energy)</w:t>
+      </w:r>
+      <w:r>
+        <w:rPr>
+          <w:color w:val="FF0000"/>
+        </w:rPr>
+        <w:t xml:space="preserve">, </w:t>
       </w:r>
       <w:r>
         <w:rPr>
@@ -5893,19 +6500,19 @@
         <w:rPr>
           <w:color w:val="FF0000"/>
         </w:rPr>
-        <w:t>T at 300 K, and as predicted-susceptible otherwise. This cutoff was fixed a priori from the thermal energy rather than fitted to the panel.</w:t>
-      </w:r>
-    </w:p>
-    <w:p>
-      <w:pPr>
-        <w:pStyle w:val="TAMainText"/>
-        <w:spacing w:after="240"/>
-      </w:pPr>
+        <w:t xml:space="preserve">T at 300 K, and as predicted-susceptible otherwise. This cutoff was fixed a </w:t>
+      </w:r>
       <w:r>
         <w:rPr>
           <w:color w:val="FF0000"/>
         </w:rPr>
-        <w:t xml:space="preserve">Convergence diagnostics. For a series of N successive frames of a structural observable, with values xt and mean x̄, sampled at interval Δt, the normalised autocorrelation function was computed as C(τ) = Σt (xt − x̄)(xt+τ − x̄) / Σt (xt − x̄)², taken over t = 1 … N−τ in the numerator and t = 1 … N in the denominator, so that C(0) = 1; lags are reported as τΔt in nanoseconds. For block averaging, each series was partitioned into M = ⌊N/n⌋ non-overlapping blocks of length n with block means x̄b = n−1 Σ xt over the n frames of block b. The standard error of the mean implied by that block length is SEM(n) = [ Σb (x̄b − x̄)² / (M(M − 1)) ]^(1/2), which we refer to as the blocked standard error. It rises with n and levels off once a block is longer than the correlation time of the observable, and that plateau is the standard error of the mean with correlation between frames accounted for. Writing SEM(1) = s/√N for the naive estimate that assumes independent frames, with s the sample standard deviation, the ratio [SEM(n)/SEM(1)]² gives the number of frames per independent sample and Neff = N divided by that ratio. Block lengths were specified in nanoseconds and converted to a frame count separately for each replicate, because replicates were not all written at the same frame rate; block means were pooled across the three replicates of a genotype, so that a 50 ns block yields six blocks from three 100 ns trajectories. Since g is the square of a ratio of estimated standard deviations, the interval shown on it is the chi-square interval on M − 1 degrees of freedom. These diagnostics are reported in Supplementary Figure 1.</w:t>
+        <w:t xml:space="preserve">priori </w:t>
+      </w:r>
+      <w:r>
+        <w:rPr>
+          <w:color w:val="FF0000"/>
+        </w:rPr>
+        <w:t>rather than fitted to the panel.</w:t>
       </w:r>
     </w:p>
     <w:p>
@@ -10999,93 +11606,83 @@
         <w:t xml:space="preserve">apo </w:t>
       </w:r>
       <w:r>
-        <w:t>(RT only) simulations to compute the relative binding free energy, ∆∆</w:t>
+        <w:t>(RT only) simulations to compute the relative binding free energy, ∆∆G</w:t>
+      </w:r>
+      <w:r>
+        <w:rPr>
+          <w:vertAlign w:val="subscript"/>
+        </w:rPr>
+        <w:t>bind</w:t>
+      </w:r>
+      <w:r>
+        <w:t>, between the mutant and WT RT-DOR complexes using a non-equilibrium alchemical free energy calculation protocol (Figure 2). Additionally, we calculated the average MM/GBSA energy over 100 equally spaced snapshots of each equilibrium trajectory. For each mutant genotype, we then computed WT-referenced energetic changes for the total MM/GBSA energy (∆∆</w:t>
       </w:r>
       <w:proofErr w:type="spellStart"/>
       <w:r>
-        <w:t>G</w:t>
+        <w:t>E</w:t>
       </w:r>
       <w:r>
         <w:rPr>
           <w:vertAlign w:val="subscript"/>
         </w:rPr>
+        <w:t>Total</w:t>
+      </w:r>
+      <w:proofErr w:type="spellEnd"/>
+      <w:r>
+        <w:t>) and for four individual energy components: van der Waals (∆∆</w:t>
+      </w:r>
+      <w:proofErr w:type="spellStart"/>
+      <w:r>
+        <w:t>E</w:t>
+      </w:r>
+      <w:r>
+        <w:rPr>
+          <w:vertAlign w:val="subscript"/>
+        </w:rPr>
+        <w:t>vdW</w:t>
+      </w:r>
+      <w:proofErr w:type="spellEnd"/>
+      <w:r>
+        <w:t>), electrostatic (∆∆</w:t>
+      </w:r>
+      <w:proofErr w:type="spellStart"/>
+      <w:r>
+        <w:t>E</w:t>
+      </w:r>
+      <w:r>
+        <w:rPr>
+          <w:vertAlign w:val="subscript"/>
+        </w:rPr>
+        <w:t>elec</w:t>
+      </w:r>
+      <w:proofErr w:type="spellEnd"/>
+      <w:r>
+        <w:t>), generalized Born polar solvation (∆∆E</w:t>
+      </w:r>
+      <w:r>
+        <w:rPr>
+          <w:vertAlign w:val="subscript"/>
+        </w:rPr>
+        <w:t>GB</w:t>
+      </w:r>
+      <w:r>
+        <w:t>), and nonpolar surface area (∆∆E</w:t>
+      </w:r>
+      <w:r>
+        <w:rPr>
+          <w:vertAlign w:val="subscript"/>
+        </w:rPr>
+        <w:t>SA</w:t>
+      </w:r>
+      <w:r>
+        <w:t>) contributions. The results are summarized in Table 2 (see Supplementary Table 3 for replicate-level results). Throughout this work, we classify a genotype as having a strong impact on ∆∆G</w:t>
+      </w:r>
+      <w:r>
+        <w:rPr>
+          <w:vertAlign w:val="subscript"/>
+        </w:rPr>
         <w:t>bind</w:t>
       </w:r>
-      <w:proofErr w:type="spellEnd"/>
-      <w:r>
-        <w:t>, between the mutant and WT RT-DOR complexes using a non-equilibrium alchemical free energy calculation protocol (Figure 2). Additionally, we calculated the average MM/GBSA energy over 100 equally spaced snapshots of each equilibrium trajectory. For each mutant genotype, we then computed WT-referenced energetic changes for the total MM/GBSA energy (∆∆</w:t>
-      </w:r>
-      <w:proofErr w:type="spellStart"/>
-      <w:r>
-        <w:t>E</w:t>
-      </w:r>
-      <w:r>
-        <w:rPr>
-          <w:vertAlign w:val="subscript"/>
-        </w:rPr>
-        <w:t>Total</w:t>
-      </w:r>
-      <w:proofErr w:type="spellEnd"/>
-      <w:r>
-        <w:t>) and for four individual energy components: van der Waals (∆∆</w:t>
-      </w:r>
-      <w:proofErr w:type="spellStart"/>
-      <w:r>
-        <w:t>E</w:t>
-      </w:r>
-      <w:r>
-        <w:rPr>
-          <w:vertAlign w:val="subscript"/>
-        </w:rPr>
-        <w:t>vdW</w:t>
-      </w:r>
-      <w:proofErr w:type="spellEnd"/>
-      <w:r>
-        <w:t>), electrostatic (∆∆</w:t>
-      </w:r>
-      <w:proofErr w:type="spellStart"/>
-      <w:r>
-        <w:t>E</w:t>
-      </w:r>
-      <w:r>
-        <w:rPr>
-          <w:vertAlign w:val="subscript"/>
-        </w:rPr>
-        <w:t>elec</w:t>
-      </w:r>
-      <w:proofErr w:type="spellEnd"/>
-      <w:r>
-        <w:t>), generalized Born polar solvation (∆∆E</w:t>
-      </w:r>
-      <w:r>
-        <w:rPr>
-          <w:vertAlign w:val="subscript"/>
-        </w:rPr>
-        <w:t>GB</w:t>
-      </w:r>
-      <w:r>
-        <w:t>), and nonpolar surface area (∆∆E</w:t>
-      </w:r>
-      <w:r>
-        <w:rPr>
-          <w:vertAlign w:val="subscript"/>
-        </w:rPr>
-        <w:t>SA</w:t>
-      </w:r>
-      <w:r>
-        <w:t>) contributions. The results are summarized in Table 2 (see Supplementary Table 3 for replicate-level results). Throughout this work, we classify a genotype as having a strong impact on ∆∆</w:t>
-      </w:r>
-      <w:proofErr w:type="spellStart"/>
-      <w:r>
-        <w:t>G</w:t>
-      </w:r>
-      <w:r>
-        <w:rPr>
-          <w:vertAlign w:val="subscript"/>
-        </w:rPr>
-        <w:t>bind</w:t>
-      </w:r>
-      <w:proofErr w:type="spellEnd"/>
       <w:r>
         <w:t xml:space="preserve"> or ∆∆</w:t>
       </w:r>
@@ -11196,17 +11793,7 @@
           <w:sz w:val="22"/>
           <w:szCs w:val="18"/>
         </w:rPr>
-        <w:t>Figure 2: Free Energy Perturbation (FEP) protocol used to estimate ∆∆</w:t>
-      </w:r>
-      <w:proofErr w:type="spellStart"/>
-      <w:r>
-        <w:rPr>
-          <w:b/>
-          <w:bCs/>
-          <w:sz w:val="22"/>
-          <w:szCs w:val="18"/>
-        </w:rPr>
-        <w:t>G</w:t>
+        <w:t>Figure 2: Free Energy Perturbation (FEP) protocol used to estimate ∆∆G</w:t>
       </w:r>
       <w:r>
         <w:rPr>
@@ -11218,7 +11805,6 @@
         </w:rPr>
         <w:t>bind</w:t>
       </w:r>
-      <w:proofErr w:type="spellEnd"/>
       <w:r>
         <w:rPr>
           <w:b/>
@@ -11484,15 +12070,7 @@
           <w:sz w:val="22"/>
           <w:szCs w:val="18"/>
         </w:rPr>
-        <w:t xml:space="preserve"> Shift in binding free energy, ∆∆</w:t>
-      </w:r>
-      <w:proofErr w:type="spellStart"/>
-      <w:r>
-        <w:rPr>
-          <w:sz w:val="22"/>
-          <w:szCs w:val="18"/>
-        </w:rPr>
-        <w:t>G</w:t>
+        <w:t xml:space="preserve"> Shift in binding free energy, ∆∆G</w:t>
       </w:r>
       <w:r>
         <w:rPr>
@@ -11502,7 +12080,6 @@
         </w:rPr>
         <w:t>bind</w:t>
       </w:r>
-      <w:proofErr w:type="spellEnd"/>
       <w:r>
         <w:rPr>
           <w:sz w:val="22"/>
@@ -12065,9 +12642,8 @@
                 <w:sz w:val="22"/>
                 <w:szCs w:val="22"/>
               </w:rPr>
-              <w:t>∆∆</w:t>
-            </w:r>
-            <w:proofErr w:type="spellStart"/>
+              <w:t>∆∆G</w:t>
+            </w:r>
             <w:r>
               <w:rPr>
                 <w:b/>
@@ -12075,21 +12651,10 @@
                 <w:color w:val="000000"/>
                 <w:sz w:val="22"/>
                 <w:szCs w:val="22"/>
-              </w:rPr>
-              <w:t>G</w:t>
-            </w:r>
-            <w:r>
-              <w:rPr>
-                <w:b/>
-                <w:bCs/>
-                <w:color w:val="000000"/>
-                <w:sz w:val="22"/>
-                <w:szCs w:val="22"/>
                 <w:vertAlign w:val="subscript"/>
               </w:rPr>
               <w:t>bind</w:t>
             </w:r>
-            <w:proofErr w:type="spellEnd"/>
             <w:r>
               <w:rPr>
                 <w:b/>
@@ -15970,15 +16535,7 @@
           <w:sz w:val="22"/>
           <w:szCs w:val="22"/>
         </w:rPr>
-        <w:t>, nonpolar surface area component; ∆∆</w:t>
-      </w:r>
-      <w:proofErr w:type="spellStart"/>
-      <w:r>
-        <w:rPr>
-          <w:sz w:val="22"/>
-          <w:szCs w:val="22"/>
-        </w:rPr>
-        <w:t>G</w:t>
+        <w:t>, nonpolar surface area component; ∆∆G</w:t>
       </w:r>
       <w:r>
         <w:rPr>
@@ -15988,7 +16545,6 @@
         </w:rPr>
         <w:t>bind</w:t>
       </w:r>
-      <w:proofErr w:type="spellEnd"/>
       <w:r>
         <w:rPr>
           <w:sz w:val="22"/>
@@ -16224,56 +16780,46 @@
         </w:rPr>
       </w:pPr>
       <w:r>
-        <w:t>While ∆∆</w:t>
+        <w:t>While ∆∆G</w:t>
+      </w:r>
+      <w:r>
+        <w:rPr>
+          <w:vertAlign w:val="subscript"/>
+        </w:rPr>
+        <w:t>bind</w:t>
+      </w:r>
+      <w:r>
+        <w:t xml:space="preserve"> and ∆∆</w:t>
       </w:r>
       <w:proofErr w:type="spellStart"/>
       <w:r>
-        <w:t>G</w:t>
+        <w:t>E</w:t>
       </w:r>
       <w:r>
         <w:rPr>
           <w:vertAlign w:val="subscript"/>
         </w:rPr>
+        <w:t>Total</w:t>
+      </w:r>
+      <w:proofErr w:type="spellEnd"/>
+      <w:r>
+        <w:t xml:space="preserve"> exhibit a weak correlation with each other (R</w:t>
+      </w:r>
+      <w:r>
+        <w:rPr>
+          <w:vertAlign w:val="superscript"/>
+        </w:rPr>
+        <w:t xml:space="preserve">2 </w:t>
+      </w:r>
+      <w:r>
+        <w:t>= 0.18, p = 0.08), both of these metrics show practically no correlation with DOR fold-change values observed experimentally - ∆∆G</w:t>
+      </w:r>
+      <w:r>
+        <w:rPr>
+          <w:vertAlign w:val="subscript"/>
+        </w:rPr>
         <w:t>bind</w:t>
       </w:r>
-      <w:proofErr w:type="spellEnd"/>
-      <w:r>
-        <w:t xml:space="preserve"> and ∆∆</w:t>
-      </w:r>
-      <w:proofErr w:type="spellStart"/>
-      <w:r>
-        <w:t>E</w:t>
-      </w:r>
-      <w:r>
-        <w:rPr>
-          <w:vertAlign w:val="subscript"/>
-        </w:rPr>
-        <w:t>Total</w:t>
-      </w:r>
-      <w:proofErr w:type="spellEnd"/>
-      <w:r>
-        <w:t xml:space="preserve"> exhibit a weak correlation with each other (R</w:t>
-      </w:r>
-      <w:r>
-        <w:rPr>
-          <w:vertAlign w:val="superscript"/>
-        </w:rPr>
-        <w:t xml:space="preserve">2 </w:t>
-      </w:r>
-      <w:r>
-        <w:t>= 0.18, p = 0.08), both of these metrics show practically no correlation with DOR fold-change values observed experimentally - ∆∆</w:t>
-      </w:r>
-      <w:proofErr w:type="spellStart"/>
-      <w:r>
-        <w:t>G</w:t>
-      </w:r>
-      <w:r>
-        <w:rPr>
-          <w:vertAlign w:val="subscript"/>
-        </w:rPr>
-        <w:t>bind</w:t>
-      </w:r>
-      <w:proofErr w:type="spellEnd"/>
       <w:r>
         <w:t xml:space="preserve"> vs log</w:t>
       </w:r>
@@ -16355,11 +16901,7 @@
         <w:t>Uncertain</w:t>
       </w:r>
       <w:r>
-        <w:t xml:space="preserve"> phenotype set), ∆∆</w:t>
-      </w:r>
-      <w:proofErr w:type="spellStart"/>
-      <w:r>
-        <w:t>G</w:t>
+        <w:t xml:space="preserve"> phenotype set), ∆∆G</w:t>
       </w:r>
       <w:r>
         <w:rPr>
@@ -16367,7 +16909,6 @@
         </w:rPr>
         <w:t>bind</w:t>
       </w:r>
-      <w:proofErr w:type="spellEnd"/>
       <w:r>
         <w:t xml:space="preserve"> exhibits weak correlation with log</w:t>
       </w:r>
@@ -23021,11 +23562,7 @@
         </w:rPr>
       </w:pPr>
       <w:r>
-        <w:t>We found that the relative binding free energy, ∆∆</w:t>
-      </w:r>
-      <w:proofErr w:type="spellStart"/>
-      <w:r>
-        <w:t>G</w:t>
+        <w:t>We found that the relative binding free energy, ∆∆G</w:t>
       </w:r>
       <w:r>
         <w:rPr>
@@ -23033,7 +23570,6 @@
         </w:rPr>
         <w:t>bind</w:t>
       </w:r>
-      <w:proofErr w:type="spellEnd"/>
       <w:r>
         <w:t xml:space="preserve">, obtained from the FEP simulations correctly predicted low impact on RT-DOR binding affinity for 3 out of 4 </w:t>
       </w:r>
@@ -23421,11 +23957,7 @@
       </w:r>
       <w:r>
         <w:lastRenderedPageBreak/>
-        <w:t>why K103N+M230L and L100I+K103N also show insignificant binding penalties in our simulations (∆∆</w:t>
-      </w:r>
-      <w:proofErr w:type="spellStart"/>
-      <w:r>
-        <w:t>G</w:t>
+        <w:t>why K103N+M230L and L100I+K103N also show insignificant binding penalties in our simulations (∆∆G</w:t>
       </w:r>
       <w:r>
         <w:rPr>
@@ -23433,7 +23965,6 @@
         </w:rPr>
         <w:t>bind</w:t>
       </w:r>
-      <w:proofErr w:type="spellEnd"/>
       <w:r>
         <w:t xml:space="preserve"> = 0.59 ± 0.41 and 0.19 ± 0.68 kcal/mol).</w:t>
       </w:r>
@@ -23558,11 +24089,7 @@
       </w:r>
       <w:proofErr w:type="spellEnd"/>
       <w:r>
-        <w:t xml:space="preserve"> = 2.25 ± 0.20 kcal/mol) and one of the largest binding free energy penalties (∆∆</w:t>
-      </w:r>
-      <w:proofErr w:type="spellStart"/>
-      <w:r>
-        <w:t>G</w:t>
+        <w:t xml:space="preserve"> = 2.25 ± 0.20 kcal/mol) and one of the largest binding free energy penalties (∆∆G</w:t>
       </w:r>
       <w:r>
         <w:rPr>
@@ -23570,7 +24097,6 @@
         </w:rPr>
         <w:t>bind</w:t>
       </w:r>
-      <w:proofErr w:type="spellEnd"/>
       <w:r>
         <w:t xml:space="preserve"> = 4.52 ± 0.49 kcal/mol) in the entire panel. Aromatic packing of DOR is therefore hinges on Tyr188 alone, consistent with the crystallographic observation that the Tyr181 side chain is rotated away from the drug,</w:t>
       </w:r>
@@ -23761,11 +24287,7 @@
         <w:fldChar w:fldCharType="end"/>
       </w:r>
       <w:r>
-        <w:t xml:space="preserve"> but that region has room around the DOR pose, and all structural features calculated from our simulations suggest DOR packing in G190A RT is equivalent to that in WT (Table 3). On the other hand, G190S tilts the chlorocyanophenyl ring away from coplanarity with Tyr188. G190E is the most distorted system in the panel by two independent measures — Val179 displaced by nearly 3 Å and the pocket enlarged by ~25%. Yet the aromatic anchor is undisturbed and the drug remains fully buried, which is why a badly deformed pocket nonetheless binds DOR slightly more tightly than WT (∆∆</w:t>
-      </w:r>
-      <w:proofErr w:type="spellStart"/>
-      <w:r>
-        <w:t>G</w:t>
+        <w:t xml:space="preserve"> but that region has room around the DOR pose, and all structural features calculated from our simulations suggest DOR packing in G190A RT is equivalent to that in WT (Table 3). On the other hand, G190S tilts the chlorocyanophenyl ring away from coplanarity with Tyr188. G190E is the most distorted system in the panel by two independent measures — Val179 displaced by nearly 3 Å and the pocket enlarged by ~25%. Yet the aromatic anchor is undisturbed and the drug remains fully buried, which is why a badly deformed pocket nonetheless binds DOR slightly more tightly than WT (∆∆G</w:t>
       </w:r>
       <w:r>
         <w:rPr>
@@ -23773,7 +24295,6 @@
         </w:rPr>
         <w:t>bind</w:t>
       </w:r>
-      <w:proofErr w:type="spellEnd"/>
       <w:r>
         <w:t xml:space="preserve"> = −1.02 ± 0.38 kcal/mol). Notably, G190 substitutions increase susceptibility to DLV while severely impairing replication capacity, G190E most of all,</w:t>
       </w:r>
@@ -23903,11 +24424,7 @@
         <w:fldChar w:fldCharType="end"/>
       </w:r>
       <w:r>
-        <w:t xml:space="preserve"> — the two genotypes with the lowest pyridinone contact counts in our panel. In contrast, in V106I and V106M, DOR is pushed away from Ser105 and pressed against residue 106, the pyridinone contact count does not fall, and the cost appears instead at the other end of the molecule: these are the only two genotypes in which the residue 103 backbone anchor lengthens appreciably, by roughly 0.6 Å against a distance otherwise constant to within 0.25 Å across all 18 mutants (Table 3). V106I and V106M account for the two largest apparent overestimates of ∆∆</w:t>
-      </w:r>
-      <w:proofErr w:type="spellStart"/>
-      <w:r>
-        <w:t>G</w:t>
+        <w:t xml:space="preserve"> — the two genotypes with the lowest pyridinone contact counts in our panel. In contrast, in V106I and V106M, DOR is pushed away from Ser105 and pressed against residue 106, the pyridinone contact count does not fall, and the cost appears instead at the other end of the molecule: these are the only two genotypes in which the residue 103 backbone anchor lengthens appreciably, by roughly 0.6 Å against a distance otherwise constant to within 0.25 Å across all 18 mutants (Table 3). V106I and V106M account for the two largest apparent overestimates of ∆∆G</w:t>
       </w:r>
       <w:r>
         <w:rPr>
@@ -23915,7 +24432,6 @@
         </w:rPr>
         <w:t>bind</w:t>
       </w:r>
-      <w:proofErr w:type="spellEnd"/>
       <w:r>
         <w:t xml:space="preserve"> in the panel (+2.27 ± 0.74 and +6.10 ± 0.16 kcal/mol) against fold-changes of 1.1 and 3.4 (Table 1). Notably, however, in subtype C, V106M alone reduces DOR susceptibility 17-fold,</w:t>
       </w:r>
@@ -24007,82 +24523,67 @@
       </w:r>
       <w:proofErr w:type="spellEnd"/>
       <w:r>
-        <w:t xml:space="preserve"> and ∆∆</w:t>
+        <w:t xml:space="preserve"> and ∆∆G</w:t>
+      </w:r>
+      <w:r>
+        <w:rPr>
+          <w:vertAlign w:val="subscript"/>
+        </w:rPr>
+        <w:t>bind</w:t>
+      </w:r>
+      <w:r>
+        <w:t>, which is not surprising. The two measure different quantities, the interface energy of the bound complex versus the energetic difference between bound and unbound states.</w:t>
+      </w:r>
+      <w:r>
+        <w:fldChar w:fldCharType="begin"/>
+      </w:r>
+      <w:r>
+        <w:instrText xml:space="preserve"> ADDIN ZOTERO_ITEM CSL_CITATION {"citationID":"TRvkGbXI","properties":{"unsorted":false,"formattedCitation":"\\super 34\\nosupersub{}","plainCitation":"34","noteIndex":0},"citationItems":[{"id":361,"uris":["http://zotero.org/users/19404620/items/A8NFQWYD"],"itemData":{"id":361,"type":"article-journal","abstract":"Introduction: The molecular mechanics energies combined with the Poisson–Boltzmann or generalized Born and surface area continuum solvation (MM/PBSA and MM/GBSA) methods are popular approaches to estimate the free energy of the binding of small ligands to biological macromolecules. They are typically based on molecular dynamics simulations of the receptor–ligand complex and are therefore intermediate in both accuracy and computational effort between empirical scoring and strict alchemical perturbation methods. They have been applied to a large number of systems with varying success. Areas covered: The authors review the use of MM/PBSA and MM/GBSA methods to calculate ligand-binding affinities, with an emphasis on calibration, testing and validation, as well as attempts to improve the methods, rather than on specific applications. Expert opinion: MM/PBSA and MM/GBSA are attractive approaches owing to their modular nature and that they do not require calculations on a training set. They have been used successfully to reproduce and rationalize experimental findings and to improve the results of virtual screening and docking. However, they contain several crude and questionable approximations, for example, the lack of conformational entropy and information about the number and free energy of water molecules in the binding site. Moreover, there are many variants of the method and their performance varies strongly with the tested system. Likewise, most attempts to ameliorate the methods with more accurate approaches, for example, quantum-mechanical calculations, polarizable force fields or improved solvation have deteriorated the results.","container-title":"Expert Opinion on Drug Discovery","DOI":"10.1517/17460441.2015.1032936","ISSN":"1746-0441","issue":"5","page":"449-461","PMID":"25835573","publisher":"Taylor &amp; Francis","source":"Taylor and Francis+NEJM","title":"The MM/PBSA and MM/GBSA methods to estimate ligand-binding affinities","volume":"10","author":[{"family":"Genheden","given":"Samuel"},{"family":"Ryde","given":"Ulf"}],"issued":{"date-parts":[["2015",5,4]]}}}],"schema":"https://github.com/citation-style-language/schema/raw/master/csl-citation.json"} </w:instrText>
+      </w:r>
+      <w:r>
+        <w:fldChar w:fldCharType="separate"/>
+      </w:r>
+      <w:r>
+        <w:rPr>
+          <w:vertAlign w:val="superscript"/>
+        </w:rPr>
+        <w:t>34</w:t>
+      </w:r>
+      <w:r>
+        <w:fldChar w:fldCharType="end"/>
+      </w:r>
+      <w:r>
+        <w:t xml:space="preserve"> G190E and A98G+F227C both distort the DOR–RT interface (∆∆</w:t>
       </w:r>
       <w:proofErr w:type="spellStart"/>
       <w:r>
-        <w:t>G</w:t>
+        <w:t>E</w:t>
       </w:r>
       <w:r>
         <w:rPr>
           <w:vertAlign w:val="subscript"/>
         </w:rPr>
+        <w:t>Total</w:t>
+      </w:r>
+      <w:proofErr w:type="spellEnd"/>
+      <w:r>
+        <w:t xml:space="preserve"> = 1.94 ± 0.40 and 2.47 ± 0.24 kcal/mol), but comparable distortion is present in the apo simulations, so the penalty largely cancels in the thermodynamic cycle and the residual favors binding (∆∆G</w:t>
+      </w:r>
+      <w:r>
+        <w:rPr>
+          <w:vertAlign w:val="subscript"/>
+        </w:rPr>
         <w:t>bind</w:t>
       </w:r>
-      <w:proofErr w:type="spellEnd"/>
-      <w:r>
-        <w:t>, which is not surprising. The two measure different quantities, the interface energy of the bound complex versus the energetic difference between bound and unbound states.</w:t>
-      </w:r>
-      <w:r>
-        <w:fldChar w:fldCharType="begin"/>
-      </w:r>
-      <w:r>
-        <w:instrText xml:space="preserve"> ADDIN ZOTERO_ITEM CSL_CITATION {"citationID":"TRvkGbXI","properties":{"unsorted":false,"formattedCitation":"\\super 34\\nosupersub{}","plainCitation":"34","noteIndex":0},"citationItems":[{"id":361,"uris":["http://zotero.org/users/19404620/items/A8NFQWYD"],"itemData":{"id":361,"type":"article-journal","abstract":"Introduction: The molecular mechanics energies combined with the Poisson–Boltzmann or generalized Born and surface area continuum solvation (MM/PBSA and MM/GBSA) methods are popular approaches to estimate the free energy of the binding of small ligands to biological macromolecules. They are typically based on molecular dynamics simulations of the receptor–ligand complex and are therefore intermediate in both accuracy and computational effort between empirical scoring and strict alchemical perturbation methods. They have been applied to a large number of systems with varying success. Areas covered: The authors review the use of MM/PBSA and MM/GBSA methods to calculate ligand-binding affinities, with an emphasis on calibration, testing and validation, as well as attempts to improve the methods, rather than on specific applications. Expert opinion: MM/PBSA and MM/GBSA are attractive approaches owing to their modular nature and that they do not require calculations on a training set. They have been used successfully to reproduce and rationalize experimental findings and to improve the results of virtual screening and docking. However, they contain several crude and questionable approximations, for example, the lack of conformational entropy and information about the number and free energy of water molecules in the binding site. Moreover, there are many variants of the method and their performance varies strongly with the tested system. Likewise, most attempts to ameliorate the methods with more accurate approaches, for example, quantum-mechanical calculations, polarizable force fields or improved solvation have deteriorated the results.","container-title":"Expert Opinion on Drug Discovery","DOI":"10.1517/17460441.2015.1032936","ISSN":"1746-0441","issue":"5","page":"449-461","PMID":"25835573","publisher":"Taylor &amp; Francis","source":"Taylor and Francis+NEJM","title":"The MM/PBSA and MM/GBSA methods to estimate ligand-binding affinities","volume":"10","author":[{"family":"Genheden","given":"Samuel"},{"family":"Ryde","given":"Ulf"}],"issued":{"date-parts":[["2015",5,4]]}}}],"schema":"https://github.com/citation-style-language/schema/raw/master/csl-citation.json"} </w:instrText>
-      </w:r>
-      <w:r>
-        <w:fldChar w:fldCharType="separate"/>
-      </w:r>
-      <w:r>
-        <w:rPr>
-          <w:vertAlign w:val="superscript"/>
-        </w:rPr>
-        <w:t>34</w:t>
-      </w:r>
-      <w:r>
-        <w:fldChar w:fldCharType="end"/>
-      </w:r>
-      <w:r>
-        <w:t xml:space="preserve"> G190E and A98G+F227C both distort the DOR–RT interface (∆∆</w:t>
-      </w:r>
-      <w:proofErr w:type="spellStart"/>
-      <w:r>
-        <w:t>E</w:t>
+      <w:r>
+        <w:t xml:space="preserve"> = −1.02 ± 0.38 and −1.53 ± 0.87 kcal/mol). Similarly, for K103N+M230L, our calculations suggest negligible binding penalty (∆∆G</w:t>
       </w:r>
       <w:r>
         <w:rPr>
           <w:vertAlign w:val="subscript"/>
         </w:rPr>
-        <w:t>Total</w:t>
-      </w:r>
-      <w:proofErr w:type="spellEnd"/>
-      <w:r>
-        <w:t xml:space="preserve"> = 1.94 ± 0.40 and 2.47 ± 0.24 kcal/mol), but comparable distortion is present in the apo simulations, so the penalty largely cancels in the thermodynamic cycle and the residual favors binding (∆∆</w:t>
-      </w:r>
-      <w:proofErr w:type="spellStart"/>
-      <w:r>
-        <w:t>G</w:t>
-      </w:r>
-      <w:r>
-        <w:rPr>
-          <w:vertAlign w:val="subscript"/>
-        </w:rPr>
         <w:t>bind</w:t>
       </w:r>
-      <w:proofErr w:type="spellEnd"/>
-      <w:r>
-        <w:t xml:space="preserve"> = −1.02 ± 0.38 and −1.53 ± 0.87 kcal/mol). Similarly, for K103N+M230L, our calculations suggest negligible binding penalty (∆∆</w:t>
-      </w:r>
-      <w:proofErr w:type="spellStart"/>
-      <w:r>
-        <w:t>G</w:t>
-      </w:r>
-      <w:r>
-        <w:rPr>
-          <w:vertAlign w:val="subscript"/>
-        </w:rPr>
-        <w:t>bind</w:t>
-      </w:r>
-      <w:proofErr w:type="spellEnd"/>
       <w:r>
         <w:t xml:space="preserve"> = 0.59 ± 0.41 kcal/mol) despite a 36-fold reduction in susceptibility (Table 1). Structural metrics suggest DOR interface is unperturbed — chlorocyanophenyl burial is the second highest in the panel, 22.8 ± 2.4 against 19.5 ± 0.5 in WT, and the Lys103 anchor is intact at 3.05 ± 0.04 Å (Table 3). Interestingly, Met230 lies in the p66 primer grip, where its side chain contacts the primer terminus,</w:t>
       </w:r>
@@ -24207,7 +24708,71 @@
         <w:rPr>
           <w:color w:val="FF0000"/>
         </w:rPr>
-        <w:t>. A change in the primer grip, in how the template is held, or in how often RT adopts a catalytically active shape would not move ΔΔGbind or ΔΔETotal, yet could still lower susceptibility in cells.</w:t>
+        <w:t xml:space="preserve">. A change in the primer grip, in how the template is held, or in how often RT adopts a catalytically active shape would not </w:t>
+      </w:r>
+      <w:r>
+        <w:rPr>
+          <w:color w:val="FF0000"/>
+        </w:rPr>
+        <w:t>affect</w:t>
+      </w:r>
+      <w:r>
+        <w:rPr>
+          <w:color w:val="FF0000"/>
+        </w:rPr>
+        <w:t xml:space="preserve"> ΔΔG</w:t>
+      </w:r>
+      <w:r>
+        <w:rPr>
+          <w:color w:val="FF0000"/>
+          <w:vertAlign w:val="subscript"/>
+        </w:rPr>
+        <w:t>bind</w:t>
+      </w:r>
+      <w:r>
+        <w:rPr>
+          <w:color w:val="FF0000"/>
+        </w:rPr>
+        <w:t xml:space="preserve"> or </w:t>
+      </w:r>
+      <w:proofErr w:type="spellStart"/>
+      <w:r>
+        <w:rPr>
+          <w:color w:val="FF0000"/>
+        </w:rPr>
+        <w:t>ΔΔE</w:t>
+      </w:r>
+      <w:r>
+        <w:rPr>
+          <w:color w:val="FF0000"/>
+          <w:vertAlign w:val="subscript"/>
+        </w:rPr>
+        <w:t>Total</w:t>
+      </w:r>
+      <w:proofErr w:type="spellEnd"/>
+      <w:r>
+        <w:rPr>
+          <w:color w:val="FF0000"/>
+        </w:rPr>
+        <w:t xml:space="preserve"> as measured in the present study</w:t>
+      </w:r>
+      <w:r>
+        <w:rPr>
+          <w:color w:val="FF0000"/>
+        </w:rPr>
+        <w:t>, yet could still lower susceptibility in</w:t>
+      </w:r>
+      <w:r>
+        <w:rPr>
+          <w:color w:val="FF0000"/>
+        </w:rPr>
+        <w:t xml:space="preserve"> host</w:t>
+      </w:r>
+      <w:r>
+        <w:rPr>
+          <w:color w:val="FF0000"/>
+        </w:rPr>
+        <w:t xml:space="preserve"> cells.</w:t>
       </w:r>
     </w:p>
     <w:p>
@@ -24219,14 +24784,147 @@
         <w:rPr>
           <w:color w:val="FF0000"/>
         </w:rPr>
-        <w:t xml:space="preserve">A second limitation concerns the unliganded enzyme. The NNIBP is not an open cavity in RT on its own. DOR has to open it, and that costs free energy. Our thermodynamic cycle introduces each mutation twice, once in the DOR-bound state and once in the unliganded state. A mutation that changes the cost of opening the pocket therefore changes both legs in the same direction, and the two changes largely cancel in ΔΔGbind. We tested this with apo simulations of wild type and seven genotypes. Every unliganded pocket was smaller than its bound counterpart. The difference </w:t>
+        <w:t xml:space="preserve">A </w:t>
       </w:r>
       <w:r>
         <w:rPr>
           <w:color w:val="FF0000"/>
         </w:rPr>
+        <w:t>related</w:t>
+      </w:r>
+      <w:r>
+        <w:rPr>
+          <w:color w:val="FF0000"/>
+        </w:rPr>
+        <w:t xml:space="preserve"> limitation concerns the unliganded </w:t>
+      </w:r>
+      <w:r>
+        <w:rPr>
+          <w:color w:val="FF0000"/>
+        </w:rPr>
+        <w:t xml:space="preserve">conformation of the RT </w:t>
+      </w:r>
+      <w:r>
+        <w:rPr>
+          <w:color w:val="FF0000"/>
+        </w:rPr>
+        <w:t>enzyme</w:t>
+      </w:r>
+      <w:r>
+        <w:rPr>
+          <w:color w:val="FF0000"/>
+        </w:rPr>
+        <w:t>, in which</w:t>
+      </w:r>
+      <w:r>
+        <w:rPr>
+          <w:color w:val="FF0000"/>
+        </w:rPr>
+        <w:t xml:space="preserve"> NNIBP is not an open cavity in </w:t>
+      </w:r>
+      <w:r>
+        <w:rPr>
+          <w:color w:val="FF0000"/>
+        </w:rPr>
+        <w:t>the p66 subunit</w:t>
+      </w:r>
+      <w:r>
+        <w:rPr>
+          <w:color w:val="FF0000"/>
+        </w:rPr>
+        <w:t xml:space="preserve">. </w:t>
+      </w:r>
+      <w:r>
+        <w:rPr>
+          <w:color w:val="FF0000"/>
+        </w:rPr>
+        <w:t>NNRTI binding opens this cleft, which involves rotation of the Tyr181 and Tyr188 moieties, by expending free energy</w:t>
+      </w:r>
+      <w:r>
+        <w:rPr>
+          <w:color w:val="FF0000"/>
+        </w:rPr>
+        <w:t>. Our thermodynamic cycle</w:t>
+      </w:r>
+      <w:r>
+        <w:rPr>
+          <w:color w:val="FF0000"/>
+        </w:rPr>
+        <w:t xml:space="preserve"> (Figure 2)</w:t>
+      </w:r>
+      <w:r>
+        <w:rPr>
+          <w:color w:val="FF0000"/>
+        </w:rPr>
+        <w:t xml:space="preserve"> introduces each mutation twice, once in the DOR-bound state and once in the unliganded state. </w:t>
+      </w:r>
+      <w:r>
+        <w:rPr>
+          <w:color w:val="FF0000"/>
+        </w:rPr>
+        <w:t>In principle, a</w:t>
+      </w:r>
+      <w:r>
+        <w:rPr>
+          <w:color w:val="FF0000"/>
+        </w:rPr>
+        <w:t xml:space="preserve"> mutation that </w:t>
+      </w:r>
+      <w:r>
+        <w:rPr>
+          <w:color w:val="FF0000"/>
+        </w:rPr>
+        <w:t>affects both states in the same direction, for example by stabilizing both the DOR-bound and unliganded state with respect to WT RT</w:t>
+      </w:r>
+      <w:r>
+        <w:rPr>
+          <w:color w:val="FF0000"/>
+        </w:rPr>
+        <w:t xml:space="preserve">, </w:t>
+      </w:r>
+      <w:r>
+        <w:rPr>
+          <w:color w:val="FF0000"/>
+        </w:rPr>
+        <w:t xml:space="preserve">could reduce susceptibility to </w:t>
+      </w:r>
+      <w:r>
+        <w:rPr>
+          <w:color w:val="FF0000"/>
+        </w:rPr>
         <w:lastRenderedPageBreak/>
-        <w:t xml:space="preserve">between the two states was larger than in wild type for all three genotypes whose ΔΔGbind misses the phenotype (Supplementary Section 7 and Supplementary Table 7). ΔΔGbind is therefore least sensitive to the mechanism these genotypes appear to use. </w:t>
+        <w:t xml:space="preserve">DOR </w:t>
+      </w:r>
+      <w:r>
+        <w:rPr>
+          <w:color w:val="FF0000"/>
+        </w:rPr>
+        <w:t xml:space="preserve">would give </w:t>
+      </w:r>
+      <w:r>
+        <w:rPr>
+          <w:color w:val="FF0000"/>
+        </w:rPr>
+        <w:t>ΔΔG</w:t>
+      </w:r>
+      <w:r>
+        <w:rPr>
+          <w:color w:val="FF0000"/>
+          <w:vertAlign w:val="subscript"/>
+        </w:rPr>
+        <w:t>bind</w:t>
+      </w:r>
+      <w:r>
+        <w:rPr>
+          <w:color w:val="FF0000"/>
+        </w:rPr>
+        <w:t xml:space="preserve"> ~ 0 kcal/mol in our simulations</w:t>
+      </w:r>
+      <w:r>
+        <w:rPr>
+          <w:color w:val="FF0000"/>
+        </w:rPr>
+        <w:t xml:space="preserve">. We tested this with apo simulations of wild type and seven genotypes. Every unliganded pocket was smaller than its bound counterpart. The difference between the two states was larger than in wild type for all three genotypes whose ΔΔGbind misses the phenotype (Supplementary Section 7 and Supplementary Table 7). ΔΔGbind is therefore least sensitive to the mechanism these genotypes appear to use. </w:t>
       </w:r>
       <w:r>
         <w:t>More generally, resistance can act through large-scale allosteric change, through the conformational equilibrium of the unliganded pocket on timescales far longer than we sample, or through effects on enzyme processivity and viral fitness, none of which are captured in these calculations. Such mechanisms are in principle accessible to hybrid QM/MM approaches,</w:t>
@@ -24475,14 +25173,14 @@
         <w:rPr>
           <w:color w:val="FF0000"/>
         </w:rPr>
-        <w:t xml:space="preserve">The sampling is a limitation of a different kind. Three 100 ns replicates are long relative to the local relaxation of the DOR pose, which converges within the first few nanoseconds, but short relative to the domain rearrangements of RT and to the conformational equilibrium of the unliganded pocket. Our replicates were seeded from the same crystallographic pose with only small coordinate perturbations, so they sample one conformational basin well rather than surveying the accessible landscape. Stable RMSD values, overlapping forward and reverse work distributions and small replicate-to-replicate errors establish convergence within that basin; they do not </w:t>
+        <w:t xml:space="preserve">The sampling is a limitation of a different kind. Three 100 ns replicates are long relative to the local relaxation of the DOR pose, which converges within the first few nanoseconds, but short relative to the domain rearrangements of RT and to the conformational equilibrium of the unliganded pocket. Our replicates were seeded from the same crystallographic pose with only small coordinate perturbations, so they sample one conformational basin well rather than surveying </w:t>
       </w:r>
       <w:r>
         <w:rPr>
           <w:color w:val="FF0000"/>
         </w:rPr>
         <w:lastRenderedPageBreak/>
-        <w:t>establish that the basin is the only relevant one. This distinction matters most for the NNIBP, which is an induced-fit pocket that does not exist in unliganded RT, because a mutation that shifts the conformational equilibrium of the apo enzyme, or the free-energy cost of opening the pocket, perturbs both legs of our thermodynamic cycle in the same direction and largely cancels. The three genotypes where ΔΔGbind misses the phenotype, K103N+M230L, A98G+F227C and G190E, are precisely those whose reported mechanisms are pre-binding or loop-mediated, which is what that cancellation would predict. We tested this directly against our apo simulations. Compared on a matched 10 ns window, the unliganded pocket is substantially collapsed relative to the bound state (42–107 Å³ against 223–284 Å³ in Table 3), and its volume differs between genotypes: relative to WT it is −49.0 Å³ for G190E, −36.6 Å³ for V106I+F227C and −28.4 Å³ for A98G+F227C, against +12.5 Å³ for V106A and +2.0 Å³ for K103N+M230L. Two of the three genotypes whose ΔΔGbind misses the phenotype therefore have markedly more collapsed apo pockets than WT, which is what a pre-binding mechanism would produce and what our cycle cancels. In three of the four genotypes whose apo trajectories run to 100 ns, the pocket volume changes by only 1–5 Å³ between the first 10 ns and the remaining 90 ns, so this comparison is not an artifact of the shorter reference. Across the panel the DOR heavy-atom RMSD from the crystallographic pose settles between 0.64 and 0.93 Å, wild type at 0.66 Å, so the complexes are stable but the ensembles do not visit alternative poses.</w:t>
+        <w:t>the accessible landscape. Stable RMSD values, overlapping forward and reverse work distributions and small replicate-to-replicate errors establish convergence within that basin; they do not establish that the basin is the only relevant one. This distinction matters most for the NNIBP, which is an induced-fit pocket that does not exist in unliganded RT, because a mutation that shifts the conformational equilibrium of the apo enzyme, or the free-energy cost of opening the pocket, perturbs both legs of our thermodynamic cycle in the same direction and largely cancels. The three genotypes where ΔΔGbind misses the phenotype, K103N+M230L, A98G+F227C and G190E, are precisely those whose reported mechanisms are pre-binding or loop-mediated, which is what that cancellation would predict. We tested this directly against our apo simulations. Compared on a matched 10 ns window, the unliganded pocket is substantially collapsed relative to the bound state (42–107 Å³ against 223–284 Å³ in Table 3), and its volume differs between genotypes: relative to WT it is −49.0 Å³ for G190E, −36.6 Å³ for V106I+F227C and −28.4 Å³ for A98G+F227C, against +12.5 Å³ for V106A and +2.0 Å³ for K103N+M230L. Two of the three genotypes whose ΔΔGbind misses the phenotype therefore have markedly more collapsed apo pockets than WT, which is what a pre-binding mechanism would produce and what our cycle cancels. In three of the four genotypes whose apo trajectories run to 100 ns, the pocket volume changes by only 1–5 Å³ between the first 10 ns and the remaining 90 ns, so this comparison is not an artifact of the shorter reference. Across the panel the DOR heavy-atom RMSD from the crystallographic pose settles between 0.64 and 0.93 Å, wild type at 0.66 Å, so the complexes are stable but the ensembles do not visit alternative poses.</w:t>
       </w:r>
     </w:p>
     <w:p>
@@ -24529,6 +25227,7 @@
           <w:i/>
           <w:iCs/>
         </w:rPr>
+        <w:lastRenderedPageBreak/>
         <w:t>Supporting Information</w:t>
       </w:r>
     </w:p>
@@ -24541,7 +25240,6 @@
         </w:rPr>
       </w:pPr>
       <w:r>
-        <w:lastRenderedPageBreak/>
         <w:t>The Supporting Information is available free of charge at https://pubs.acs.org/doi/10.1021/acs.jcim.XXXXXXX.</w:t>
       </w:r>
     </w:p>
@@ -24659,6 +25357,7 @@
           <w:b/>
           <w:bCs/>
         </w:rPr>
+        <w:lastRenderedPageBreak/>
         <w:t>AUTHOR INFORMATION</w:t>
       </w:r>
     </w:p>
@@ -24677,7 +25376,6 @@
           <w:i/>
           <w:iCs/>
         </w:rPr>
-        <w:lastRenderedPageBreak/>
         <w:t>Corresponding Author</w:t>
       </w:r>
     </w:p>
@@ -24822,6 +25520,7 @@
         </w:rPr>
       </w:pPr>
       <w:r>
+        <w:lastRenderedPageBreak/>
         <w:t>The authors declare no competing financial interest.</w:t>
       </w:r>
     </w:p>
@@ -24842,7 +25541,6 @@
           <w:b/>
           <w:bCs/>
         </w:rPr>
-        <w:lastRenderedPageBreak/>
         <w:t>ACKNOWLEDGMENTS</w:t>
       </w:r>
     </w:p>
@@ -24938,20 +25636,7 @@
           <w:lang w:bidi="hi-IN"/>
         </w:rPr>
         <w:tab/>
-      </w:r>
-      <w:proofErr w:type="spellStart"/>
-      <w:r>
-        <w:rPr>
-          <w:lang w:bidi="hi-IN"/>
-        </w:rPr>
-        <w:t>Kohlstaedt</w:t>
-      </w:r>
-      <w:proofErr w:type="spellEnd"/>
-      <w:r>
-        <w:rPr>
-          <w:lang w:bidi="hi-IN"/>
-        </w:rPr>
-        <w:t xml:space="preserve">, L. A.; Wang, J.; Friedman, J. M.; Rice, P. A.; Steitz, T. A. Crystal Structure at 3.5 Å Resolution of HIV-1 Reverse Transcriptase Complexed with an Inhibitor. </w:t>
+        <w:t xml:space="preserve">Kohlstaedt, L. A.; Wang, J.; Friedman, J. M.; Rice, P. A.; Steitz, T. A. Crystal Structure at 3.5 Å Resolution of HIV-1 Reverse Transcriptase Complexed with an Inhibitor. </w:t>
       </w:r>
       <w:r>
         <w:rPr>
@@ -25077,35 +25762,7 @@
           <w:lang w:bidi="hi-IN"/>
         </w:rPr>
         <w:tab/>
-        <w:t xml:space="preserve">Rodgers, D. W.; Gamblin, S. J.; Harris, B. A.; Ray, S.; Culp, J. S.; </w:t>
-      </w:r>
-      <w:proofErr w:type="spellStart"/>
-      <w:r>
-        <w:rPr>
-          <w:lang w:bidi="hi-IN"/>
-        </w:rPr>
-        <w:t>Hellmig</w:t>
-      </w:r>
-      <w:proofErr w:type="spellEnd"/>
-      <w:r>
-        <w:rPr>
-          <w:lang w:bidi="hi-IN"/>
-        </w:rPr>
-        <w:t xml:space="preserve">, B.; Woolf, D. J.; </w:t>
-      </w:r>
-      <w:proofErr w:type="spellStart"/>
-      <w:r>
-        <w:rPr>
-          <w:lang w:bidi="hi-IN"/>
-        </w:rPr>
-        <w:t>Debouck</w:t>
-      </w:r>
-      <w:proofErr w:type="spellEnd"/>
-      <w:r>
-        <w:rPr>
-          <w:lang w:bidi="hi-IN"/>
-        </w:rPr>
-        <w:t xml:space="preserve">, C.; Harrison, S. C. The Structure of Unliganded Reverse Transcriptase from the Human Immunodeficiency Virus Type 1. </w:t>
+        <w:t xml:space="preserve">Rodgers, D. W.; Gamblin, S. J.; Harris, B. A.; Ray, S.; Culp, J. S.; Hellmig, B.; Woolf, D. J.; Debouck, C.; Harrison, S. C. The Structure of Unliganded Reverse Transcriptase from the Human Immunodeficiency Virus Type 1. </w:t>
       </w:r>
       <w:r>
         <w:rPr>
@@ -25168,20 +25825,7 @@
           <w:lang w:bidi="hi-IN"/>
         </w:rPr>
         <w:tab/>
-      </w:r>
-      <w:proofErr w:type="spellStart"/>
-      <w:r>
-        <w:rPr>
-          <w:lang w:bidi="hi-IN"/>
-        </w:rPr>
-        <w:t>Hsiou</w:t>
-      </w:r>
-      <w:proofErr w:type="spellEnd"/>
-      <w:r>
-        <w:rPr>
-          <w:lang w:bidi="hi-IN"/>
-        </w:rPr>
-        <w:t xml:space="preserve">, Y.; Ding, J.; Das, K.; AD Clark, J.; Hughes, S. H.; Arnold, E. Structure of Unliganded HIV-1 Reverse Transcriptase at 2.7 å Resolution: Implications of Conformational Changes for Polymerization and Inhibition Mechanisms. </w:t>
+        <w:t xml:space="preserve">Hsiou, Y.; Ding, J.; Das, K.; AD Clark, J.; Hughes, S. H.; Arnold, E. Structure of Unliganded HIV-1 Reverse Transcriptase at 2.7 å Resolution: Implications of Conformational Changes for Polymerization and Inhibition Mechanisms. </w:t>
       </w:r>
       <w:r>
         <w:rPr>
@@ -25237,6 +25881,7 @@
         <w:rPr>
           <w:lang w:bidi="hi-IN"/>
         </w:rPr>
+        <w:lastRenderedPageBreak/>
         <w:t>(5)</w:t>
       </w:r>
       <w:r>
@@ -25252,25 +25897,7 @@
           <w:iCs/>
           <w:lang w:bidi="hi-IN"/>
         </w:rPr>
-        <w:t xml:space="preserve">Cold Spring Harb </w:t>
-      </w:r>
-      <w:proofErr w:type="spellStart"/>
-      <w:r>
-        <w:rPr>
-          <w:i/>
-          <w:iCs/>
-          <w:lang w:bidi="hi-IN"/>
-        </w:rPr>
-        <w:t>Perspect</w:t>
-      </w:r>
-      <w:proofErr w:type="spellEnd"/>
-      <w:r>
-        <w:rPr>
-          <w:i/>
-          <w:iCs/>
-          <w:lang w:bidi="hi-IN"/>
-        </w:rPr>
-        <w:t xml:space="preserve"> Med</w:t>
+        <w:t>Cold Spring Harb Perspect Med</w:t>
       </w:r>
       <w:r>
         <w:rPr>
@@ -25318,7 +25945,6 @@
         <w:rPr>
           <w:lang w:bidi="hi-IN"/>
         </w:rPr>
-        <w:lastRenderedPageBreak/>
         <w:t>(6)</w:t>
       </w:r>
       <w:r>
@@ -25326,21 +25952,7 @@
           <w:lang w:bidi="hi-IN"/>
         </w:rPr>
         <w:tab/>
-        <w:t xml:space="preserve">Cilento, M. E.; Kirby, K. A.; </w:t>
-      </w:r>
-      <w:proofErr w:type="spellStart"/>
-      <w:r>
-        <w:rPr>
-          <w:lang w:bidi="hi-IN"/>
-        </w:rPr>
-        <w:t>Sarafianos</w:t>
-      </w:r>
-      <w:proofErr w:type="spellEnd"/>
-      <w:r>
-        <w:rPr>
-          <w:lang w:bidi="hi-IN"/>
-        </w:rPr>
-        <w:t xml:space="preserve">, S. G. Avoiding Drug Resistance in HIV Reverse Transcriptase. </w:t>
+        <w:t xml:space="preserve">Cilento, M. E.; Kirby, K. A.; Sarafianos, S. G. Avoiding Drug Resistance in HIV Reverse Transcriptase. </w:t>
       </w:r>
       <w:r>
         <w:rPr>
@@ -25529,34 +26141,7 @@
           <w:lang w:bidi="hi-IN"/>
         </w:rPr>
         <w:tab/>
-      </w:r>
-      <w:proofErr w:type="spellStart"/>
-      <w:r>
-        <w:rPr>
-          <w:lang w:bidi="hi-IN"/>
-        </w:rPr>
-        <w:t>Hsiou</w:t>
-      </w:r>
-      <w:proofErr w:type="spellEnd"/>
-      <w:r>
-        <w:rPr>
-          <w:lang w:bidi="hi-IN"/>
-        </w:rPr>
-        <w:t xml:space="preserve">, Y.; Ding, J.; Das, K.; Clark, A. D.; Boyer, P. L.; Lewi, P.; Janssen, P. A. J.; Kleim, J.-P.; </w:t>
-      </w:r>
-      <w:proofErr w:type="spellStart"/>
-      <w:r>
-        <w:rPr>
-          <w:lang w:bidi="hi-IN"/>
-        </w:rPr>
-        <w:t>Rösner</w:t>
-      </w:r>
-      <w:proofErr w:type="spellEnd"/>
-      <w:r>
-        <w:rPr>
-          <w:lang w:bidi="hi-IN"/>
-        </w:rPr>
-        <w:t xml:space="preserve">, M.; Hughes, S. H.; Arnold, E. The Lys103Asn Mutation of HIV-1 RT: A Novel Mechanism of Drug Resistance. </w:t>
+        <w:t xml:space="preserve">Hsiou, Y.; Ding, J.; Das, K.; Clark, A. D.; Boyer, P. L.; Lewi, P.; Janssen, P. A. J.; Kleim, J.-P.; Rösner, M.; Hughes, S. H.; Arnold, E. The Lys103Asn Mutation of HIV-1 RT: A Novel Mechanism of Drug Resistance. </w:t>
       </w:r>
       <w:r>
         <w:rPr>
@@ -25745,49 +26330,7 @@
           <w:lang w:bidi="hi-IN"/>
         </w:rPr>
         <w:tab/>
-        <w:t xml:space="preserve">Das, K.; Clark, Arthur D.; Lewi, P. J.; Heeres, J.; de Jonge, M. R.; </w:t>
-      </w:r>
-      <w:proofErr w:type="spellStart"/>
-      <w:r>
-        <w:rPr>
-          <w:lang w:bidi="hi-IN"/>
-        </w:rPr>
-        <w:t>Koymans</w:t>
-      </w:r>
-      <w:proofErr w:type="spellEnd"/>
-      <w:r>
-        <w:rPr>
-          <w:lang w:bidi="hi-IN"/>
-        </w:rPr>
-        <w:t xml:space="preserve">, L. M. H.; </w:t>
-      </w:r>
-      <w:proofErr w:type="spellStart"/>
-      <w:r>
-        <w:rPr>
-          <w:lang w:bidi="hi-IN"/>
-        </w:rPr>
-        <w:t>Vinkers</w:t>
-      </w:r>
-      <w:proofErr w:type="spellEnd"/>
-      <w:r>
-        <w:rPr>
-          <w:lang w:bidi="hi-IN"/>
-        </w:rPr>
-        <w:t xml:space="preserve">, H. M.; </w:t>
-      </w:r>
-      <w:proofErr w:type="spellStart"/>
-      <w:r>
-        <w:rPr>
-          <w:lang w:bidi="hi-IN"/>
-        </w:rPr>
-        <w:t>Daeyaert</w:t>
-      </w:r>
-      <w:proofErr w:type="spellEnd"/>
-      <w:r>
-        <w:rPr>
-          <w:lang w:bidi="hi-IN"/>
-        </w:rPr>
-        <w:t xml:space="preserve">, F.; Ludovici, D. W.; Kukla, M. J.; De Corte, B.; Kavash, R. W.; Ho, C. Y.; Ye, H.; Lichtenstein, Mark. A.; Andries, K.; Pauwels, R.; de Béthune, M.-P.; Boyer, P. L.; Clark, P.; Hughes, S. H.; Janssen, P. A. J.; Arnold, E. Roles of Conformational and Positional Adaptability in Structure-Based Design of TMC125-R165335 (Etravirine) and Related Non-Nucleoside Reverse Transcriptase Inhibitors That Are Highly Potent and Effective against Wild-Type and Drug-Resistant HIV-1 Variants. </w:t>
+        <w:t xml:space="preserve">Das, K.; Clark, Arthur D.; Lewi, P. J.; Heeres, J.; de Jonge, M. R.; Koymans, L. M. H.; Vinkers, H. M.; Daeyaert, F.; Ludovici, D. W.; Kukla, M. J.; De Corte, B.; Kavash, R. W.; Ho, C. Y.; Ye, H.; Lichtenstein, Mark. A.; Andries, K.; Pauwels, R.; de Béthune, M.-P.; Boyer, P. L.; Clark, P.; Hughes, S. H.; Janssen, P. A. J.; Arnold, E. Roles of Conformational and Positional Adaptability in Structure-Based Design of TMC125-R165335 (Etravirine) and Related Non-Nucleoside Reverse Transcriptase Inhibitors That Are Highly Potent and Effective against Wild-Type and Drug-Resistant HIV-1 Variants. </w:t>
       </w:r>
       <w:r>
         <w:rPr>
@@ -25906,6 +26449,7 @@
         <w:rPr>
           <w:lang w:bidi="hi-IN"/>
         </w:rPr>
+        <w:lastRenderedPageBreak/>
         <w:t>(14)</w:t>
       </w:r>
       <w:r>
@@ -25913,98 +26457,7 @@
           <w:lang w:bidi="hi-IN"/>
         </w:rPr>
         <w:tab/>
-        <w:t xml:space="preserve">Côté, B.; Burch, J. D.; Asante-Appiah, E.; Bayly, C.; Bédard, L.; Blouin, M.; Campeau, L.-C.; Cauchon, E.; Chan, M.; </w:t>
-      </w:r>
-      <w:proofErr w:type="spellStart"/>
-      <w:r>
-        <w:rPr>
-          <w:lang w:bidi="hi-IN"/>
-        </w:rPr>
-        <w:t>Chefson</w:t>
-      </w:r>
-      <w:proofErr w:type="spellEnd"/>
-      <w:r>
-        <w:rPr>
-          <w:lang w:bidi="hi-IN"/>
-        </w:rPr>
-        <w:t xml:space="preserve">, A.; Coulombe, N.; </w:t>
-      </w:r>
-      <w:proofErr w:type="spellStart"/>
-      <w:r>
-        <w:rPr>
-          <w:lang w:bidi="hi-IN"/>
-        </w:rPr>
-        <w:t>Cromlish</w:t>
-      </w:r>
-      <w:proofErr w:type="spellEnd"/>
-      <w:r>
-        <w:rPr>
-          <w:lang w:bidi="hi-IN"/>
-        </w:rPr>
-        <w:t xml:space="preserve">, W.; Debnath, S.; </w:t>
-      </w:r>
-      <w:proofErr w:type="spellStart"/>
-      <w:r>
-        <w:rPr>
-          <w:lang w:bidi="hi-IN"/>
-        </w:rPr>
-        <w:t>Deschênes</w:t>
-      </w:r>
-      <w:proofErr w:type="spellEnd"/>
-      <w:r>
-        <w:rPr>
-          <w:lang w:bidi="hi-IN"/>
-        </w:rPr>
-        <w:t xml:space="preserve">, D.; Dupont-Gaudet, K.; </w:t>
-      </w:r>
-      <w:proofErr w:type="spellStart"/>
-      <w:r>
-        <w:rPr>
-          <w:lang w:bidi="hi-IN"/>
-        </w:rPr>
-        <w:t>Falgueyret</w:t>
-      </w:r>
-      <w:proofErr w:type="spellEnd"/>
-      <w:r>
-        <w:rPr>
-          <w:lang w:bidi="hi-IN"/>
-        </w:rPr>
-        <w:t xml:space="preserve">, J.-P.; Forget, R.; </w:t>
-      </w:r>
-      <w:proofErr w:type="spellStart"/>
-      <w:r>
-        <w:rPr>
-          <w:lang w:bidi="hi-IN"/>
-        </w:rPr>
-        <w:t>Gagné</w:t>
-      </w:r>
-      <w:proofErr w:type="spellEnd"/>
-      <w:r>
-        <w:rPr>
-          <w:lang w:bidi="hi-IN"/>
-        </w:rPr>
-        <w:t xml:space="preserve">, S.; Gauvreau, D.; </w:t>
-      </w:r>
-      <w:r>
-        <w:rPr>
-          <w:lang w:bidi="hi-IN"/>
-        </w:rPr>
-        <w:lastRenderedPageBreak/>
-        <w:t xml:space="preserve">Girardin, M.; Guiral, S.; Langlois, E.; Li, C. S.; Nguyen, N.; Papp, R.; Plamondon, S.; Roy, A.; Roy, S.; </w:t>
-      </w:r>
-      <w:proofErr w:type="spellStart"/>
-      <w:r>
-        <w:rPr>
-          <w:lang w:bidi="hi-IN"/>
-        </w:rPr>
-        <w:t>Seliniotakis</w:t>
-      </w:r>
-      <w:proofErr w:type="spellEnd"/>
-      <w:r>
-        <w:rPr>
-          <w:lang w:bidi="hi-IN"/>
-        </w:rPr>
-        <w:t xml:space="preserve">, R.; St-Onge, M.; Ouellet, S.; Tawa, P.; Truchon, J.-F.; Vacca, J.; Wrona, M.; Yan, Y.; Ducharme, Y. Discovery of MK-1439, an Orally Bioavailable Non-Nucleoside Reverse Transcriptase Inhibitor Potent against a Wide Range of Resistant Mutant HIV Viruses. </w:t>
+        <w:t xml:space="preserve">Côté, B.; Burch, J. D.; Asante-Appiah, E.; Bayly, C.; Bédard, L.; Blouin, M.; Campeau, L.-C.; Cauchon, E.; Chan, M.; Chefson, A.; Coulombe, N.; Cromlish, W.; Debnath, S.; Deschênes, D.; Dupont-Gaudet, K.; Falgueyret, J.-P.; Forget, R.; Gagné, S.; Gauvreau, D.; Girardin, M.; Guiral, S.; Langlois, E.; Li, C. S.; Nguyen, N.; Papp, R.; Plamondon, S.; Roy, A.; Roy, S.; Seliniotakis, R.; St-Onge, M.; Ouellet, S.; Tawa, P.; Truchon, J.-F.; Vacca, J.; Wrona, M.; Yan, Y.; Ducharme, Y. Discovery of MK-1439, an Orally Bioavailable Non-Nucleoside Reverse Transcriptase Inhibitor Potent against a Wide Range of Resistant Mutant HIV Viruses. </w:t>
       </w:r>
       <w:r>
         <w:rPr>
@@ -26193,21 +26646,7 @@
           <w:lang w:bidi="hi-IN"/>
         </w:rPr>
         <w:tab/>
-        <w:t xml:space="preserve">Lai, M.-T.; Feng, M.; </w:t>
-      </w:r>
-      <w:proofErr w:type="spellStart"/>
-      <w:r>
-        <w:rPr>
-          <w:lang w:bidi="hi-IN"/>
-        </w:rPr>
-        <w:t>Falgueyret</w:t>
-      </w:r>
-      <w:proofErr w:type="spellEnd"/>
-      <w:r>
-        <w:rPr>
-          <w:lang w:bidi="hi-IN"/>
-        </w:rPr>
-        <w:t xml:space="preserve">, J.-P.; Tawa, P.; Witmer, M.; DiStefano, D.; Li, Y.; Burch, J.; Sachs, N.; Lu, M.; Cauchon, E.; Campeau, L.-C.; Grobler, J.; Yan, Y.; Ducharme, Y.; Côté, B.; Asante-Appiah, E.; Hazuda, D. J.; Miller, M. D. In Vitro Characterization of MK-1439, a Novel HIV-1 Nonnucleoside Reverse Transcriptase Inhibitor. </w:t>
+        <w:t xml:space="preserve">Lai, M.-T.; Feng, M.; Falgueyret, J.-P.; Tawa, P.; Witmer, M.; DiStefano, D.; Li, Y.; Burch, J.; Sachs, N.; Lu, M.; Cauchon, E.; Campeau, L.-C.; Grobler, J.; Yan, Y.; Ducharme, Y.; Côté, B.; Asante-Appiah, E.; Hazuda, D. J.; Miller, M. D. In Vitro Characterization of MK-1439, a Novel HIV-1 Nonnucleoside Reverse Transcriptase Inhibitor. </w:t>
       </w:r>
       <w:r>
         <w:rPr>
@@ -26270,21 +26709,7 @@
           <w:lang w:bidi="hi-IN"/>
         </w:rPr>
         <w:tab/>
-        <w:t xml:space="preserve">Rhee, S.-Y.; Schapiro, J. M.; </w:t>
-      </w:r>
-      <w:proofErr w:type="spellStart"/>
-      <w:r>
-        <w:rPr>
-          <w:lang w:bidi="hi-IN"/>
-        </w:rPr>
-        <w:t>Saladini</w:t>
-      </w:r>
-      <w:proofErr w:type="spellEnd"/>
-      <w:r>
-        <w:rPr>
-          <w:lang w:bidi="hi-IN"/>
-        </w:rPr>
-        <w:t xml:space="preserve">, F.; Zazzi, M.; Khoo, S.; Shafer, R. W. Potential Role of Doravirine for the Treatment of HIV-1-Infected Persons with Transmitted Drug Resistance. </w:t>
+        <w:t xml:space="preserve">Rhee, S.-Y.; Schapiro, J. M.; Saladini, F.; Zazzi, M.; Khoo, S.; Shafer, R. W. Potential Role of Doravirine for the Treatment of HIV-1-Infected Persons with Transmitted Drug Resistance. </w:t>
       </w:r>
       <w:r>
         <w:rPr>
@@ -26347,49 +26772,7 @@
           <w:lang w:bidi="hi-IN"/>
         </w:rPr>
         <w:tab/>
-        <w:t xml:space="preserve">Calza, L.; </w:t>
-      </w:r>
-      <w:proofErr w:type="spellStart"/>
-      <w:r>
-        <w:rPr>
-          <w:lang w:bidi="hi-IN"/>
-        </w:rPr>
-        <w:t>Colangeli</w:t>
-      </w:r>
-      <w:proofErr w:type="spellEnd"/>
-      <w:r>
-        <w:rPr>
-          <w:lang w:bidi="hi-IN"/>
-        </w:rPr>
-        <w:t xml:space="preserve">, V.; </w:t>
-      </w:r>
-      <w:proofErr w:type="spellStart"/>
-      <w:r>
-        <w:rPr>
-          <w:lang w:bidi="hi-IN"/>
-        </w:rPr>
-        <w:t>Pensalfine</w:t>
-      </w:r>
-      <w:proofErr w:type="spellEnd"/>
-      <w:r>
-        <w:rPr>
-          <w:lang w:bidi="hi-IN"/>
-        </w:rPr>
-        <w:t xml:space="preserve">, G.; </w:t>
-      </w:r>
-      <w:proofErr w:type="spellStart"/>
-      <w:r>
-        <w:rPr>
-          <w:lang w:bidi="hi-IN"/>
-        </w:rPr>
-        <w:t>Appolloni</w:t>
-      </w:r>
-      <w:proofErr w:type="spellEnd"/>
-      <w:r>
-        <w:rPr>
-          <w:lang w:bidi="hi-IN"/>
-        </w:rPr>
-        <w:t xml:space="preserve">, L.; Vitale, S.; Bon, I.; Viale, P. Doravirine/Lamivudine/Tenofovir Disoproxil Fumarate in Virologically Suppressed People Living with HIV: A Real-Life Experience. </w:t>
+        <w:t xml:space="preserve">Calza, L.; Colangeli, V.; Pensalfine, G.; Appolloni, L.; Vitale, S.; Bon, I.; Viale, P. Doravirine/Lamivudine/Tenofovir Disoproxil Fumarate in Virologically Suppressed People Living with HIV: A Real-Life Experience. </w:t>
       </w:r>
       <w:r>
         <w:rPr>
@@ -26452,20 +26835,7 @@
           <w:lang w:bidi="hi-IN"/>
         </w:rPr>
         <w:tab/>
-      </w:r>
-      <w:proofErr w:type="spellStart"/>
-      <w:r>
-        <w:rPr>
-          <w:lang w:bidi="hi-IN"/>
-        </w:rPr>
-        <w:t>Mejías</w:t>
-      </w:r>
-      <w:proofErr w:type="spellEnd"/>
-      <w:r>
-        <w:rPr>
-          <w:lang w:bidi="hi-IN"/>
-        </w:rPr>
-        <w:t xml:space="preserve">-Trueba, M.; Gutierrez-Valencia, A.; Llaves-Flores, S.; Roca-Oporto, C.; Herrero, M.; Sotomayor de la Piedra, C.; Lopez-Cortes, L. F.; Espinosa, N. Long-Term Effectiveness, Safety, and Tolerability of Doravirine in Antiretroviral-Experienced People with HIV in Real Life. </w:t>
+        <w:t xml:space="preserve">Mejías-Trueba, M.; Gutierrez-Valencia, A.; Llaves-Flores, S.; Roca-Oporto, C.; Herrero, M.; Sotomayor de la Piedra, C.; Lopez-Cortes, L. F.; Espinosa, N. Long-Term Effectiveness, Safety, and Tolerability of Doravirine in Antiretroviral-Experienced People with HIV in Real Life. </w:t>
       </w:r>
       <w:r>
         <w:rPr>
@@ -26591,105 +26961,14 @@
           <w:lang w:bidi="hi-IN"/>
         </w:rPr>
         <w:tab/>
-        <w:t xml:space="preserve">Orkin, C.; </w:t>
-      </w:r>
-      <w:proofErr w:type="spellStart"/>
-      <w:r>
-        <w:rPr>
-          <w:lang w:bidi="hi-IN"/>
-        </w:rPr>
-        <w:t>Mngqibisa</w:t>
-      </w:r>
-      <w:proofErr w:type="spellEnd"/>
-      <w:r>
-        <w:rPr>
-          <w:lang w:bidi="hi-IN"/>
-        </w:rPr>
-        <w:t xml:space="preserve">, R.; Velez, J. D.; Kumar, P.; Braun, D. L.; Carr, A.; Bloch, M.; Walmsley, S.; </w:t>
-      </w:r>
-      <w:proofErr w:type="spellStart"/>
-      <w:r>
-        <w:rPr>
-          <w:lang w:bidi="hi-IN"/>
-        </w:rPr>
-        <w:t>Tebas</w:t>
-      </w:r>
-      <w:proofErr w:type="spellEnd"/>
-      <w:r>
-        <w:rPr>
-          <w:lang w:bidi="hi-IN"/>
-        </w:rPr>
-        <w:t xml:space="preserve">, P.; </w:t>
-      </w:r>
-      <w:proofErr w:type="spellStart"/>
-      <w:r>
-        <w:rPr>
-          <w:lang w:bidi="hi-IN"/>
-        </w:rPr>
-        <w:t>Yokomaku</w:t>
-      </w:r>
-      <w:proofErr w:type="spellEnd"/>
-      <w:r>
-        <w:rPr>
-          <w:lang w:bidi="hi-IN"/>
-        </w:rPr>
-        <w:t xml:space="preserve">, Y.; Diamond, T. L.; Jackson, B.; Eves, K.; Grandhi, A.; </w:t>
-      </w:r>
-      <w:proofErr w:type="spellStart"/>
-      <w:r>
-        <w:rPr>
-          <w:lang w:bidi="hi-IN"/>
-        </w:rPr>
-        <w:t>Fuszard</w:t>
-      </w:r>
-      <w:proofErr w:type="spellEnd"/>
-      <w:r>
-        <w:rPr>
-          <w:lang w:bidi="hi-IN"/>
-        </w:rPr>
-        <w:t xml:space="preserve">, M.; Klopfer, S. O.; Stamm, L. M.; Fox, M. C.; Kim, J. Switch to Fixed-Dose Doravirine (100 Mg) and </w:t>
-      </w:r>
-      <w:proofErr w:type="spellStart"/>
-      <w:r>
-        <w:rPr>
-          <w:lang w:bidi="hi-IN"/>
-        </w:rPr>
-        <w:t>Islatravir</w:t>
-      </w:r>
-      <w:proofErr w:type="spellEnd"/>
-      <w:r>
-        <w:rPr>
-          <w:lang w:bidi="hi-IN"/>
-        </w:rPr>
-        <w:t xml:space="preserve"> (0·25 Mg) Once Daily in Virologically Suppressed Adults with HIV-1 on Oral Antiretroviral Therapy: 48-Week Results of a Phase 3, </w:t>
-      </w:r>
-      <w:proofErr w:type="spellStart"/>
-      <w:r>
-        <w:rPr>
-          <w:lang w:bidi="hi-IN"/>
-        </w:rPr>
-        <w:t>Multicentre</w:t>
-      </w:r>
-      <w:proofErr w:type="spellEnd"/>
-      <w:r>
-        <w:rPr>
-          <w:lang w:bidi="hi-IN"/>
-        </w:rPr>
-        <w:t xml:space="preserve">, </w:t>
-      </w:r>
-      <w:proofErr w:type="spellStart"/>
-      <w:r>
-        <w:rPr>
-          <w:lang w:bidi="hi-IN"/>
-        </w:rPr>
-        <w:t>Randomised</w:t>
-      </w:r>
-      <w:proofErr w:type="spellEnd"/>
-      <w:r>
-        <w:rPr>
-          <w:lang w:bidi="hi-IN"/>
-        </w:rPr>
-        <w:t xml:space="preserve">, Open-Label, Non-Inferiority Trial. </w:t>
+        <w:t xml:space="preserve">Orkin, C.; Mngqibisa, R.; Velez, J. D.; Kumar, P.; Braun, D. L.; Carr, A.; Bloch, M.; Walmsley, S.; Tebas, P.; Yokomaku, Y.; Diamond, T. L.; Jackson, B.; Eves, K.; Grandhi, A.; Fuszard, M.; Klopfer, S. O.; Stamm, L. M.; Fox, M. C.; Kim, J. Switch to Fixed-Dose Doravirine (100 Mg) and Islatravir (0·25 Mg) Once Daily in Virologically Suppressed Adults with HIV-1 on Oral Antiretroviral Therapy: 48-Week Results of a Phase 3, Multicentre, </w:t>
+      </w:r>
+      <w:r>
+        <w:rPr>
+          <w:lang w:bidi="hi-IN"/>
+        </w:rPr>
+        <w:lastRenderedPageBreak/>
+        <w:t xml:space="preserve">Randomised, Open-Label, Non-Inferiority Trial. </w:t>
       </w:r>
       <w:r>
         <w:rPr>
@@ -26745,7 +27024,6 @@
         <w:rPr>
           <w:lang w:bidi="hi-IN"/>
         </w:rPr>
-        <w:lastRenderedPageBreak/>
         <w:t>(23)</w:t>
       </w:r>
       <w:r>
@@ -26753,21 +27031,7 @@
           <w:lang w:bidi="hi-IN"/>
         </w:rPr>
         <w:tab/>
-        <w:t xml:space="preserve">Rizzo, R. C.; Wang, D.-P.; Tirado-Rives, J.; Jorgensen, W. L. Validation of a Model for the Complex of HIV-1 Reverse Transcriptase with </w:t>
-      </w:r>
-      <w:proofErr w:type="spellStart"/>
-      <w:r>
-        <w:rPr>
-          <w:lang w:bidi="hi-IN"/>
-        </w:rPr>
-        <w:t>Sustiva</w:t>
-      </w:r>
-      <w:proofErr w:type="spellEnd"/>
-      <w:r>
-        <w:rPr>
-          <w:lang w:bidi="hi-IN"/>
-        </w:rPr>
-        <w:t xml:space="preserve"> through Computation of Resistance Profiles. </w:t>
+        <w:t xml:space="preserve">Rizzo, R. C.; Wang, D.-P.; Tirado-Rives, J.; Jorgensen, W. L. Validation of a Model for the Complex of HIV-1 Reverse Transcriptase with Sustiva through Computation of Resistance Profiles. </w:t>
       </w:r>
       <w:r>
         <w:rPr>
@@ -26893,20 +27157,7 @@
           <w:lang w:bidi="hi-IN"/>
         </w:rPr>
         <w:tab/>
-      </w:r>
-      <w:proofErr w:type="spellStart"/>
-      <w:r>
-        <w:rPr>
-          <w:lang w:bidi="hi-IN"/>
-        </w:rPr>
-        <w:t>Udier-Blagović</w:t>
-      </w:r>
-      <w:proofErr w:type="spellEnd"/>
-      <w:r>
-        <w:rPr>
-          <w:lang w:bidi="hi-IN"/>
-        </w:rPr>
-        <w:t xml:space="preserve">, M.; Tirado-Rives, J.; Jorgensen, W. L. Validation of a Model for the Complex of HIV-1 Reverse Transcriptase with Nonnucleoside Inhibitor TMC125. </w:t>
+        <w:t xml:space="preserve">Udier-Blagović, M.; Tirado-Rives, J.; Jorgensen, W. L. Validation of a Model for the Complex of HIV-1 Reverse Transcriptase with Nonnucleoside Inhibitor TMC125. </w:t>
       </w:r>
       <w:r>
         <w:rPr>
@@ -26969,20 +27220,7 @@
           <w:lang w:bidi="hi-IN"/>
         </w:rPr>
         <w:tab/>
-      </w:r>
-      <w:proofErr w:type="spellStart"/>
-      <w:r>
-        <w:rPr>
-          <w:lang w:bidi="hi-IN"/>
-        </w:rPr>
-        <w:t>Udier-Blagović</w:t>
-      </w:r>
-      <w:proofErr w:type="spellEnd"/>
-      <w:r>
-        <w:rPr>
-          <w:lang w:bidi="hi-IN"/>
-        </w:rPr>
-        <w:t xml:space="preserve">, M.; Tirado-Rives, J.; Jorgensen, W. L. Structural and Energetic Analyses of the Effects of the K103N Mutation of HIV-1 Reverse Transcriptase on Efavirenz Analogues. </w:t>
+        <w:t xml:space="preserve">Udier-Blagović, M.; Tirado-Rives, J.; Jorgensen, W. L. Structural and Energetic Analyses of the Effects of the K103N Mutation of HIV-1 Reverse Transcriptase on Efavirenz Analogues. </w:t>
       </w:r>
       <w:r>
         <w:rPr>
@@ -27108,21 +27346,7 @@
           <w:lang w:bidi="hi-IN"/>
         </w:rPr>
         <w:tab/>
-        <w:t xml:space="preserve">Zhou, Z.; Madrid, M.; </w:t>
-      </w:r>
-      <w:proofErr w:type="spellStart"/>
-      <w:r>
-        <w:rPr>
-          <w:lang w:bidi="hi-IN"/>
-        </w:rPr>
-        <w:t>Evanseck</w:t>
-      </w:r>
-      <w:proofErr w:type="spellEnd"/>
-      <w:r>
-        <w:rPr>
-          <w:lang w:bidi="hi-IN"/>
-        </w:rPr>
-        <w:t xml:space="preserve">, J. D.; Madura, J. D. Effect of a Bound Non-Nucleoside RT Inhibitor on the Dynamics of Wild-Type and Mutant HIV-1 Reverse Transcriptase. </w:t>
+        <w:t xml:space="preserve">Zhou, Z.; Madrid, M.; Evanseck, J. D.; Madura, J. D. Effect of a Bound Non-Nucleoside RT Inhibitor on the Dynamics of Wild-Type and Mutant HIV-1 Reverse Transcriptase. </w:t>
       </w:r>
       <w:r>
         <w:rPr>
@@ -27248,21 +27472,7 @@
           <w:lang w:bidi="hi-IN"/>
         </w:rPr>
         <w:tab/>
-        <w:t xml:space="preserve">Geitmann, M.; </w:t>
-      </w:r>
-      <w:proofErr w:type="spellStart"/>
-      <w:r>
-        <w:rPr>
-          <w:lang w:bidi="hi-IN"/>
-        </w:rPr>
-        <w:t>Unge</w:t>
-      </w:r>
-      <w:proofErr w:type="spellEnd"/>
-      <w:r>
-        <w:rPr>
-          <w:lang w:bidi="hi-IN"/>
-        </w:rPr>
-        <w:t xml:space="preserve">, T.; Danielson, U. H. Interaction Kinetic Characterization of HIV-1 Reverse Transcriptase Non-Nucleoside Inhibitor Resistance. </w:t>
+        <w:t xml:space="preserve">Geitmann, M.; Unge, T.; Danielson, U. H. Interaction Kinetic Characterization of HIV-1 Reverse Transcriptase Non-Nucleoside Inhibitor Resistance. </w:t>
       </w:r>
       <w:r>
         <w:rPr>
@@ -27325,20 +27535,7 @@
           <w:lang w:bidi="hi-IN"/>
         </w:rPr>
         <w:tab/>
-      </w:r>
-      <w:proofErr w:type="spellStart"/>
-      <w:r>
-        <w:rPr>
-          <w:lang w:bidi="hi-IN"/>
-        </w:rPr>
-        <w:t>Ghidini</w:t>
-      </w:r>
-      <w:proofErr w:type="spellEnd"/>
-      <w:r>
-        <w:rPr>
-          <w:lang w:bidi="hi-IN"/>
-        </w:rPr>
-        <w:t xml:space="preserve">, A.; Serra, E.; Cavalli, A. On Free Energy Calculations in Drug Discovery. </w:t>
+        <w:t xml:space="preserve">Ghidini, A.; Serra, E.; Cavalli, A. On Free Energy Calculations in Drug Discovery. </w:t>
       </w:r>
       <w:r>
         <w:rPr>
@@ -27401,62 +27598,7 @@
           <w:lang w:bidi="hi-IN"/>
         </w:rPr>
         <w:tab/>
-      </w:r>
-      <w:proofErr w:type="spellStart"/>
-      <w:r>
-        <w:rPr>
-          <w:lang w:bidi="hi-IN"/>
-        </w:rPr>
-        <w:t>Gapsys</w:t>
-      </w:r>
-      <w:proofErr w:type="spellEnd"/>
-      <w:r>
-        <w:rPr>
-          <w:lang w:bidi="hi-IN"/>
-        </w:rPr>
-        <w:t xml:space="preserve">, V.; Pérez-Benito, L.; </w:t>
-      </w:r>
-      <w:proofErr w:type="spellStart"/>
-      <w:r>
-        <w:rPr>
-          <w:lang w:bidi="hi-IN"/>
-        </w:rPr>
-        <w:t>Aldeghi</w:t>
-      </w:r>
-      <w:proofErr w:type="spellEnd"/>
-      <w:r>
-        <w:rPr>
-          <w:lang w:bidi="hi-IN"/>
-        </w:rPr>
-        <w:t xml:space="preserve">, M.; Seeliger, D.; van </w:t>
-      </w:r>
-      <w:proofErr w:type="spellStart"/>
-      <w:r>
-        <w:rPr>
-          <w:lang w:bidi="hi-IN"/>
-        </w:rPr>
-        <w:t>Vlijmen</w:t>
-      </w:r>
-      <w:proofErr w:type="spellEnd"/>
-      <w:r>
-        <w:rPr>
-          <w:lang w:bidi="hi-IN"/>
-        </w:rPr>
-        <w:t xml:space="preserve">, H.; </w:t>
-      </w:r>
-      <w:proofErr w:type="spellStart"/>
-      <w:r>
-        <w:rPr>
-          <w:lang w:bidi="hi-IN"/>
-        </w:rPr>
-        <w:t>Tresadern</w:t>
-      </w:r>
-      <w:proofErr w:type="spellEnd"/>
-      <w:r>
-        <w:rPr>
-          <w:lang w:bidi="hi-IN"/>
-        </w:rPr>
-        <w:t xml:space="preserve">, G.; de Groot, B. L. Large Scale Relative Protein Ligand Binding Affinities Using Non-Equilibrium Alchemy. </w:t>
+        <w:t xml:space="preserve">Gapsys, V.; Pérez-Benito, L.; Aldeghi, M.; Seeliger, D.; van Vlijmen, H.; Tresadern, G.; de Groot, B. L. Large Scale Relative Protein Ligand Binding Affinities Using Non-Equilibrium Alchemy. </w:t>
       </w:r>
       <w:r>
         <w:rPr>
@@ -27519,35 +27661,14 @@
           <w:lang w:bidi="hi-IN"/>
         </w:rPr>
         <w:tab/>
-        <w:t xml:space="preserve">Kollman, P. A.; </w:t>
-      </w:r>
-      <w:proofErr w:type="spellStart"/>
-      <w:r>
-        <w:rPr>
-          <w:lang w:bidi="hi-IN"/>
-        </w:rPr>
-        <w:t>Massova</w:t>
-      </w:r>
-      <w:proofErr w:type="spellEnd"/>
-      <w:r>
-        <w:rPr>
-          <w:lang w:bidi="hi-IN"/>
-        </w:rPr>
-        <w:t xml:space="preserve">, I.; Reyes, C.; Kuhn, B.; Huo, S.; Chong, L.; Lee, M.; Lee, T.; Duan, Y.; Wang, W.; Donini, O.; </w:t>
-      </w:r>
-      <w:proofErr w:type="spellStart"/>
-      <w:r>
-        <w:rPr>
-          <w:lang w:bidi="hi-IN"/>
-        </w:rPr>
-        <w:t>Cieplak</w:t>
-      </w:r>
-      <w:proofErr w:type="spellEnd"/>
-      <w:r>
-        <w:rPr>
-          <w:lang w:bidi="hi-IN"/>
-        </w:rPr>
-        <w:t xml:space="preserve">, P.; Srinivasan, J.; Case, D. A.; Cheatham, T. E. Calculating Structures and Free Energies of Complex Molecules: Combining Molecular Mechanics and Continuum Models. </w:t>
+        <w:t xml:space="preserve">Kollman, P. A.; Massova, I.; Reyes, C.; Kuhn, B.; Huo, S.; Chong, L.; Lee, M.; Lee, T.; Duan, Y.; Wang, W.; Donini, O.; Cieplak, P.; Srinivasan, J.; Case, D. A.; Cheatham, T. E. Calculating Structures and Free Energies of Complex Molecules: Combining Molecular </w:t>
+      </w:r>
+      <w:r>
+        <w:rPr>
+          <w:lang w:bidi="hi-IN"/>
+        </w:rPr>
+        <w:lastRenderedPageBreak/>
+        <w:t xml:space="preserve">Mechanics and Continuum Models. </w:t>
       </w:r>
       <w:r>
         <w:rPr>
@@ -27603,7 +27724,6 @@
         <w:rPr>
           <w:lang w:bidi="hi-IN"/>
         </w:rPr>
-        <w:lastRenderedPageBreak/>
         <w:t>(34)</w:t>
       </w:r>
       <w:r>
@@ -27611,20 +27731,7 @@
           <w:lang w:bidi="hi-IN"/>
         </w:rPr>
         <w:tab/>
-      </w:r>
-      <w:proofErr w:type="spellStart"/>
-      <w:r>
-        <w:rPr>
-          <w:lang w:bidi="hi-IN"/>
-        </w:rPr>
-        <w:t>Genheden</w:t>
-      </w:r>
-      <w:proofErr w:type="spellEnd"/>
-      <w:r>
-        <w:rPr>
-          <w:lang w:bidi="hi-IN"/>
-        </w:rPr>
-        <w:t xml:space="preserve">, S.; Ryde, U. The MM/PBSA and MM/GBSA Methods to Estimate Ligand-Binding Affinities. </w:t>
+        <w:t xml:space="preserve">Genheden, S.; Ryde, U. The MM/PBSA and MM/GBSA Methods to Estimate Ligand-Binding Affinities. </w:t>
       </w:r>
       <w:r>
         <w:rPr>
@@ -27687,20 +27794,7 @@
           <w:lang w:bidi="hi-IN"/>
         </w:rPr>
         <w:tab/>
-      </w:r>
-      <w:proofErr w:type="spellStart"/>
-      <w:r>
-        <w:rPr>
-          <w:lang w:bidi="hi-IN"/>
-        </w:rPr>
-        <w:t>Kabsch</w:t>
-      </w:r>
-      <w:proofErr w:type="spellEnd"/>
-      <w:r>
-        <w:rPr>
-          <w:lang w:bidi="hi-IN"/>
-        </w:rPr>
-        <w:t xml:space="preserve">, W. A Solution for the Best Rotation to Relate Two Sets of Vectors. </w:t>
+        <w:t xml:space="preserve">Kabsch, W. A Solution for the Best Rotation to Relate Two Sets of Vectors. </w:t>
       </w:r>
       <w:r>
         <w:rPr>
@@ -27708,25 +27802,7 @@
           <w:iCs/>
           <w:lang w:bidi="hi-IN"/>
         </w:rPr>
-        <w:t xml:space="preserve">Acta </w:t>
-      </w:r>
-      <w:proofErr w:type="spellStart"/>
-      <w:r>
-        <w:rPr>
-          <w:i/>
-          <w:iCs/>
-          <w:lang w:bidi="hi-IN"/>
-        </w:rPr>
-        <w:t>Crystallographica</w:t>
-      </w:r>
-      <w:proofErr w:type="spellEnd"/>
-      <w:r>
-        <w:rPr>
-          <w:i/>
-          <w:iCs/>
-          <w:lang w:bidi="hi-IN"/>
-        </w:rPr>
-        <w:t xml:space="preserve"> Section A</w:t>
+        <w:t>Acta Crystallographica Section A</w:t>
       </w:r>
       <w:r>
         <w:rPr>
@@ -27781,35 +27857,7 @@
           <w:lang w:bidi="hi-IN"/>
         </w:rPr>
         <w:tab/>
-        <w:t xml:space="preserve">Eastman, P.; Swails, J.; </w:t>
-      </w:r>
-      <w:proofErr w:type="spellStart"/>
-      <w:r>
-        <w:rPr>
-          <w:lang w:bidi="hi-IN"/>
-        </w:rPr>
-        <w:t>Chodera</w:t>
-      </w:r>
-      <w:proofErr w:type="spellEnd"/>
-      <w:r>
-        <w:rPr>
-          <w:lang w:bidi="hi-IN"/>
-        </w:rPr>
-        <w:t xml:space="preserve">, J. D.; McGibbon, R. T.; Zhao, Y.; Beauchamp, K. A.; Wang, L.-P.; Simmonett, A. C.; Harrigan, M. P.; Stern, C. D.; Wiewiora, R. P.; Brooks, B. R.; Pande, V. S. </w:t>
-      </w:r>
-      <w:proofErr w:type="spellStart"/>
-      <w:r>
-        <w:rPr>
-          <w:lang w:bidi="hi-IN"/>
-        </w:rPr>
-        <w:t>OpenMM</w:t>
-      </w:r>
-      <w:proofErr w:type="spellEnd"/>
-      <w:r>
-        <w:rPr>
-          <w:lang w:bidi="hi-IN"/>
-        </w:rPr>
-        <w:t xml:space="preserve"> 7: Rapid Development of High Performance Algorithms for Molecular Dynamics. </w:t>
+        <w:t xml:space="preserve">Eastman, P.; Swails, J.; Chodera, J. D.; McGibbon, R. T.; Zhao, Y.; Beauchamp, K. A.; Wang, L.-P.; Simmonett, A. C.; Harrigan, M. P.; Stern, C. D.; Wiewiora, R. P.; Brooks, B. R.; Pande, V. S. OpenMM 7: Rapid Development of High Performance Algorithms for Molecular Dynamics. </w:t>
       </w:r>
       <w:r>
         <w:rPr>
@@ -27872,21 +27920,7 @@
           <w:lang w:bidi="hi-IN"/>
         </w:rPr>
         <w:tab/>
-        <w:t xml:space="preserve">Maier, J. A.; Martinez, C.; </w:t>
-      </w:r>
-      <w:proofErr w:type="spellStart"/>
-      <w:r>
-        <w:rPr>
-          <w:lang w:bidi="hi-IN"/>
-        </w:rPr>
-        <w:t>Kasavajhala</w:t>
-      </w:r>
-      <w:proofErr w:type="spellEnd"/>
-      <w:r>
-        <w:rPr>
-          <w:lang w:bidi="hi-IN"/>
-        </w:rPr>
-        <w:t xml:space="preserve">, K.; Wickstrom, L.; Hauser, K. E.; Simmerling, C. ff14SB: Improving the Accuracy of Protein Side Chain and Backbone Parameters from ff99SB. </w:t>
+        <w:t xml:space="preserve">Maier, J. A.; Martinez, C.; Kasavajhala, K.; Wickstrom, L.; Hauser, K. E.; Simmerling, C. ff14SB: Improving the Accuracy of Protein Side Chain and Backbone Parameters from ff99SB. </w:t>
       </w:r>
       <w:r>
         <w:rPr>
@@ -27894,25 +27928,7 @@
           <w:iCs/>
           <w:lang w:bidi="hi-IN"/>
         </w:rPr>
-        <w:t xml:space="preserve">J. Chem. Theory </w:t>
-      </w:r>
-      <w:proofErr w:type="spellStart"/>
-      <w:r>
-        <w:rPr>
-          <w:i/>
-          <w:iCs/>
-          <w:lang w:bidi="hi-IN"/>
-        </w:rPr>
-        <w:t>Comput</w:t>
-      </w:r>
-      <w:proofErr w:type="spellEnd"/>
-      <w:r>
-        <w:rPr>
-          <w:i/>
-          <w:iCs/>
-          <w:lang w:bidi="hi-IN"/>
-        </w:rPr>
-        <w:t>.</w:t>
+        <w:t>J. Chem. Theory Comput.</w:t>
       </w:r>
       <w:r>
         <w:rPr>
@@ -28030,35 +28046,7 @@
           <w:lang w:bidi="hi-IN"/>
         </w:rPr>
         <w:tab/>
-        <w:t xml:space="preserve">Mobley, D. L.; Bannan, C. C.; Rizzi, A.; Bayly, C. I.; </w:t>
-      </w:r>
-      <w:proofErr w:type="spellStart"/>
-      <w:r>
-        <w:rPr>
-          <w:lang w:bidi="hi-IN"/>
-        </w:rPr>
-        <w:t>Chodera</w:t>
-      </w:r>
-      <w:proofErr w:type="spellEnd"/>
-      <w:r>
-        <w:rPr>
-          <w:lang w:bidi="hi-IN"/>
-        </w:rPr>
-        <w:t xml:space="preserve">, J. D.; Lim, V. T.; Lim, N. M.; Beauchamp, K. A.; </w:t>
-      </w:r>
-      <w:proofErr w:type="spellStart"/>
-      <w:r>
-        <w:rPr>
-          <w:lang w:bidi="hi-IN"/>
-        </w:rPr>
-        <w:t>Slochower</w:t>
-      </w:r>
-      <w:proofErr w:type="spellEnd"/>
-      <w:r>
-        <w:rPr>
-          <w:lang w:bidi="hi-IN"/>
-        </w:rPr>
-        <w:t xml:space="preserve">, D. R.; Shirts, M. R.; Gilson, M. K.; Eastman, P. K. Escaping Atom Types in Force Fields Using Direct Chemical Perception. </w:t>
+        <w:t xml:space="preserve">Mobley, D. L.; Bannan, C. C.; Rizzi, A.; Bayly, C. I.; Chodera, J. D.; Lim, V. T.; Lim, N. M.; Beauchamp, K. A.; Slochower, D. R.; Shirts, M. R.; Gilson, M. K.; Eastman, P. K. Escaping Atom Types in Force Fields Using Direct Chemical Perception. </w:t>
       </w:r>
       <w:r>
         <w:rPr>
@@ -28066,25 +28054,7 @@
           <w:iCs/>
           <w:lang w:bidi="hi-IN"/>
         </w:rPr>
-        <w:t xml:space="preserve">J. Chem. Theory </w:t>
-      </w:r>
-      <w:proofErr w:type="spellStart"/>
-      <w:r>
-        <w:rPr>
-          <w:i/>
-          <w:iCs/>
-          <w:lang w:bidi="hi-IN"/>
-        </w:rPr>
-        <w:t>Comput</w:t>
-      </w:r>
-      <w:proofErr w:type="spellEnd"/>
-      <w:r>
-        <w:rPr>
-          <w:i/>
-          <w:iCs/>
-          <w:lang w:bidi="hi-IN"/>
-        </w:rPr>
-        <w:t>.</w:t>
+        <w:t>J. Chem. Theory Comput.</w:t>
       </w:r>
       <w:r>
         <w:rPr>
@@ -28202,14 +28172,7 @@
           <w:lang w:bidi="hi-IN"/>
         </w:rPr>
         <w:tab/>
-        <w:t xml:space="preserve">Darden, T.; York, D.; Pedersen, L. Particle Mesh Ewald: An </w:t>
-      </w:r>
-      <w:proofErr w:type="spellStart"/>
-      <w:r>
-        <w:rPr>
-          <w:lang w:bidi="hi-IN"/>
-        </w:rPr>
-        <w:t>N</w:t>
+        <w:t>Darden, T.; York, D.; Pedersen, L. Particle Mesh Ewald: An N</w:t>
       </w:r>
       <w:r>
         <w:rPr>
@@ -28222,14 +28185,7 @@
         <w:rPr>
           <w:lang w:bidi="hi-IN"/>
         </w:rPr>
-        <w:t>log</w:t>
-      </w:r>
-      <w:proofErr w:type="spellEnd"/>
-      <w:r>
-        <w:rPr>
-          <w:lang w:bidi="hi-IN"/>
-        </w:rPr>
-        <w:t xml:space="preserve">(N) Method for Ewald Sums in Large Systems. </w:t>
+        <w:t xml:space="preserve">log(N) Method for Ewald Sums in Large Systems. </w:t>
       </w:r>
       <w:r>
         <w:rPr>
@@ -28292,21 +28248,7 @@
           <w:lang w:bidi="hi-IN"/>
         </w:rPr>
         <w:tab/>
-        <w:t xml:space="preserve">Michaud-Agrawal, N.; Denning, E. J.; Woolf, T. B.; Beckstein, O. </w:t>
-      </w:r>
-      <w:proofErr w:type="spellStart"/>
-      <w:r>
-        <w:rPr>
-          <w:lang w:bidi="hi-IN"/>
-        </w:rPr>
-        <w:t>MDAnalysis</w:t>
-      </w:r>
-      <w:proofErr w:type="spellEnd"/>
-      <w:r>
-        <w:rPr>
-          <w:lang w:bidi="hi-IN"/>
-        </w:rPr>
-        <w:t xml:space="preserve">: A Toolkit for the Analysis of Molecular Dynamics Simulations. </w:t>
+        <w:t xml:space="preserve">Michaud-Agrawal, N.; Denning, E. J.; Woolf, T. B.; Beckstein, O. MDAnalysis: A Toolkit for the Analysis of Molecular Dynamics Simulations. </w:t>
       </w:r>
       <w:r>
         <w:rPr>
@@ -28369,21 +28311,7 @@
           <w:lang w:bidi="hi-IN"/>
         </w:rPr>
         <w:tab/>
-        <w:t xml:space="preserve">McGibbon, R. T.; Beauchamp, K. A.; Harrigan, M. P.; Klein, C.; Swails, J. M.; Hernández, C. X.; Schwantes, C. R.; Wang, L.-P.; Lane, T. J.; Pande, V. S. </w:t>
-      </w:r>
-      <w:proofErr w:type="spellStart"/>
-      <w:r>
-        <w:rPr>
-          <w:lang w:bidi="hi-IN"/>
-        </w:rPr>
-        <w:t>MDTraj</w:t>
-      </w:r>
-      <w:proofErr w:type="spellEnd"/>
-      <w:r>
-        <w:rPr>
-          <w:lang w:bidi="hi-IN"/>
-        </w:rPr>
-        <w:t xml:space="preserve">: A Modern Open Library for the Analysis of Molecular Dynamics Trajectories. </w:t>
+        <w:t xml:space="preserve">McGibbon, R. T.; Beauchamp, K. A.; Harrigan, M. P.; Klein, C.; Swails, J. M.; Hernández, C. X.; Schwantes, C. R.; Wang, L.-P.; Lane, T. J.; Pande, V. S. MDTraj: A Modern Open Library for the Analysis of Molecular Dynamics Trajectories. </w:t>
       </w:r>
       <w:r>
         <w:rPr>
@@ -28439,6 +28367,7 @@
         <w:rPr>
           <w:lang w:bidi="hi-IN"/>
         </w:rPr>
+        <w:lastRenderedPageBreak/>
         <w:t>(44)</w:t>
       </w:r>
       <w:r>
@@ -28446,20 +28375,7 @@
           <w:lang w:bidi="hi-IN"/>
         </w:rPr>
         <w:tab/>
-      </w:r>
-      <w:proofErr w:type="spellStart"/>
-      <w:r>
-        <w:rPr>
-          <w:lang w:bidi="hi-IN"/>
-        </w:rPr>
-        <w:t>Massova</w:t>
-      </w:r>
-      <w:proofErr w:type="spellEnd"/>
-      <w:r>
-        <w:rPr>
-          <w:lang w:bidi="hi-IN"/>
-        </w:rPr>
-        <w:t xml:space="preserve">, I.; Kollman, P. A. Combined Molecular Mechanical and Continuum Solvent Approach (MM-PBSA/GBSA) to Predict Ligand Binding. </w:t>
+        <w:t xml:space="preserve">Massova, I.; Kollman, P. A. Combined Molecular Mechanical and Continuum Solvent Approach (MM-PBSA/GBSA) to Predict Ligand Binding. </w:t>
       </w:r>
       <w:r>
         <w:rPr>
@@ -28515,7 +28431,6 @@
         <w:rPr>
           <w:lang w:bidi="hi-IN"/>
         </w:rPr>
-        <w:lastRenderedPageBreak/>
         <w:t>(45)</w:t>
       </w:r>
       <w:r>
@@ -28523,20 +28438,7 @@
           <w:lang w:bidi="hi-IN"/>
         </w:rPr>
         <w:tab/>
-      </w:r>
-      <w:proofErr w:type="spellStart"/>
-      <w:r>
-        <w:rPr>
-          <w:lang w:bidi="hi-IN"/>
-        </w:rPr>
-        <w:t>Onufriev</w:t>
-      </w:r>
-      <w:proofErr w:type="spellEnd"/>
-      <w:r>
-        <w:rPr>
-          <w:lang w:bidi="hi-IN"/>
-        </w:rPr>
-        <w:t xml:space="preserve">, A.; Bashford, D.; Case, D. A. Exploring Protein Native States and Large-Scale Conformational Changes with a Modified Generalized Born Model. </w:t>
+        <w:t xml:space="preserve">Onufriev, A.; Bashford, D.; Case, D. A. Exploring Protein Native States and Large-Scale Conformational Changes with a Modified Generalized Born Model. </w:t>
       </w:r>
       <w:r>
         <w:rPr>
@@ -28662,35 +28564,7 @@
           <w:lang w:bidi="hi-IN"/>
         </w:rPr>
         <w:tab/>
-        <w:t xml:space="preserve">Rastelli, G.; Rio, A. D.; </w:t>
-      </w:r>
-      <w:proofErr w:type="spellStart"/>
-      <w:r>
-        <w:rPr>
-          <w:lang w:bidi="hi-IN"/>
-        </w:rPr>
-        <w:t>Degliesposti</w:t>
-      </w:r>
-      <w:proofErr w:type="spellEnd"/>
-      <w:r>
-        <w:rPr>
-          <w:lang w:bidi="hi-IN"/>
-        </w:rPr>
-        <w:t xml:space="preserve">, G.; </w:t>
-      </w:r>
-      <w:proofErr w:type="spellStart"/>
-      <w:r>
-        <w:rPr>
-          <w:lang w:bidi="hi-IN"/>
-        </w:rPr>
-        <w:t>Sgobba</w:t>
-      </w:r>
-      <w:proofErr w:type="spellEnd"/>
-      <w:r>
-        <w:rPr>
-          <w:lang w:bidi="hi-IN"/>
-        </w:rPr>
-        <w:t xml:space="preserve">, M. Fast and Accurate Predictions of Binding Free Energies Using MM-PBSA and MM-GBSA. </w:t>
+        <w:t xml:space="preserve">Rastelli, G.; Rio, A. D.; Degliesposti, G.; Sgobba, M. Fast and Accurate Predictions of Binding Free Energies Using MM-PBSA and MM-GBSA. </w:t>
       </w:r>
       <w:r>
         <w:rPr>
@@ -28753,35 +28627,7 @@
           <w:lang w:bidi="hi-IN"/>
         </w:rPr>
         <w:tab/>
-        <w:t xml:space="preserve">Weis, A.; </w:t>
-      </w:r>
-      <w:proofErr w:type="spellStart"/>
-      <w:r>
-        <w:rPr>
-          <w:lang w:bidi="hi-IN"/>
-        </w:rPr>
-        <w:t>Katebzadeh</w:t>
-      </w:r>
-      <w:proofErr w:type="spellEnd"/>
-      <w:r>
-        <w:rPr>
-          <w:lang w:bidi="hi-IN"/>
-        </w:rPr>
-        <w:t xml:space="preserve">, K.; </w:t>
-      </w:r>
-      <w:proofErr w:type="spellStart"/>
-      <w:r>
-        <w:rPr>
-          <w:lang w:bidi="hi-IN"/>
-        </w:rPr>
-        <w:t>Söderhjelm</w:t>
-      </w:r>
-      <w:proofErr w:type="spellEnd"/>
-      <w:r>
-        <w:rPr>
-          <w:lang w:bidi="hi-IN"/>
-        </w:rPr>
-        <w:t xml:space="preserve">, P.; Nilsson, I.; Ryde, U. Ligand Affinities Predicted with the MM/PBSA Method:  Dependence on the Simulation Method and the Force Field. </w:t>
+        <w:t xml:space="preserve">Weis, A.; Katebzadeh, K.; Söderhjelm, P.; Nilsson, I.; Ryde, U. Ligand Affinities Predicted with the MM/PBSA Method:  Dependence on the Simulation Method and the Force Field. </w:t>
       </w:r>
       <w:r>
         <w:rPr>
@@ -28844,48 +28690,7 @@
           <w:lang w:bidi="hi-IN"/>
         </w:rPr>
         <w:tab/>
-      </w:r>
-      <w:proofErr w:type="spellStart"/>
-      <w:r>
-        <w:rPr>
-          <w:lang w:bidi="hi-IN"/>
-        </w:rPr>
-        <w:t>Gapsys</w:t>
-      </w:r>
-      <w:proofErr w:type="spellEnd"/>
-      <w:r>
-        <w:rPr>
-          <w:lang w:bidi="hi-IN"/>
-        </w:rPr>
-        <w:t xml:space="preserve">, V.; </w:t>
-      </w:r>
-      <w:proofErr w:type="spellStart"/>
-      <w:r>
-        <w:rPr>
-          <w:lang w:bidi="hi-IN"/>
-        </w:rPr>
-        <w:t>Michielssens</w:t>
-      </w:r>
-      <w:proofErr w:type="spellEnd"/>
-      <w:r>
-        <w:rPr>
-          <w:lang w:bidi="hi-IN"/>
-        </w:rPr>
-        <w:t xml:space="preserve">, S.; Seeliger, D.; de Groot, B. L. </w:t>
-      </w:r>
-      <w:proofErr w:type="spellStart"/>
-      <w:r>
-        <w:rPr>
-          <w:lang w:bidi="hi-IN"/>
-        </w:rPr>
-        <w:t>Pmx</w:t>
-      </w:r>
-      <w:proofErr w:type="spellEnd"/>
-      <w:r>
-        <w:rPr>
-          <w:lang w:bidi="hi-IN"/>
-        </w:rPr>
-        <w:t xml:space="preserve">: Automated Protein Structure and Topology Generation for Alchemical Perturbations. </w:t>
+        <w:t xml:space="preserve">Gapsys, V.; Michielssens, S.; Seeliger, D.; de Groot, B. L. Pmx: Automated Protein Structure and Topology Generation for Alchemical Perturbations. </w:t>
       </w:r>
       <w:r>
         <w:rPr>
@@ -28948,23 +28753,8 @@
           <w:lang w:bidi="hi-IN"/>
         </w:rPr>
         <w:tab/>
-        <w:t xml:space="preserve">Abraham, M. J.; </w:t>
-      </w:r>
-      <w:proofErr w:type="spellStart"/>
-      <w:r>
-        <w:rPr>
-          <w:lang w:bidi="hi-IN"/>
-        </w:rPr>
-        <w:t>Murtola</w:t>
-      </w:r>
-      <w:proofErr w:type="spellEnd"/>
-      <w:r>
-        <w:rPr>
-          <w:lang w:bidi="hi-IN"/>
-        </w:rPr>
-        <w:t xml:space="preserve">, T.; Schulz, R.; Páll, S.; Smith, J. C.; Hess, B.; Lindahl, E. GROMACS: High Performance Molecular Simulations through Multi-Level Parallelism from Laptops to Supercomputers. </w:t>
-      </w:r>
-      <w:proofErr w:type="spellStart"/>
+        <w:t xml:space="preserve">Abraham, M. J.; Murtola, T.; Schulz, R.; Páll, S.; Smith, J. C.; Hess, B.; Lindahl, E. GROMACS: High Performance Molecular Simulations through Multi-Level Parallelism from Laptops to Supercomputers. </w:t>
+      </w:r>
       <w:r>
         <w:rPr>
           <w:i/>
@@ -28973,7 +28763,6 @@
         </w:rPr>
         <w:t>SoftwareX</w:t>
       </w:r>
-      <w:proofErr w:type="spellEnd"/>
       <w:r>
         <w:rPr>
           <w:lang w:bidi="hi-IN"/>
@@ -29027,20 +28816,7 @@
           <w:lang w:bidi="hi-IN"/>
         </w:rPr>
         <w:tab/>
-      </w:r>
-      <w:proofErr w:type="spellStart"/>
-      <w:r>
-        <w:rPr>
-          <w:lang w:bidi="hi-IN"/>
-        </w:rPr>
-        <w:t>Gapsys</w:t>
-      </w:r>
-      <w:proofErr w:type="spellEnd"/>
-      <w:r>
-        <w:rPr>
-          <w:lang w:bidi="hi-IN"/>
-        </w:rPr>
-        <w:t xml:space="preserve">, V.; Seeliger, D.; de Groot, B. L. New Soft-Core Potential Function for Molecular Dynamics Based Alchemical Free Energy Calculations. </w:t>
+        <w:t xml:space="preserve">Gapsys, V.; Seeliger, D.; de Groot, B. L. New Soft-Core Potential Function for Molecular Dynamics Based Alchemical Free Energy Calculations. </w:t>
       </w:r>
       <w:r>
         <w:rPr>
@@ -29048,25 +28824,7 @@
           <w:iCs/>
           <w:lang w:bidi="hi-IN"/>
         </w:rPr>
-        <w:t xml:space="preserve">J. Chem. Theory </w:t>
-      </w:r>
-      <w:proofErr w:type="spellStart"/>
-      <w:r>
-        <w:rPr>
-          <w:i/>
-          <w:iCs/>
-          <w:lang w:bidi="hi-IN"/>
-        </w:rPr>
-        <w:t>Comput</w:t>
-      </w:r>
-      <w:proofErr w:type="spellEnd"/>
-      <w:r>
-        <w:rPr>
-          <w:i/>
-          <w:iCs/>
-          <w:lang w:bidi="hi-IN"/>
-        </w:rPr>
-        <w:t>.</w:t>
+        <w:t>J. Chem. Theory Comput.</w:t>
       </w:r>
       <w:r>
         <w:rPr>
@@ -29310,21 +29068,7 @@
           <w:lang w:bidi="hi-IN"/>
         </w:rPr>
         <w:tab/>
-        <w:t xml:space="preserve">Rocklin, G. J.; Mobley, D. L.; Dill, K. A.; </w:t>
-      </w:r>
-      <w:proofErr w:type="spellStart"/>
-      <w:r>
-        <w:rPr>
-          <w:lang w:bidi="hi-IN"/>
-        </w:rPr>
-        <w:t>Hünenberger</w:t>
-      </w:r>
-      <w:proofErr w:type="spellEnd"/>
-      <w:r>
-        <w:rPr>
-          <w:lang w:bidi="hi-IN"/>
-        </w:rPr>
-        <w:t xml:space="preserve">, P. H. Calculating the Binding Free Energies of Charged Species Based on Explicit-Solvent Simulations Employing Lattice-Sum Methods: An Accurate Correction Scheme for Electrostatic Finite-Size Effects. </w:t>
+        <w:t xml:space="preserve">Rocklin, G. J.; Mobley, D. L.; Dill, K. A.; Hünenberger, P. H. Calculating the Binding Free Energies of Charged Species Based on Explicit-Solvent Simulations Employing Lattice-Sum Methods: An Accurate Correction Scheme for Electrostatic Finite-Size Effects. </w:t>
       </w:r>
       <w:r>
         <w:rPr>
@@ -29380,6 +29124,7 @@
         <w:rPr>
           <w:lang w:bidi="hi-IN"/>
         </w:rPr>
+        <w:lastRenderedPageBreak/>
         <w:t>(56)</w:t>
       </w:r>
       <w:r>
@@ -29450,42 +29195,7 @@
           <w:lang w:bidi="hi-IN"/>
         </w:rPr>
         <w:tab/>
-        <w:t xml:space="preserve">Orkin, C.; Kuritzkes, D. R.; </w:t>
-      </w:r>
-      <w:proofErr w:type="spellStart"/>
-      <w:r>
-        <w:rPr>
-          <w:lang w:bidi="hi-IN"/>
-        </w:rPr>
-        <w:t>Katlama</w:t>
-      </w:r>
-      <w:proofErr w:type="spellEnd"/>
-      <w:r>
-        <w:rPr>
-          <w:lang w:bidi="hi-IN"/>
-        </w:rPr>
-        <w:t xml:space="preserve">, C.; Su, F.-H.; Plank, R. M.; </w:t>
-      </w:r>
-      <w:proofErr w:type="spellStart"/>
-      <w:r>
-        <w:rPr>
-          <w:lang w:bidi="hi-IN"/>
-        </w:rPr>
-        <w:t>Lahoulou</w:t>
-      </w:r>
-      <w:proofErr w:type="spellEnd"/>
-      <w:r>
-        <w:rPr>
-          <w:lang w:bidi="hi-IN"/>
-        </w:rPr>
-        <w:t>, R.; Asante-Appiah, E. Doravirine Resistance Patterns Identified Through Week 192 in the DRIVE-</w:t>
-      </w:r>
-      <w:r>
-        <w:rPr>
-          <w:lang w:bidi="hi-IN"/>
-        </w:rPr>
-        <w:lastRenderedPageBreak/>
-        <w:t xml:space="preserve">FORWARD and DRIVE-AHEAD Phase 3 Clinical Trials. </w:t>
+        <w:t xml:space="preserve">Orkin, C.; Kuritzkes, D. R.; Katlama, C.; Su, F.-H.; Plank, R. M.; Lahoulou, R.; Asante-Appiah, E. Doravirine Resistance Patterns Identified Through Week 192 in the DRIVE-FORWARD and DRIVE-AHEAD Phase 3 Clinical Trials. </w:t>
       </w:r>
       <w:r>
         <w:rPr>
@@ -29493,25 +29203,7 @@
           <w:iCs/>
           <w:lang w:bidi="hi-IN"/>
         </w:rPr>
-        <w:t xml:space="preserve">J </w:t>
-      </w:r>
-      <w:proofErr w:type="spellStart"/>
-      <w:r>
-        <w:rPr>
-          <w:i/>
-          <w:iCs/>
-          <w:lang w:bidi="hi-IN"/>
-        </w:rPr>
-        <w:t>Acquir</w:t>
-      </w:r>
-      <w:proofErr w:type="spellEnd"/>
-      <w:r>
-        <w:rPr>
-          <w:i/>
-          <w:iCs/>
-          <w:lang w:bidi="hi-IN"/>
-        </w:rPr>
-        <w:t xml:space="preserve"> Immune Defic Syndr</w:t>
+        <w:t>J Acquir Immune Defic Syndr</w:t>
       </w:r>
       <w:r>
         <w:rPr>
@@ -29833,25 +29525,7 @@
           <w:iCs/>
           <w:lang w:bidi="hi-IN"/>
         </w:rPr>
-        <w:t xml:space="preserve">J. Chem. Theory </w:t>
-      </w:r>
-      <w:proofErr w:type="spellStart"/>
-      <w:r>
-        <w:rPr>
-          <w:i/>
-          <w:iCs/>
-          <w:lang w:bidi="hi-IN"/>
-        </w:rPr>
-        <w:t>Comput</w:t>
-      </w:r>
-      <w:proofErr w:type="spellEnd"/>
-      <w:r>
-        <w:rPr>
-          <w:i/>
-          <w:iCs/>
-          <w:lang w:bidi="hi-IN"/>
-        </w:rPr>
-        <w:t>.</w:t>
+        <w:t>J. Chem. Theory Comput.</w:t>
       </w:r>
       <w:r>
         <w:rPr>
@@ -29906,49 +29580,7 @@
           <w:lang w:bidi="hi-IN"/>
         </w:rPr>
         <w:tab/>
-        <w:t xml:space="preserve">Ripoll, D. R.; </w:t>
-      </w:r>
-      <w:proofErr w:type="spellStart"/>
-      <w:r>
-        <w:rPr>
-          <w:lang w:bidi="hi-IN"/>
-        </w:rPr>
-        <w:t>Khavrutskii</w:t>
-      </w:r>
-      <w:proofErr w:type="spellEnd"/>
-      <w:r>
-        <w:rPr>
-          <w:lang w:bidi="hi-IN"/>
-        </w:rPr>
-        <w:t xml:space="preserve">, I. V.; Chaudhury, S.; Liu, J.; </w:t>
-      </w:r>
-      <w:proofErr w:type="spellStart"/>
-      <w:r>
-        <w:rPr>
-          <w:lang w:bidi="hi-IN"/>
-        </w:rPr>
-        <w:t>Kuschner</w:t>
-      </w:r>
-      <w:proofErr w:type="spellEnd"/>
-      <w:r>
-        <w:rPr>
-          <w:lang w:bidi="hi-IN"/>
-        </w:rPr>
-        <w:t xml:space="preserve">, R. A.; </w:t>
-      </w:r>
-      <w:proofErr w:type="spellStart"/>
-      <w:r>
-        <w:rPr>
-          <w:lang w:bidi="hi-IN"/>
-        </w:rPr>
-        <w:t>Wallqvist</w:t>
-      </w:r>
-      <w:proofErr w:type="spellEnd"/>
-      <w:r>
-        <w:rPr>
-          <w:lang w:bidi="hi-IN"/>
-        </w:rPr>
-        <w:t xml:space="preserve">, A.; Reifman, J. Quantitative Predictions of Binding Free Energy Changes in Drug-Resistant Influenza Neuraminidase. </w:t>
+        <w:t xml:space="preserve">Ripoll, D. R.; Khavrutskii, I. V.; Chaudhury, S.; Liu, J.; Kuschner, R. A.; Wallqvist, A.; Reifman, J. Quantitative Predictions of Binding Free Energy Changes in Drug-Resistant Influenza Neuraminidase. </w:t>
       </w:r>
       <w:r>
         <w:rPr>
@@ -30011,35 +29643,7 @@
           <w:lang w:bidi="hi-IN"/>
         </w:rPr>
         <w:tab/>
-        <w:t xml:space="preserve">Havranek, B.; Demissie, R.; Lee, H.; Lan, S.; Zhang, H.; </w:t>
-      </w:r>
-      <w:proofErr w:type="spellStart"/>
-      <w:r>
-        <w:rPr>
-          <w:lang w:bidi="hi-IN"/>
-        </w:rPr>
-        <w:t>Sarafianos</w:t>
-      </w:r>
-      <w:proofErr w:type="spellEnd"/>
-      <w:r>
-        <w:rPr>
-          <w:lang w:bidi="hi-IN"/>
-        </w:rPr>
-        <w:t xml:space="preserve">, S.; </w:t>
-      </w:r>
-      <w:proofErr w:type="spellStart"/>
-      <w:r>
-        <w:rPr>
-          <w:lang w:bidi="hi-IN"/>
-        </w:rPr>
-        <w:t>Ayitou</w:t>
-      </w:r>
-      <w:proofErr w:type="spellEnd"/>
-      <w:r>
-        <w:rPr>
-          <w:lang w:bidi="hi-IN"/>
-        </w:rPr>
-        <w:t xml:space="preserve">, A. J.-L.; Islam, S. M. Discovery of Nirmatrelvir Resistance Mutations in SARS-CoV‑2 3CLpro: A Computational-Experimental Approach. </w:t>
+        <w:t xml:space="preserve">Havranek, B.; Demissie, R.; Lee, H.; Lan, S.; Zhang, H.; Sarafianos, S.; Ayitou, A. J.-L.; Islam, S. M. Discovery of Nirmatrelvir Resistance Mutations in SARS-CoV‑2 3CLpro: A Computational-Experimental Approach. </w:t>
       </w:r>
       <w:r>
         <w:rPr>
@@ -30095,6 +29699,7 @@
         <w:rPr>
           <w:lang w:bidi="hi-IN"/>
         </w:rPr>
+        <w:lastRenderedPageBreak/>
         <w:t>(66)</w:t>
       </w:r>
       <w:r>
@@ -30110,25 +29715,7 @@
           <w:iCs/>
           <w:lang w:bidi="hi-IN"/>
         </w:rPr>
-        <w:t xml:space="preserve">J. Chem. Theory </w:t>
-      </w:r>
-      <w:proofErr w:type="spellStart"/>
-      <w:r>
-        <w:rPr>
-          <w:i/>
-          <w:iCs/>
-          <w:lang w:bidi="hi-IN"/>
-        </w:rPr>
-        <w:t>Comput</w:t>
-      </w:r>
-      <w:proofErr w:type="spellEnd"/>
-      <w:r>
-        <w:rPr>
-          <w:i/>
-          <w:iCs/>
-          <w:lang w:bidi="hi-IN"/>
-        </w:rPr>
-        <w:t>.</w:t>
+        <w:t>J. Chem. Theory Comput.</w:t>
       </w:r>
       <w:r>
         <w:rPr>
@@ -30183,41 +29770,7 @@
           <w:lang w:bidi="hi-IN"/>
         </w:rPr>
         <w:tab/>
-      </w:r>
-      <w:proofErr w:type="spellStart"/>
-      <w:r>
-        <w:rPr>
-          <w:lang w:bidi="hi-IN"/>
-        </w:rPr>
-        <w:t>Bastys</w:t>
-      </w:r>
-      <w:proofErr w:type="spellEnd"/>
-      <w:r>
-        <w:rPr>
-          <w:lang w:bidi="hi-IN"/>
-        </w:rPr>
-        <w:t xml:space="preserve">, T.; </w:t>
-      </w:r>
-      <w:proofErr w:type="spellStart"/>
-      <w:r>
-        <w:rPr>
-          <w:lang w:bidi="hi-IN"/>
-        </w:rPr>
-        <w:t>Gapsys</w:t>
-      </w:r>
-      <w:proofErr w:type="spellEnd"/>
-      <w:r>
-        <w:rPr>
-          <w:lang w:bidi="hi-IN"/>
-        </w:rPr>
-        <w:t xml:space="preserve">, V.; Doncheva, N. T.; Kaiser, R.; de Groot, B. L.; Kalinina, O. V. Consistent Prediction of Mutation Effect on Drug Binding in HIV‑1 Protease Using </w:t>
-      </w:r>
-      <w:r>
-        <w:rPr>
-          <w:lang w:bidi="hi-IN"/>
-        </w:rPr>
-        <w:lastRenderedPageBreak/>
-        <w:t xml:space="preserve">Alchemical Calculations. </w:t>
+        <w:t xml:space="preserve">Bastys, T.; Gapsys, V.; Doncheva, N. T.; Kaiser, R.; de Groot, B. L.; Kalinina, O. V. Consistent Prediction of Mutation Effect on Drug Binding in HIV‑1 Protease Using Alchemical Calculations. </w:t>
       </w:r>
       <w:r>
         <w:rPr>
@@ -30225,25 +29778,7 @@
           <w:iCs/>
           <w:lang w:bidi="hi-IN"/>
         </w:rPr>
-        <w:t xml:space="preserve">J. Chem. Theory </w:t>
-      </w:r>
-      <w:proofErr w:type="spellStart"/>
-      <w:r>
-        <w:rPr>
-          <w:i/>
-          <w:iCs/>
-          <w:lang w:bidi="hi-IN"/>
-        </w:rPr>
-        <w:t>Comput</w:t>
-      </w:r>
-      <w:proofErr w:type="spellEnd"/>
-      <w:r>
-        <w:rPr>
-          <w:i/>
-          <w:iCs/>
-          <w:lang w:bidi="hi-IN"/>
-        </w:rPr>
-        <w:t>.</w:t>
+        <w:t>J. Chem. Theory Comput.</w:t>
       </w:r>
       <w:r>
         <w:rPr>
@@ -30298,48 +29833,7 @@
           <w:lang w:bidi="hi-IN"/>
         </w:rPr>
         <w:tab/>
-      </w:r>
-      <w:proofErr w:type="spellStart"/>
-      <w:r>
-        <w:rPr>
-          <w:lang w:bidi="hi-IN"/>
-        </w:rPr>
-        <w:t>Bastys</w:t>
-      </w:r>
-      <w:proofErr w:type="spellEnd"/>
-      <w:r>
-        <w:rPr>
-          <w:lang w:bidi="hi-IN"/>
-        </w:rPr>
-        <w:t xml:space="preserve">, T.; </w:t>
-      </w:r>
-      <w:proofErr w:type="spellStart"/>
-      <w:r>
-        <w:rPr>
-          <w:lang w:bidi="hi-IN"/>
-        </w:rPr>
-        <w:t>Gapsys</w:t>
-      </w:r>
-      <w:proofErr w:type="spellEnd"/>
-      <w:r>
-        <w:rPr>
-          <w:lang w:bidi="hi-IN"/>
-        </w:rPr>
-        <w:t xml:space="preserve">, V.; Walter, H.; Heger, E.; Doncheva, N. T.; Kaiser, R.; de Groot, B. L.; Kalinina, O. V. Non-Active Site Mutants of HIV-1 Protease Influence Resistance and </w:t>
-      </w:r>
-      <w:proofErr w:type="spellStart"/>
-      <w:r>
-        <w:rPr>
-          <w:lang w:bidi="hi-IN"/>
-        </w:rPr>
-        <w:t>Sensitisation</w:t>
-      </w:r>
-      <w:proofErr w:type="spellEnd"/>
-      <w:r>
-        <w:rPr>
-          <w:lang w:bidi="hi-IN"/>
-        </w:rPr>
-        <w:t xml:space="preserve"> towards Protease Inhibitors. </w:t>
+        <w:t xml:space="preserve">Bastys, T.; Gapsys, V.; Walter, H.; Heger, E.; Doncheva, N. T.; Kaiser, R.; de Groot, B. L.; Kalinina, O. V. Non-Active Site Mutants of HIV-1 Protease Influence Resistance and Sensitisation towards Protease Inhibitors. </w:t>
       </w:r>
       <w:r>
         <w:rPr>
@@ -30402,21 +29896,7 @@
           <w:lang w:bidi="hi-IN"/>
         </w:rPr>
         <w:tab/>
-        <w:t xml:space="preserve">Sun, Q.; Levy, R. M.; Kirby, K. A.; Wang, Z.; </w:t>
-      </w:r>
-      <w:proofErr w:type="spellStart"/>
-      <w:r>
-        <w:rPr>
-          <w:lang w:bidi="hi-IN"/>
-        </w:rPr>
-        <w:t>Sarafianos</w:t>
-      </w:r>
-      <w:proofErr w:type="spellEnd"/>
-      <w:r>
-        <w:rPr>
-          <w:lang w:bidi="hi-IN"/>
-        </w:rPr>
-        <w:t xml:space="preserve">, S. G.; Deng, N. Molecular Dynamics Free Energy Simulations Reveal the Mechanism for the Antiviral Resistance of the M66I HIV-1 Capsid Mutation. </w:t>
+        <w:t xml:space="preserve">Sun, Q.; Levy, R. M.; Kirby, K. A.; Wang, Z.; Sarafianos, S. G.; Deng, N. Molecular Dynamics Free Energy Simulations Reveal the Mechanism for the Antiviral Resistance of the M66I HIV-1 Capsid Mutation. </w:t>
       </w:r>
       <w:r>
         <w:rPr>
@@ -30479,35 +29959,7 @@
           <w:lang w:bidi="hi-IN"/>
         </w:rPr>
         <w:tab/>
-        <w:t xml:space="preserve">Li, M.; Oliveira Passos, D.; Shan, Z.; Smith, S. J.; Sun, Q.; Biswas, A.; Choudhuri, I.; </w:t>
-      </w:r>
-      <w:proofErr w:type="spellStart"/>
-      <w:r>
-        <w:rPr>
-          <w:lang w:bidi="hi-IN"/>
-        </w:rPr>
-        <w:t>Strutzenberg</w:t>
-      </w:r>
-      <w:proofErr w:type="spellEnd"/>
-      <w:r>
-        <w:rPr>
-          <w:lang w:bidi="hi-IN"/>
-        </w:rPr>
-        <w:t xml:space="preserve">, T. S.; Haldane, A.; Deng, N.; Li, Z.; Zhao, X. Z.; Briganti, L.; Kvaratskhelia, M.; Burke, T. R.; Levy, R. M.; Hughes, S. H.; Craigie, R.; </w:t>
-      </w:r>
-      <w:proofErr w:type="spellStart"/>
-      <w:r>
-        <w:rPr>
-          <w:lang w:bidi="hi-IN"/>
-        </w:rPr>
-        <w:t>Lyumkis</w:t>
-      </w:r>
-      <w:proofErr w:type="spellEnd"/>
-      <w:r>
-        <w:rPr>
-          <w:lang w:bidi="hi-IN"/>
-        </w:rPr>
-        <w:t xml:space="preserve">, D. Mechanisms of HIV-1 Integrase Resistance to Dolutegravir and Potent Inhibition of Drug-Resistant Variants. </w:t>
+        <w:t xml:space="preserve">Li, M.; Oliveira Passos, D.; Shan, Z.; Smith, S. J.; Sun, Q.; Biswas, A.; Choudhuri, I.; Strutzenberg, T. S.; Haldane, A.; Deng, N.; Li, Z.; Zhao, X. Z.; Briganti, L.; Kvaratskhelia, M.; Burke, T. R.; Levy, R. M.; Hughes, S. H.; Craigie, R.; Lyumkis, D. Mechanisms of HIV-1 Integrase Resistance to Dolutegravir and Potent Inhibition of Drug-Resistant Variants. </w:t>
       </w:r>
       <w:r>
         <w:rPr>
@@ -30570,21 +30022,7 @@
           <w:lang w:bidi="hi-IN"/>
         </w:rPr>
         <w:tab/>
-        <w:t xml:space="preserve">Hauser, K.; Negron, C.; Albanese, S. K.; Ray, S.; Steinbrecher, T.; Abel, R.; </w:t>
-      </w:r>
-      <w:proofErr w:type="spellStart"/>
-      <w:r>
-        <w:rPr>
-          <w:lang w:bidi="hi-IN"/>
-        </w:rPr>
-        <w:t>Chodera</w:t>
-      </w:r>
-      <w:proofErr w:type="spellEnd"/>
-      <w:r>
-        <w:rPr>
-          <w:lang w:bidi="hi-IN"/>
-        </w:rPr>
-        <w:t xml:space="preserve">, J. D.; Wang, L. Predicting Resistance of Clinical Abl Mutations to Targeted Kinase Inhibitors Using Alchemical Free-Energy Calculations. </w:t>
+        <w:t xml:space="preserve">Hauser, K.; Negron, C.; Albanese, S. K.; Ray, S.; Steinbrecher, T.; Abel, R.; Chodera, J. D.; Wang, L. Predicting Resistance of Clinical Abl Mutations to Targeted Kinase Inhibitors Using Alchemical Free-Energy Calculations. </w:t>
       </w:r>
       <w:r>
         <w:rPr>
@@ -30647,35 +30085,7 @@
           <w:lang w:bidi="hi-IN"/>
         </w:rPr>
         <w:tab/>
-        <w:t xml:space="preserve">Nagarajan, A.; Amberg-Johnson, K.; Paull, E.; Huang, K.; </w:t>
-      </w:r>
-      <w:proofErr w:type="spellStart"/>
-      <w:r>
-        <w:rPr>
-          <w:lang w:bidi="hi-IN"/>
-        </w:rPr>
-        <w:t>Ghanakota</w:t>
-      </w:r>
-      <w:proofErr w:type="spellEnd"/>
-      <w:r>
-        <w:rPr>
-          <w:lang w:bidi="hi-IN"/>
-        </w:rPr>
-        <w:t xml:space="preserve">, P.; </w:t>
-      </w:r>
-      <w:proofErr w:type="spellStart"/>
-      <w:r>
-        <w:rPr>
-          <w:lang w:bidi="hi-IN"/>
-        </w:rPr>
-        <w:t>Chandrasinghe</w:t>
-      </w:r>
-      <w:proofErr w:type="spellEnd"/>
-      <w:r>
-        <w:rPr>
-          <w:lang w:bidi="hi-IN"/>
-        </w:rPr>
-        <w:t xml:space="preserve">, A.; Chief Elk, J.; Sampson, J. M.; Wang, L.; Abel, R.; Albanese, S. K. Predicting Resistance to Small Molecule Kinase Inhibitors. </w:t>
+        <w:t xml:space="preserve">Nagarajan, A.; Amberg-Johnson, K.; Paull, E.; Huang, K.; Ghanakota, P.; Chandrasinghe, A.; Chief Elk, J.; Sampson, J. M.; Wang, L.; Abel, R.; Albanese, S. K. Predicting Resistance to Small Molecule Kinase Inhibitors. </w:t>
       </w:r>
       <w:r>
         <w:rPr>
@@ -30738,35 +30148,7 @@
           <w:lang w:bidi="hi-IN"/>
         </w:rPr>
         <w:tab/>
-        <w:t xml:space="preserve">Wang, L.; Wu, Y.; Deng, Y.; Kim, B.; Pierce, L.; Krilov, G.; </w:t>
-      </w:r>
-      <w:proofErr w:type="spellStart"/>
-      <w:r>
-        <w:rPr>
-          <w:lang w:bidi="hi-IN"/>
-        </w:rPr>
-        <w:t>Lupyan</w:t>
-      </w:r>
-      <w:proofErr w:type="spellEnd"/>
-      <w:r>
-        <w:rPr>
-          <w:lang w:bidi="hi-IN"/>
-        </w:rPr>
-        <w:t xml:space="preserve">, D.; Robinson, S.; Dahlgren, M. K.; Greenwood, J.; Romero, D. L.; Masse, C.; Knight, J. L.; Steinbrecher, T.; </w:t>
-      </w:r>
-      <w:proofErr w:type="spellStart"/>
-      <w:r>
-        <w:rPr>
-          <w:lang w:bidi="hi-IN"/>
-        </w:rPr>
-        <w:t>Beuming</w:t>
-      </w:r>
-      <w:proofErr w:type="spellEnd"/>
-      <w:r>
-        <w:rPr>
-          <w:lang w:bidi="hi-IN"/>
-        </w:rPr>
-        <w:t xml:space="preserve">, T.; Damm, W.; Harder, E.; Sherman, W.; Brewer, M.; Wester, R.; Murcko, M.; Frye, L.; Farid, R.; Lin, T.; Mobley, D. L.; Jorgensen, W. L.; Berne, B. J.; Friesner, R. A.; Abel, R. Accurate and Reliable Prediction of Relative Ligand Binding Potency in Prospective Drug Discovery by Way of a Modern Free-Energy Calculation Protocol and Force Field. </w:t>
+        <w:t xml:space="preserve">Wang, L.; Wu, Y.; Deng, Y.; Kim, B.; Pierce, L.; Krilov, G.; Lupyan, D.; Robinson, S.; Dahlgren, M. K.; Greenwood, J.; Romero, D. L.; Masse, C.; Knight, J. L.; Steinbrecher, T.; Beuming, T.; Damm, W.; Harder, E.; Sherman, W.; Brewer, M.; Wester, R.; Murcko, M.; Frye, L.; Farid, R.; Lin, T.; Mobley, D. L.; Jorgensen, W. L.; Berne, B. J.; Friesner, R. A.; Abel, R. Accurate and Reliable Prediction of Relative Ligand Binding Potency in Prospective Drug Discovery by Way of a Modern Free-Energy Calculation Protocol and Force Field. </w:t>
       </w:r>
       <w:r>
         <w:rPr>
@@ -30829,161 +30211,14 @@
           <w:lang w:bidi="hi-IN"/>
         </w:rPr>
         <w:tab/>
-        <w:t xml:space="preserve">Schindler, C. E. M.; Baumann, H.; Blum, A.; </w:t>
-      </w:r>
-      <w:proofErr w:type="spellStart"/>
-      <w:r>
-        <w:rPr>
-          <w:lang w:bidi="hi-IN"/>
-        </w:rPr>
-        <w:t>Böse</w:t>
-      </w:r>
-      <w:proofErr w:type="spellEnd"/>
-      <w:r>
-        <w:rPr>
-          <w:lang w:bidi="hi-IN"/>
-        </w:rPr>
-        <w:t xml:space="preserve">, D.; </w:t>
-      </w:r>
-      <w:proofErr w:type="spellStart"/>
-      <w:r>
-        <w:rPr>
-          <w:lang w:bidi="hi-IN"/>
-        </w:rPr>
-        <w:t>Buchstaller</w:t>
-      </w:r>
-      <w:proofErr w:type="spellEnd"/>
-      <w:r>
-        <w:rPr>
-          <w:lang w:bidi="hi-IN"/>
-        </w:rPr>
-        <w:t xml:space="preserve">, H.-P.; Burgdorf, L.; Cappel, D.; </w:t>
-      </w:r>
-      <w:proofErr w:type="spellStart"/>
-      <w:r>
-        <w:rPr>
-          <w:lang w:bidi="hi-IN"/>
-        </w:rPr>
-        <w:t>Chekler</w:t>
-      </w:r>
-      <w:proofErr w:type="spellEnd"/>
-      <w:r>
-        <w:rPr>
-          <w:lang w:bidi="hi-IN"/>
-        </w:rPr>
-        <w:t xml:space="preserve">, E.; </w:t>
-      </w:r>
-      <w:proofErr w:type="spellStart"/>
-      <w:r>
-        <w:rPr>
-          <w:lang w:bidi="hi-IN"/>
-        </w:rPr>
-        <w:t>Czodrowski</w:t>
-      </w:r>
-      <w:proofErr w:type="spellEnd"/>
-      <w:r>
-        <w:rPr>
-          <w:lang w:bidi="hi-IN"/>
-        </w:rPr>
-        <w:t xml:space="preserve">, P.; Dorsch, D.; </w:t>
-      </w:r>
-      <w:proofErr w:type="spellStart"/>
-      <w:r>
-        <w:rPr>
-          <w:lang w:bidi="hi-IN"/>
-        </w:rPr>
-        <w:t>Eguida</w:t>
-      </w:r>
-      <w:proofErr w:type="spellEnd"/>
-      <w:r>
-        <w:rPr>
-          <w:lang w:bidi="hi-IN"/>
-        </w:rPr>
-        <w:t xml:space="preserve">, M. K. I.; Follows, B.; </w:t>
-      </w:r>
-      <w:proofErr w:type="spellStart"/>
-      <w:r>
-        <w:rPr>
-          <w:lang w:bidi="hi-IN"/>
-        </w:rPr>
-        <w:t>Fuchß</w:t>
-      </w:r>
-      <w:proofErr w:type="spellEnd"/>
-      <w:r>
-        <w:rPr>
-          <w:lang w:bidi="hi-IN"/>
-        </w:rPr>
-        <w:t xml:space="preserve">, T.; </w:t>
-      </w:r>
-      <w:proofErr w:type="spellStart"/>
-      <w:r>
-        <w:rPr>
-          <w:lang w:bidi="hi-IN"/>
-        </w:rPr>
-        <w:t>Grädler</w:t>
-      </w:r>
-      <w:proofErr w:type="spellEnd"/>
-      <w:r>
-        <w:rPr>
-          <w:lang w:bidi="hi-IN"/>
-        </w:rPr>
-        <w:t xml:space="preserve">, U.; Gunera, J.; Johnson, T.; Jorand Lebrun, C.; Karra, S.; Klein, M.; Knehans, T.; </w:t>
-      </w:r>
-      <w:proofErr w:type="spellStart"/>
-      <w:r>
-        <w:rPr>
-          <w:lang w:bidi="hi-IN"/>
-        </w:rPr>
-        <w:t>Koetzner</w:t>
-      </w:r>
-      <w:proofErr w:type="spellEnd"/>
-      <w:r>
-        <w:rPr>
-          <w:lang w:bidi="hi-IN"/>
-        </w:rPr>
-        <w:t xml:space="preserve">, L.; Krier, M.; Leiendecker, M.; Leuthner, B.; Li, L.; </w:t>
-      </w:r>
-      <w:proofErr w:type="spellStart"/>
-      <w:r>
-        <w:rPr>
-          <w:lang w:bidi="hi-IN"/>
-        </w:rPr>
-        <w:t>Mochalkin</w:t>
-      </w:r>
-      <w:proofErr w:type="spellEnd"/>
-      <w:r>
-        <w:rPr>
-          <w:lang w:bidi="hi-IN"/>
-        </w:rPr>
-        <w:t xml:space="preserve">, I.; Musil, D.; Neagu, C.; Rippmann, F.; Schiemann, K.; Schulz, R.; Steinbrecher, T.; Tanzer, E.-M.; </w:t>
-      </w:r>
-      <w:proofErr w:type="spellStart"/>
-      <w:r>
-        <w:rPr>
-          <w:lang w:bidi="hi-IN"/>
-        </w:rPr>
-        <w:t>Unzue</w:t>
-      </w:r>
-      <w:proofErr w:type="spellEnd"/>
-      <w:r>
-        <w:rPr>
-          <w:lang w:bidi="hi-IN"/>
-        </w:rPr>
-        <w:t xml:space="preserve"> Lopez, A.; </w:t>
-      </w:r>
-      <w:proofErr w:type="spellStart"/>
-      <w:r>
-        <w:rPr>
-          <w:lang w:bidi="hi-IN"/>
-        </w:rPr>
-        <w:t>Viacava</w:t>
-      </w:r>
-      <w:proofErr w:type="spellEnd"/>
-      <w:r>
-        <w:rPr>
-          <w:lang w:bidi="hi-IN"/>
-        </w:rPr>
-        <w:t xml:space="preserve"> Follis, A.; Wegener, A.; Kuhn, D. Large-Scale Assessment of Binding Free Energy Calculations in Active Drug Discovery Projects. </w:t>
+        <w:t xml:space="preserve">Schindler, C. E. M.; Baumann, H.; Blum, A.; Böse, D.; Buchstaller, H.-P.; Burgdorf, L.; Cappel, D.; Chekler, E.; Czodrowski, P.; Dorsch, D.; Eguida, M. K. I.; Follows, B.; Fuchß, T.; Grädler, U.; Gunera, J.; Johnson, T.; Jorand Lebrun, C.; Karra, S.; Klein, M.; Knehans, T.; Koetzner, L.; Krier, M.; Leiendecker, M.; Leuthner, B.; Li, L.; Mochalkin, I.; Musil, D.; Neagu, C.; Rippmann, F.; Schiemann, K.; Schulz, R.; Steinbrecher, T.; Tanzer, E.-M.; Unzue </w:t>
+      </w:r>
+      <w:r>
+        <w:rPr>
+          <w:lang w:bidi="hi-IN"/>
+        </w:rPr>
+        <w:lastRenderedPageBreak/>
+        <w:t xml:space="preserve">Lopez, A.; Viacava Follis, A.; Wegener, A.; Kuhn, D. Large-Scale Assessment of Binding Free Energy Calculations in Active Drug Discovery Projects. </w:t>
       </w:r>
       <w:r>
         <w:rPr>
@@ -31039,7 +30274,6 @@
         <w:rPr>
           <w:lang w:bidi="hi-IN"/>
         </w:rPr>
-        <w:lastRenderedPageBreak/>
         <w:t>(75)</w:t>
       </w:r>
       <w:r>
@@ -31110,21 +30344,7 @@
           <w:lang w:bidi="hi-IN"/>
         </w:rPr>
         <w:tab/>
-        <w:t xml:space="preserve">Huang, W.; </w:t>
-      </w:r>
-      <w:proofErr w:type="spellStart"/>
-      <w:r>
-        <w:rPr>
-          <w:lang w:bidi="hi-IN"/>
-        </w:rPr>
-        <w:t>Gamarnik</w:t>
-      </w:r>
-      <w:proofErr w:type="spellEnd"/>
-      <w:r>
-        <w:rPr>
-          <w:lang w:bidi="hi-IN"/>
-        </w:rPr>
-        <w:t xml:space="preserve">, A.; Limoli, K.; Petropoulos, C. J.; Whitcomb, J. M. Amino Acid Substitutions at Position 190 of Human Immunodeficiency Virus Type 1 Reverse Transcriptase Increase Susceptibility to Delavirdine and Impair Virus Replication. </w:t>
+        <w:t xml:space="preserve">Huang, W.; Gamarnik, A.; Limoli, K.; Petropoulos, C. J.; Whitcomb, J. M. Amino Acid Substitutions at Position 190 of Human Immunodeficiency Virus Type 1 Reverse Transcriptase Increase Susceptibility to Delavirdine and Impair Virus Replication. </w:t>
       </w:r>
       <w:r>
         <w:rPr>
@@ -31187,21 +30407,7 @@
           <w:lang w:bidi="hi-IN"/>
         </w:rPr>
         <w:tab/>
-        <w:t xml:space="preserve">Ren, J.; Nichols, C. E.; Chamberlain, P. P.; Weaver, K. L.; Short, S. A.; Stammers, D. K. Crystal Structures of HIV-1 Reverse </w:t>
-      </w:r>
-      <w:proofErr w:type="spellStart"/>
-      <w:r>
-        <w:rPr>
-          <w:lang w:bidi="hi-IN"/>
-        </w:rPr>
-        <w:t>Transcriptases</w:t>
-      </w:r>
-      <w:proofErr w:type="spellEnd"/>
-      <w:r>
-        <w:rPr>
-          <w:lang w:bidi="hi-IN"/>
-        </w:rPr>
-        <w:t xml:space="preserve"> Mutated at Codons 100, 106 and 108 and Mechanisms of Resistance to Non-Nucleoside Inhibitors. </w:t>
+        <w:t xml:space="preserve">Ren, J.; Nichols, C. E.; Chamberlain, P. P.; Weaver, K. L.; Short, S. A.; Stammers, D. K. Crystal Structures of HIV-1 Reverse Transcriptases Mutated at Codons 100, 106 and 108 and Mechanisms of Resistance to Non-Nucleoside Inhibitors. </w:t>
       </w:r>
       <w:r>
         <w:rPr>
@@ -31264,35 +30470,7 @@
           <w:lang w:bidi="hi-IN"/>
         </w:rPr>
         <w:tab/>
-        <w:t xml:space="preserve">Reddy, N.; </w:t>
-      </w:r>
-      <w:proofErr w:type="spellStart"/>
-      <w:r>
-        <w:rPr>
-          <w:lang w:bidi="hi-IN"/>
-        </w:rPr>
-        <w:t>Papathanasopoulos</w:t>
-      </w:r>
-      <w:proofErr w:type="spellEnd"/>
-      <w:r>
-        <w:rPr>
-          <w:lang w:bidi="hi-IN"/>
-        </w:rPr>
-        <w:t xml:space="preserve">, M.; </w:t>
-      </w:r>
-      <w:proofErr w:type="spellStart"/>
-      <w:r>
-        <w:rPr>
-          <w:lang w:bidi="hi-IN"/>
-        </w:rPr>
-        <w:t>Steegen</w:t>
-      </w:r>
-      <w:proofErr w:type="spellEnd"/>
-      <w:r>
-        <w:rPr>
-          <w:lang w:bidi="hi-IN"/>
-        </w:rPr>
-        <w:t xml:space="preserve">, K.; Basson, A. E. K103N, V106M and Y188L Significantly Reduce HIV-1 Subtype C Phenotypic Susceptibility to Doravirine. </w:t>
+        <w:t xml:space="preserve">Reddy, N.; Papathanasopoulos, M.; Steegen, K.; Basson, A. E. K103N, V106M and Y188L Significantly Reduce HIV-1 Subtype C Phenotypic Susceptibility to Doravirine. </w:t>
       </w:r>
       <w:r>
         <w:rPr>
@@ -31355,21 +30533,7 @@
           <w:lang w:bidi="hi-IN"/>
         </w:rPr>
         <w:tab/>
-        <w:t xml:space="preserve">Ghosh, M.; Jacques, P. S.; Rodgers, D. W.; Ottman, M.; </w:t>
-      </w:r>
-      <w:proofErr w:type="spellStart"/>
-      <w:r>
-        <w:rPr>
-          <w:lang w:bidi="hi-IN"/>
-        </w:rPr>
-        <w:t>Darlix</w:t>
-      </w:r>
-      <w:proofErr w:type="spellEnd"/>
-      <w:r>
-        <w:rPr>
-          <w:lang w:bidi="hi-IN"/>
-        </w:rPr>
-        <w:t xml:space="preserve">, J.-L.; Le Grice, S. F. J. Alterations to the Primer Grip of P66 HIV-1 Reverse Transcriptase and Their Consequences for Template-Primer Utilization. </w:t>
+        <w:t xml:space="preserve">Ghosh, M.; Jacques, P. S.; Rodgers, D. W.; Ottman, M.; Darlix, J.-L.; Le Grice, S. F. J. Alterations to the Primer Grip of P66 HIV-1 Reverse Transcriptase and Their Consequences for Template-Primer Utilization. </w:t>
       </w:r>
       <w:r>
         <w:rPr>
@@ -31558,21 +30722,7 @@
           <w:lang w:bidi="hi-IN"/>
         </w:rPr>
         <w:tab/>
-        <w:t xml:space="preserve">Taguchi, M.; Oyama, R.; </w:t>
-      </w:r>
-      <w:proofErr w:type="spellStart"/>
-      <w:r>
-        <w:rPr>
-          <w:lang w:bidi="hi-IN"/>
-        </w:rPr>
-        <w:t>Kaneso</w:t>
-      </w:r>
-      <w:proofErr w:type="spellEnd"/>
-      <w:r>
-        <w:rPr>
-          <w:lang w:bidi="hi-IN"/>
-        </w:rPr>
-        <w:t xml:space="preserve">, M.; Hayashi, S. Hybrid QM/MM Free-Energy Evaluation of Drug-Resistant Mutational Effect on the Binding of an Inhibitor Indinavir to HIV‑1 Protease. </w:t>
+        <w:t xml:space="preserve">Taguchi, M.; Oyama, R.; Kaneso, M.; Hayashi, S. Hybrid QM/MM Free-Energy Evaluation of Drug-Resistant Mutational Effect on the Binding of an Inhibitor Indinavir to HIV‑1 Protease. </w:t>
       </w:r>
       <w:r>
         <w:rPr>
@@ -31698,21 +30848,7 @@
           <w:lang w:bidi="hi-IN"/>
         </w:rPr>
         <w:tab/>
-        <w:t xml:space="preserve">Tiwary, P.; Limongelli, V.; </w:t>
-      </w:r>
-      <w:proofErr w:type="spellStart"/>
-      <w:r>
-        <w:rPr>
-          <w:lang w:bidi="hi-IN"/>
-        </w:rPr>
-        <w:t>Salvalaglio</w:t>
-      </w:r>
-      <w:proofErr w:type="spellEnd"/>
-      <w:r>
-        <w:rPr>
-          <w:lang w:bidi="hi-IN"/>
-        </w:rPr>
-        <w:t xml:space="preserve">, M.; Parrinello, M. Kinetics of Protein–Ligand Unbinding: Predicting Pathways, Rates, and Rate-Limiting Steps. </w:t>
+        <w:t xml:space="preserve">Tiwary, P.; Limongelli, V.; Salvalaglio, M.; Parrinello, M. Kinetics of Protein–Ligand Unbinding: Predicting Pathways, Rates, and Rate-Limiting Steps. </w:t>
       </w:r>
       <w:r>
         <w:rPr>
@@ -31720,7 +30856,16 @@
           <w:iCs/>
           <w:lang w:bidi="hi-IN"/>
         </w:rPr>
-        <w:t>Proceedings of the National Academy of Sciences</w:t>
+        <w:t xml:space="preserve">Proceedings of the </w:t>
+      </w:r>
+      <w:r>
+        <w:rPr>
+          <w:i/>
+          <w:iCs/>
+          <w:lang w:bidi="hi-IN"/>
+        </w:rPr>
+        <w:lastRenderedPageBreak/>
+        <w:t>National Academy of Sciences</w:t>
       </w:r>
       <w:r>
         <w:rPr>
@@ -31768,7 +30913,6 @@
         <w:rPr>
           <w:lang w:bidi="hi-IN"/>
         </w:rPr>
-        <w:lastRenderedPageBreak/>
         <w:t>(85)</w:t>
       </w:r>
       <w:r>
@@ -31776,21 +30920,7 @@
           <w:lang w:bidi="hi-IN"/>
         </w:rPr>
         <w:tab/>
-        <w:t xml:space="preserve">Jagger, B. R.; Ojha, A. A.; Amaro, R. E. Predicting Ligand Binding Kinetics Using a Markovian </w:t>
-      </w:r>
-      <w:proofErr w:type="spellStart"/>
-      <w:r>
-        <w:rPr>
-          <w:lang w:bidi="hi-IN"/>
-        </w:rPr>
-        <w:t>Milestoning</w:t>
-      </w:r>
-      <w:proofErr w:type="spellEnd"/>
-      <w:r>
-        <w:rPr>
-          <w:lang w:bidi="hi-IN"/>
-        </w:rPr>
-        <w:t xml:space="preserve"> with Voronoi Tessellations Multiscale Approach. </w:t>
+        <w:t xml:space="preserve">Jagger, B. R.; Ojha, A. A.; Amaro, R. E. Predicting Ligand Binding Kinetics Using a Markovian Milestoning with Voronoi Tessellations Multiscale Approach. </w:t>
       </w:r>
       <w:r>
         <w:rPr>
@@ -31798,25 +30928,7 @@
           <w:iCs/>
           <w:lang w:bidi="hi-IN"/>
         </w:rPr>
-        <w:t xml:space="preserve">J. Chem. Theory </w:t>
-      </w:r>
-      <w:proofErr w:type="spellStart"/>
-      <w:r>
-        <w:rPr>
-          <w:i/>
-          <w:iCs/>
-          <w:lang w:bidi="hi-IN"/>
-        </w:rPr>
-        <w:t>Comput</w:t>
-      </w:r>
-      <w:proofErr w:type="spellEnd"/>
-      <w:r>
-        <w:rPr>
-          <w:i/>
-          <w:iCs/>
-          <w:lang w:bidi="hi-IN"/>
-        </w:rPr>
-        <w:t>.</w:t>
+        <w:t>J. Chem. Theory Comput.</w:t>
       </w:r>
       <w:r>
         <w:rPr>
@@ -31871,35 +30983,7 @@
           <w:lang w:bidi="hi-IN"/>
         </w:rPr>
         <w:tab/>
-        <w:t xml:space="preserve">Corso, G.; </w:t>
-      </w:r>
-      <w:proofErr w:type="spellStart"/>
-      <w:r>
-        <w:rPr>
-          <w:lang w:bidi="hi-IN"/>
-        </w:rPr>
-        <w:t>Stärk</w:t>
-      </w:r>
-      <w:proofErr w:type="spellEnd"/>
-      <w:r>
-        <w:rPr>
-          <w:lang w:bidi="hi-IN"/>
-        </w:rPr>
-        <w:t xml:space="preserve">, H.; Jing, B.; Barzilay, R.; Jaakkola, T. </w:t>
-      </w:r>
-      <w:proofErr w:type="spellStart"/>
-      <w:r>
-        <w:rPr>
-          <w:lang w:bidi="hi-IN"/>
-        </w:rPr>
-        <w:t>DiffDock</w:t>
-      </w:r>
-      <w:proofErr w:type="spellEnd"/>
-      <w:r>
-        <w:rPr>
-          <w:lang w:bidi="hi-IN"/>
-        </w:rPr>
-        <w:t>: Diffusion Steps, Twists, and Turns for Molecular Docking. arXiv February 11, 2023. https://doi.org/10.48550/arXiv.2210.01776</w:t>
+        <w:t>Corso, G.; Stärk, H.; Jing, B.; Barzilay, R.; Jaakkola, T. DiffDock: Diffusion Steps, Twists, and Turns for Molecular Docking. arXiv February 11, 2023. https://doi.org/10.48550/arXiv.2210.01776</w:t>
       </w:r>
     </w:p>
     <w:p>
@@ -31920,35 +31004,7 @@
           <w:lang w:bidi="hi-IN"/>
         </w:rPr>
         <w:tab/>
-        <w:t xml:space="preserve">Wohlwend, J.; Corso, G.; Passaro, S.; Getz, N.; Reveiz, M.; Leidal, K.; Swiderski, W.; Atkinson, L.; </w:t>
-      </w:r>
-      <w:proofErr w:type="spellStart"/>
-      <w:r>
-        <w:rPr>
-          <w:lang w:bidi="hi-IN"/>
-        </w:rPr>
-        <w:t>Portnoi</w:t>
-      </w:r>
-      <w:proofErr w:type="spellEnd"/>
-      <w:r>
-        <w:rPr>
-          <w:lang w:bidi="hi-IN"/>
-        </w:rPr>
-        <w:t xml:space="preserve">, T.; Chinn, I.; </w:t>
-      </w:r>
-      <w:proofErr w:type="spellStart"/>
-      <w:r>
-        <w:rPr>
-          <w:lang w:bidi="hi-IN"/>
-        </w:rPr>
-        <w:t>Silterra</w:t>
-      </w:r>
-      <w:proofErr w:type="spellEnd"/>
-      <w:r>
-        <w:rPr>
-          <w:lang w:bidi="hi-IN"/>
-        </w:rPr>
-        <w:t>, J.; Jaakkola, T.; Barzilay, R. Boltz-1 Democratizing Biomolecular Interaction Modeling. bioRxiv May 6, 2025, p 2024.11.19.624167. https://doi.org/10.1101/2024.11.19.624167</w:t>
+        <w:t>Wohlwend, J.; Corso, G.; Passaro, S.; Getz, N.; Reveiz, M.; Leidal, K.; Swiderski, W.; Atkinson, L.; Portnoi, T.; Chinn, I.; Silterra, J.; Jaakkola, T.; Barzilay, R. Boltz-1 Democratizing Biomolecular Interaction Modeling. bioRxiv May 6, 2025, p 2024.11.19.624167. https://doi.org/10.1101/2024.11.19.624167</w:t>
       </w:r>
     </w:p>
     <w:p>
@@ -31969,49 +31025,7 @@
           <w:lang w:bidi="hi-IN"/>
         </w:rPr>
         <w:tab/>
-        <w:t xml:space="preserve">Passaro, S.; Corso, G.; Wohlwend, J.; Reveiz, M.; Thaler, S.; Somnath, V. R.; Getz, N.; </w:t>
-      </w:r>
-      <w:proofErr w:type="spellStart"/>
-      <w:r>
-        <w:rPr>
-          <w:lang w:bidi="hi-IN"/>
-        </w:rPr>
-        <w:t>Portnoi</w:t>
-      </w:r>
-      <w:proofErr w:type="spellEnd"/>
-      <w:r>
-        <w:rPr>
-          <w:lang w:bidi="hi-IN"/>
-        </w:rPr>
-        <w:t xml:space="preserve">, T.; Roy, J.; Stark, H.; </w:t>
-      </w:r>
-      <w:proofErr w:type="spellStart"/>
-      <w:r>
-        <w:rPr>
-          <w:lang w:bidi="hi-IN"/>
-        </w:rPr>
-        <w:t>Kwabi</w:t>
-      </w:r>
-      <w:proofErr w:type="spellEnd"/>
-      <w:r>
-        <w:rPr>
-          <w:lang w:bidi="hi-IN"/>
-        </w:rPr>
-        <w:t xml:space="preserve">-Addo, D.; </w:t>
-      </w:r>
-      <w:proofErr w:type="spellStart"/>
-      <w:r>
-        <w:rPr>
-          <w:lang w:bidi="hi-IN"/>
-        </w:rPr>
-        <w:t>Beaini</w:t>
-      </w:r>
-      <w:proofErr w:type="spellEnd"/>
-      <w:r>
-        <w:rPr>
-          <w:lang w:bidi="hi-IN"/>
-        </w:rPr>
-        <w:t>, D.; Jaakkola, T.; Barzilay, R. Boltz-2: Towards Accurate and Efficient Binding Affinity Prediction. bioRxiv June 18, 2025, p 2025.06.14.659707. https://doi.org/10.1101/2025.06.14.659707</w:t>
+        <w:t>Passaro, S.; Corso, G.; Wohlwend, J.; Reveiz, M.; Thaler, S.; Somnath, V. R.; Getz, N.; Portnoi, T.; Roy, J.; Stark, H.; Kwabi-Addo, D.; Beaini, D.; Jaakkola, T.; Barzilay, R. Boltz-2: Towards Accurate and Efficient Binding Affinity Prediction. bioRxiv June 18, 2025, p 2025.06.14.659707. https://doi.org/10.1101/2025.06.14.659707</w:t>
       </w:r>
     </w:p>
     <w:p>
@@ -33095,6 +32109,7 @@
   <w:style w:type="character" w:default="1" w:styleId="DefaultParagraphFont">
     <w:name w:val="Default Paragraph Font"/>
     <w:uiPriority w:val="1"/>
+    <w:semiHidden/>
     <w:unhideWhenUsed/>
   </w:style>
   <w:style w:type="table" w:default="1" w:styleId="TableNormal">

</xml_diff>